<commit_message>
Task 2 Connection and flowchart
</commit_message>
<xml_diff>
--- a/MATLAB Coursework 2  Word Template.docx
+++ b/MATLAB Coursework 2  Word Template.docx
@@ -18,7 +18,7 @@
     <w:p>
       <w:pPr>
         <w:rPr>
-          <w:rFonts w:eastAsia="等线" w:hint="eastAsia"/>
+          <w:rFonts w:eastAsia="等线"/>
           <w:b/>
           <w:bCs/>
           <w:lang w:eastAsia="zh-CN"/>
@@ -43,34 +43,32 @@
     </w:p>
     <w:p>
       <w:pPr>
+        <w:rPr>
+          <w:b/>
+          <w:bCs/>
+          <w:lang w:eastAsia="zh-CN"/>
+        </w:rPr>
+      </w:pPr>
+      <w:r>
+        <w:rPr>
+          <w:b/>
+          <w:bCs/>
+        </w:rPr>
+        <w:t xml:space="preserve">Student ID: </w:t>
+      </w:r>
+      <w:r>
         <w:rPr>
           <w:rFonts w:hint="eastAsia"/>
           <w:b/>
           <w:bCs/>
           <w:lang w:eastAsia="zh-CN"/>
         </w:rPr>
-      </w:pPr>
-      <w:r>
-        <w:rPr>
-          <w:b/>
-          <w:bCs/>
-        </w:rPr>
-        <w:t xml:space="preserve">Student ID: </w:t>
-      </w:r>
-      <w:r>
-        <w:rPr>
-          <w:rFonts w:hint="eastAsia"/>
-          <w:b/>
-          <w:bCs/>
-          <w:lang w:eastAsia="zh-CN"/>
-        </w:rPr>
         <w:t>20719599</w:t>
       </w:r>
     </w:p>
     <w:p>
       <w:pPr>
         <w:rPr>
-          <w:rFonts w:hint="eastAsia"/>
           <w:b/>
           <w:bCs/>
           <w:lang w:eastAsia="zh-CN"/>
@@ -142,7 +140,6 @@
         <w:spacing w:line="259" w:lineRule="auto"/>
         <w:jc w:val="both"/>
         <w:rPr>
-          <w:rFonts w:hint="eastAsia"/>
           <w:color w:val="000000" w:themeColor="text1"/>
           <w:lang w:eastAsia="zh-CN"/>
         </w:rPr>
@@ -240,7 +237,7 @@
       <w:pPr>
         <w:pStyle w:val="NormalWeb"/>
         <w:rPr>
-          <w:rFonts w:eastAsia="等线" w:hint="eastAsia"/>
+          <w:rFonts w:eastAsia="等线"/>
         </w:rPr>
       </w:pPr>
       <w:r>
@@ -272,7 +269,7 @@
           <w:noProof/>
         </w:rPr>
         <w:drawing>
-          <wp:inline distT="0" distB="0" distL="0" distR="0" wp14:anchorId="70FA172A" wp14:editId="3CBBE6A6">
+          <wp:inline distT="0" distB="0" distL="0" distR="0" wp14:anchorId="70FA172A" wp14:editId="162D26B6">
             <wp:extent cx="5618747" cy="3657600"/>
             <wp:effectExtent l="0" t="0" r="1270" b="0"/>
             <wp:docPr id="7" name="Picture 7"/>
@@ -323,38 +320,3130 @@
     </w:p>
     <w:p>
       <w:pPr>
+        <w:spacing w:line="259" w:lineRule="auto"/>
+        <w:rPr>
+          <w:b/>
+          <w:bCs/>
+          <w:color w:val="000000" w:themeColor="text1"/>
+          <w:sz w:val="32"/>
+          <w:szCs w:val="32"/>
+          <w:lang w:eastAsia="zh-CN"/>
+        </w:rPr>
+      </w:pPr>
+      <w:r>
+        <w:rPr>
+          <w:rFonts w:hint="eastAsia"/>
+          <w:b/>
+          <w:bCs/>
+          <w:color w:val="000000" w:themeColor="text1"/>
+          <w:sz w:val="32"/>
+          <w:szCs w:val="32"/>
+          <w:lang w:eastAsia="zh-CN"/>
+        </w:rPr>
+        <w:lastRenderedPageBreak/>
+        <w:t>T</w:t>
+      </w:r>
+      <w:r>
+        <w:rPr>
+          <w:rFonts w:hint="eastAsia"/>
+          <w:b/>
+          <w:bCs/>
+          <w:color w:val="000000" w:themeColor="text1"/>
+          <w:sz w:val="32"/>
+          <w:szCs w:val="32"/>
+          <w:lang w:eastAsia="zh-CN"/>
+        </w:rPr>
+        <w:t xml:space="preserve">ask </w:t>
+      </w:r>
+      <w:r>
+        <w:rPr>
+          <w:rFonts w:hint="eastAsia"/>
+          <w:b/>
+          <w:bCs/>
+          <w:color w:val="000000" w:themeColor="text1"/>
+          <w:sz w:val="32"/>
+          <w:szCs w:val="32"/>
+          <w:lang w:eastAsia="zh-CN"/>
+        </w:rPr>
+        <w:t>2</w:t>
+      </w:r>
+    </w:p>
+    <w:p>
+      <w:pPr>
+        <w:spacing w:line="259" w:lineRule="auto"/>
+        <w:rPr>
+          <w:rFonts w:ascii="Times New Roman" w:hAnsi="Times New Roman" w:cs="Times New Roman"/>
+          <w:sz w:val="24"/>
+          <w:szCs w:val="24"/>
+          <w:lang w:eastAsia="zh-CN"/>
+        </w:rPr>
+      </w:pPr>
+      <w:r>
+        <w:rPr>
+          <w:rFonts w:ascii="Times New Roman" w:hAnsi="Times New Roman" w:cs="Times New Roman"/>
+          <w:sz w:val="24"/>
+          <w:szCs w:val="24"/>
+          <w:lang w:eastAsia="zh-CN"/>
+        </w:rPr>
+        <w:t>f)</w:t>
+      </w:r>
+      <w:r>
+        <w:rPr>
+          <w:rFonts w:ascii="Times New Roman" w:hAnsi="Times New Roman" w:cs="Times New Roman" w:hint="eastAsia"/>
+          <w:sz w:val="24"/>
+          <w:szCs w:val="24"/>
+          <w:lang w:eastAsia="zh-CN"/>
+        </w:rPr>
+        <w:t xml:space="preserve"> </w:t>
+      </w:r>
+      <w:r>
+        <w:rPr>
+          <w:rFonts w:ascii="Times New Roman" w:hAnsi="Times New Roman" w:cs="Times New Roman"/>
+          <w:sz w:val="24"/>
+          <w:szCs w:val="24"/>
+          <w:lang w:eastAsia="zh-CN"/>
+        </w:rPr>
+        <w:t>Connection diagram of three LED sensors with Arduino</w:t>
+      </w:r>
+      <w:r>
+        <w:rPr>
+          <w:rFonts w:ascii="Times New Roman" w:hAnsi="Times New Roman" w:cs="Times New Roman" w:hint="eastAsia"/>
+          <w:sz w:val="24"/>
+          <w:szCs w:val="24"/>
+          <w:lang w:eastAsia="zh-CN"/>
+        </w:rPr>
+        <w:t>:</w:t>
+      </w:r>
+    </w:p>
+    <w:p>
+      <w:pPr>
+        <w:spacing w:line="259" w:lineRule="auto"/>
+        <w:rPr>
+          <w:rFonts w:ascii="Times New Roman" w:hAnsi="Times New Roman" w:cs="Times New Roman"/>
+          <w:sz w:val="24"/>
+          <w:szCs w:val="24"/>
+          <w:lang w:val="en-US"/>
+        </w:rPr>
+      </w:pPr>
+      <w:r>
+        <w:rPr>
+          <w:rFonts w:ascii="Times New Roman" w:hAnsi="Times New Roman" w:cs="Times New Roman"/>
+          <w:sz w:val="24"/>
+          <w:szCs w:val="24"/>
+          <w:lang w:val="en-US"/>
+        </w:rPr>
+        <w:drawing>
+          <wp:inline distT="0" distB="0" distL="0" distR="0" wp14:anchorId="2A87B8BD" wp14:editId="73249762">
+            <wp:extent cx="5731510" cy="4300855"/>
+            <wp:effectExtent l="0" t="0" r="2540" b="4445"/>
+            <wp:docPr id="46" name="Picture 46"/>
+            <wp:cNvGraphicFramePr>
+              <a:graphicFrameLocks xmlns:a="http://schemas.openxmlformats.org/drawingml/2006/main" noChangeAspect="1"/>
+            </wp:cNvGraphicFramePr>
+            <a:graphic xmlns:a="http://schemas.openxmlformats.org/drawingml/2006/main">
+              <a:graphicData uri="http://schemas.openxmlformats.org/drawingml/2006/picture">
+                <pic:pic xmlns:pic="http://schemas.openxmlformats.org/drawingml/2006/picture">
+                  <pic:nvPicPr>
+                    <pic:cNvPr id="0" name="Picture 6"/>
+                    <pic:cNvPicPr>
+                      <a:picLocks noChangeAspect="1" noChangeArrowheads="1"/>
+                    </pic:cNvPicPr>
+                  </pic:nvPicPr>
+                  <pic:blipFill>
+                    <a:blip r:embed="rId10" cstate="print">
+                      <a:extLst>
+                        <a:ext uri="{28A0092B-C50C-407E-A947-70E740481C1C}">
+                          <a14:useLocalDpi xmlns:a14="http://schemas.microsoft.com/office/drawing/2010/main" val="0"/>
+                        </a:ext>
+                      </a:extLst>
+                    </a:blip>
+                    <a:srcRect/>
+                    <a:stretch>
+                      <a:fillRect/>
+                    </a:stretch>
+                  </pic:blipFill>
+                  <pic:spPr bwMode="auto">
+                    <a:xfrm>
+                      <a:off x="0" y="0"/>
+                      <a:ext cx="5731510" cy="4300855"/>
+                    </a:xfrm>
+                    <a:prstGeom prst="rect">
+                      <a:avLst/>
+                    </a:prstGeom>
+                    <a:noFill/>
+                    <a:ln>
+                      <a:noFill/>
+                    </a:ln>
+                  </pic:spPr>
+                </pic:pic>
+              </a:graphicData>
+            </a:graphic>
+          </wp:inline>
+        </w:drawing>
+      </w:r>
+    </w:p>
+    <w:p>
+      <w:pPr>
+        <w:spacing w:line="259" w:lineRule="auto"/>
+        <w:rPr>
+          <w:rFonts w:ascii="Times New Roman" w:eastAsia="Times New Roman" w:hAnsi="Times New Roman" w:cs="Times New Roman"/>
+          <w:sz w:val="24"/>
+          <w:szCs w:val="24"/>
+          <w:lang w:val="en-US" w:eastAsia="zh-CN"/>
+        </w:rPr>
+      </w:pPr>
+      <w:r>
+        <w:rPr>
+          <w:rFonts w:ascii="Times New Roman" w:hAnsi="Times New Roman" w:cs="Times New Roman"/>
+          <w:sz w:val="24"/>
+          <w:szCs w:val="24"/>
+        </w:rPr>
+        <w:br w:type="page"/>
+      </w:r>
+    </w:p>
+    <w:p>
+      <w:pPr>
+        <w:spacing w:line="259" w:lineRule="auto"/>
+        <w:rPr>
+          <w:rFonts w:ascii="Times New Roman" w:hAnsi="Times New Roman" w:cs="Times New Roman"/>
+          <w:sz w:val="24"/>
+          <w:szCs w:val="24"/>
+          <w:lang w:eastAsia="zh-CN"/>
+        </w:rPr>
+      </w:pPr>
+      <w:r>
+        <w:rPr>
+          <w:rFonts w:hint="eastAsia"/>
+          <w:b/>
+          <w:bCs/>
+          <w:noProof/>
+          <w:color w:val="000000" w:themeColor="text1"/>
+          <w:sz w:val="32"/>
+          <w:szCs w:val="32"/>
+          <w:lang w:eastAsia="zh-CN"/>
+        </w:rPr>
+        <w:lastRenderedPageBreak/>
+        <mc:AlternateContent>
+          <mc:Choice Requires="wps">
+            <w:drawing>
+              <wp:anchor distT="0" distB="0" distL="114300" distR="114300" simplePos="0" relativeHeight="251659264" behindDoc="1" locked="0" layoutInCell="1" allowOverlap="1" wp14:anchorId="7F44E95B" wp14:editId="03F54E1B">
+                <wp:simplePos x="0" y="0"/>
+                <wp:positionH relativeFrom="margin">
+                  <wp:posOffset>2333625</wp:posOffset>
+                </wp:positionH>
+                <wp:positionV relativeFrom="paragraph">
+                  <wp:posOffset>290830</wp:posOffset>
+                </wp:positionV>
+                <wp:extent cx="1047750" cy="342900"/>
+                <wp:effectExtent l="0" t="0" r="19050" b="19050"/>
+                <wp:wrapNone/>
+                <wp:docPr id="2" name="Rectangle 2"/>
+                <wp:cNvGraphicFramePr/>
+                <a:graphic xmlns:a="http://schemas.openxmlformats.org/drawingml/2006/main">
+                  <a:graphicData uri="http://schemas.microsoft.com/office/word/2010/wordprocessingShape">
+                    <wps:wsp>
+                      <wps:cNvSpPr/>
+                      <wps:spPr>
+                        <a:xfrm>
+                          <a:off x="0" y="0"/>
+                          <a:ext cx="1047750" cy="342900"/>
+                        </a:xfrm>
+                        <a:prstGeom prst="rect">
+                          <a:avLst/>
+                        </a:prstGeom>
+                      </wps:spPr>
+                      <wps:style>
+                        <a:lnRef idx="2">
+                          <a:schemeClr val="dk1"/>
+                        </a:lnRef>
+                        <a:fillRef idx="1">
+                          <a:schemeClr val="lt1"/>
+                        </a:fillRef>
+                        <a:effectRef idx="0">
+                          <a:schemeClr val="dk1"/>
+                        </a:effectRef>
+                        <a:fontRef idx="minor">
+                          <a:schemeClr val="dk1"/>
+                        </a:fontRef>
+                      </wps:style>
+                      <wps:bodyPr rot="0" spcFirstLastPara="0" vertOverflow="overflow" horzOverflow="overflow" vert="horz" wrap="square" lIns="91440" tIns="45720" rIns="91440" bIns="45720" numCol="1" spcCol="0" rtlCol="0" fromWordArt="0" anchor="ctr" anchorCtr="0" forceAA="0" compatLnSpc="1">
+                        <a:prstTxWarp prst="textNoShape">
+                          <a:avLst/>
+                        </a:prstTxWarp>
+                        <a:noAutofit/>
+                      </wps:bodyPr>
+                    </wps:wsp>
+                  </a:graphicData>
+                </a:graphic>
+                <wp14:sizeRelH relativeFrom="margin">
+                  <wp14:pctWidth>0</wp14:pctWidth>
+                </wp14:sizeRelH>
+                <wp14:sizeRelV relativeFrom="margin">
+                  <wp14:pctHeight>0</wp14:pctHeight>
+                </wp14:sizeRelV>
+              </wp:anchor>
+            </w:drawing>
+          </mc:Choice>
+          <mc:Fallback>
+            <w:pict>
+              <v:rect w14:anchorId="3F77BC8D" id="Rectangle 2" o:spid="_x0000_s1026" style="position:absolute;margin-left:183.75pt;margin-top:22.9pt;width:82.5pt;height:27pt;z-index:-251657216;visibility:visible;mso-wrap-style:square;mso-width-percent:0;mso-height-percent:0;mso-wrap-distance-left:9pt;mso-wrap-distance-top:0;mso-wrap-distance-right:9pt;mso-wrap-distance-bottom:0;mso-position-horizontal:absolute;mso-position-horizontal-relative:margin;mso-position-vertical:absolute;mso-position-vertical-relative:text;mso-width-percent:0;mso-height-percent:0;mso-width-relative:margin;mso-height-relative:margin;v-text-anchor:middle" o:gfxdata="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" fillcolor="white [3201]" strokecolor="black [3200]" strokeweight="1pt">
+                <w10:wrap anchorx="margin"/>
+              </v:rect>
+            </w:pict>
+          </mc:Fallback>
+        </mc:AlternateContent>
+      </w:r>
+      <w:r>
+        <w:rPr>
+          <w:rFonts w:ascii="Times New Roman" w:hAnsi="Times New Roman" w:cs="Times New Roman" w:hint="eastAsia"/>
+          <w:sz w:val="24"/>
+          <w:szCs w:val="24"/>
+          <w:lang w:val="en-US" w:eastAsia="zh-CN"/>
+        </w:rPr>
+        <w:t>g</w:t>
+      </w:r>
+      <w:r>
+        <w:rPr>
+          <w:rFonts w:ascii="Times New Roman" w:hAnsi="Times New Roman" w:cs="Times New Roman"/>
+          <w:sz w:val="24"/>
+          <w:szCs w:val="24"/>
+          <w:lang w:eastAsia="zh-CN"/>
+        </w:rPr>
+        <w:t>)</w:t>
+      </w:r>
+      <w:r>
+        <w:rPr>
+          <w:rFonts w:ascii="Times New Roman" w:hAnsi="Times New Roman" w:cs="Times New Roman" w:hint="eastAsia"/>
+          <w:sz w:val="24"/>
+          <w:szCs w:val="24"/>
+          <w:lang w:eastAsia="zh-CN"/>
+        </w:rPr>
+        <w:t xml:space="preserve"> </w:t>
+      </w:r>
+      <w:r>
+        <w:rPr>
+          <w:rFonts w:ascii="Times New Roman" w:hAnsi="Times New Roman" w:cs="Times New Roman" w:hint="eastAsia"/>
+          <w:sz w:val="24"/>
+          <w:szCs w:val="24"/>
+          <w:lang w:eastAsia="zh-CN"/>
+        </w:rPr>
+        <w:t>Flowchart</w:t>
+      </w:r>
+      <w:r>
+        <w:rPr>
+          <w:rFonts w:ascii="Times New Roman" w:hAnsi="Times New Roman" w:cs="Times New Roman" w:hint="eastAsia"/>
+          <w:sz w:val="24"/>
+          <w:szCs w:val="24"/>
+          <w:lang w:eastAsia="zh-CN"/>
+        </w:rPr>
+        <w:t>:</w:t>
+      </w:r>
+    </w:p>
+    <w:p>
+      <w:pPr>
         <w:pStyle w:val="NormalWeb"/>
         <w:jc w:val="center"/>
         <w:rPr>
-          <w:rFonts w:eastAsia="等线" w:hint="eastAsia"/>
-        </w:rPr>
-      </w:pPr>
+          <w:rFonts w:eastAsia="等线"/>
+        </w:rPr>
+      </w:pPr>
+      <w:r>
+        <w:rPr>
+          <w:rFonts w:eastAsia="等线" w:hint="eastAsia"/>
+          <w:noProof/>
+        </w:rPr>
+        <mc:AlternateContent>
+          <mc:Choice Requires="wps">
+            <w:drawing>
+              <wp:anchor distT="0" distB="0" distL="114300" distR="114300" simplePos="0" relativeHeight="251713536" behindDoc="0" locked="0" layoutInCell="1" allowOverlap="1" wp14:anchorId="1B574DF8" wp14:editId="64EABB1E">
+                <wp:simplePos x="0" y="0"/>
+                <wp:positionH relativeFrom="column">
+                  <wp:posOffset>2857500</wp:posOffset>
+                </wp:positionH>
+                <wp:positionV relativeFrom="paragraph">
+                  <wp:posOffset>347345</wp:posOffset>
+                </wp:positionV>
+                <wp:extent cx="3169" cy="365760"/>
+                <wp:effectExtent l="76200" t="0" r="73660" b="53340"/>
+                <wp:wrapNone/>
+                <wp:docPr id="51" name="Straight Arrow Connector 51"/>
+                <wp:cNvGraphicFramePr/>
+                <a:graphic xmlns:a="http://schemas.openxmlformats.org/drawingml/2006/main">
+                  <a:graphicData uri="http://schemas.microsoft.com/office/word/2010/wordprocessingShape">
+                    <wps:wsp>
+                      <wps:cNvCnPr/>
+                      <wps:spPr>
+                        <a:xfrm>
+                          <a:off x="0" y="0"/>
+                          <a:ext cx="3169" cy="365760"/>
+                        </a:xfrm>
+                        <a:prstGeom prst="straightConnector1">
+                          <a:avLst/>
+                        </a:prstGeom>
+                        <a:ln>
+                          <a:tailEnd type="triangle"/>
+                        </a:ln>
+                      </wps:spPr>
+                      <wps:style>
+                        <a:lnRef idx="1">
+                          <a:schemeClr val="dk1"/>
+                        </a:lnRef>
+                        <a:fillRef idx="0">
+                          <a:schemeClr val="dk1"/>
+                        </a:fillRef>
+                        <a:effectRef idx="0">
+                          <a:schemeClr val="dk1"/>
+                        </a:effectRef>
+                        <a:fontRef idx="minor">
+                          <a:schemeClr val="tx1"/>
+                        </a:fontRef>
+                      </wps:style>
+                      <wps:bodyPr/>
+                    </wps:wsp>
+                  </a:graphicData>
+                </a:graphic>
+                <wp14:sizeRelH relativeFrom="margin">
+                  <wp14:pctWidth>0</wp14:pctWidth>
+                </wp14:sizeRelH>
+                <wp14:sizeRelV relativeFrom="margin">
+                  <wp14:pctHeight>0</wp14:pctHeight>
+                </wp14:sizeRelV>
+              </wp:anchor>
+            </w:drawing>
+          </mc:Choice>
+          <mc:Fallback>
+            <w:pict>
+              <v:shapetype w14:anchorId="7A8FF69E" id="_x0000_t32" coordsize="21600,21600" o:spt="32" o:oned="t" path="m,l21600,21600e" filled="f">
+                <v:path arrowok="t" fillok="f" o:connecttype="none"/>
+                <o:lock v:ext="edit" shapetype="t"/>
+              </v:shapetype>
+              <v:shape id="Straight Arrow Connector 51" o:spid="_x0000_s1026" type="#_x0000_t32" style="position:absolute;margin-left:225pt;margin-top:27.35pt;width:.25pt;height:28.8pt;z-index:251713536;visibility:visible;mso-wrap-style:square;mso-width-percent:0;mso-height-percent:0;mso-wrap-distance-left:9pt;mso-wrap-distance-top:0;mso-wrap-distance-right:9pt;mso-wrap-distance-bottom:0;mso-position-horizontal:absolute;mso-position-horizontal-relative:text;mso-position-vertical:absolute;mso-position-vertical-relative:text;mso-width-percent:0;mso-height-percent:0;mso-width-relative:margin;mso-height-relative:margin" o:gfxdata="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" strokecolor="black [3200]" strokeweight=".5pt">
+                <v:stroke endarrow="block" joinstyle="miter"/>
+              </v:shape>
+            </w:pict>
+          </mc:Fallback>
+        </mc:AlternateContent>
+      </w:r>
+      <w:r>
+        <w:rPr>
+          <w:rFonts w:eastAsia="等线" w:hint="eastAsia"/>
+        </w:rPr>
+        <w:t>Start</w:t>
+      </w:r>
     </w:p>
     <w:p>
       <w:pPr>
+        <w:tabs>
+          <w:tab w:val="left" w:pos="3630"/>
+        </w:tabs>
         <w:spacing w:line="259" w:lineRule="auto"/>
         <w:jc w:val="both"/>
         <w:rPr>
-          <w:rFonts w:hint="eastAsia"/>
+          <w:b/>
+          <w:bCs/>
+          <w:color w:val="000000" w:themeColor="text1"/>
+          <w:sz w:val="32"/>
+          <w:szCs w:val="32"/>
+          <w:lang w:eastAsia="zh-CN"/>
+        </w:rPr>
+      </w:pPr>
+      <w:r>
+        <w:rPr>
+          <w:rFonts w:eastAsia="等线"/>
+          <w:noProof/>
+        </w:rPr>
+        <mc:AlternateContent>
+          <mc:Choice Requires="wps">
+            <w:drawing>
+              <wp:anchor distT="0" distB="0" distL="114300" distR="114300" simplePos="0" relativeHeight="251660288" behindDoc="1" locked="0" layoutInCell="1" allowOverlap="1" wp14:anchorId="3430A341" wp14:editId="40F5A1EF">
+                <wp:simplePos x="0" y="0"/>
+                <wp:positionH relativeFrom="margin">
+                  <wp:posOffset>171450</wp:posOffset>
+                </wp:positionH>
+                <wp:positionV relativeFrom="paragraph">
+                  <wp:posOffset>285115</wp:posOffset>
+                </wp:positionV>
+                <wp:extent cx="5410200" cy="457200"/>
+                <wp:effectExtent l="0" t="0" r="19050" b="19050"/>
+                <wp:wrapNone/>
+                <wp:docPr id="6" name="Rectangle 6"/>
+                <wp:cNvGraphicFramePr/>
+                <a:graphic xmlns:a="http://schemas.openxmlformats.org/drawingml/2006/main">
+                  <a:graphicData uri="http://schemas.microsoft.com/office/word/2010/wordprocessingShape">
+                    <wps:wsp>
+                      <wps:cNvSpPr/>
+                      <wps:spPr>
+                        <a:xfrm>
+                          <a:off x="0" y="0"/>
+                          <a:ext cx="5410200" cy="457200"/>
+                        </a:xfrm>
+                        <a:prstGeom prst="rect">
+                          <a:avLst/>
+                        </a:prstGeom>
+                      </wps:spPr>
+                      <wps:style>
+                        <a:lnRef idx="2">
+                          <a:schemeClr val="dk1"/>
+                        </a:lnRef>
+                        <a:fillRef idx="1">
+                          <a:schemeClr val="lt1"/>
+                        </a:fillRef>
+                        <a:effectRef idx="0">
+                          <a:schemeClr val="dk1"/>
+                        </a:effectRef>
+                        <a:fontRef idx="minor">
+                          <a:schemeClr val="dk1"/>
+                        </a:fontRef>
+                      </wps:style>
+                      <wps:bodyPr rot="0" spcFirstLastPara="0" vertOverflow="overflow" horzOverflow="overflow" vert="horz" wrap="square" lIns="91440" tIns="45720" rIns="91440" bIns="45720" numCol="1" spcCol="0" rtlCol="0" fromWordArt="0" anchor="ctr" anchorCtr="0" forceAA="0" compatLnSpc="1">
+                        <a:prstTxWarp prst="textNoShape">
+                          <a:avLst/>
+                        </a:prstTxWarp>
+                        <a:noAutofit/>
+                      </wps:bodyPr>
+                    </wps:wsp>
+                  </a:graphicData>
+                </a:graphic>
+                <wp14:sizeRelH relativeFrom="margin">
+                  <wp14:pctWidth>0</wp14:pctWidth>
+                </wp14:sizeRelH>
+                <wp14:sizeRelV relativeFrom="margin">
+                  <wp14:pctHeight>0</wp14:pctHeight>
+                </wp14:sizeRelV>
+              </wp:anchor>
+            </w:drawing>
+          </mc:Choice>
+          <mc:Fallback>
+            <w:pict>
+              <v:rect w14:anchorId="5B0F0A83" id="Rectangle 6" o:spid="_x0000_s1026" style="position:absolute;margin-left:13.5pt;margin-top:22.45pt;width:426pt;height:36pt;z-index:-251656192;visibility:visible;mso-wrap-style:square;mso-width-percent:0;mso-height-percent:0;mso-wrap-distance-left:9pt;mso-wrap-distance-top:0;mso-wrap-distance-right:9pt;mso-wrap-distance-bottom:0;mso-position-horizontal:absolute;mso-position-horizontal-relative:margin;mso-position-vertical:absolute;mso-position-vertical-relative:text;mso-width-percent:0;mso-height-percent:0;mso-width-relative:margin;mso-height-relative:margin;v-text-anchor:middle" o:gfxdata="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" fillcolor="white [3201]" strokecolor="black [3200]" strokeweight="1pt">
+                <w10:wrap anchorx="margin"/>
+              </v:rect>
+            </w:pict>
+          </mc:Fallback>
+        </mc:AlternateContent>
+      </w:r>
+    </w:p>
+    <w:p>
+      <w:pPr>
+        <w:pStyle w:val="NormalWeb"/>
+        <w:jc w:val="center"/>
+        <w:rPr>
+          <w:rFonts w:eastAsia="等线"/>
+        </w:rPr>
+      </w:pPr>
+      <w:r>
+        <w:rPr>
+          <w:rFonts w:eastAsia="等线" w:hint="eastAsia"/>
+          <w:noProof/>
+        </w:rPr>
+        <mc:AlternateContent>
+          <mc:Choice Requires="wps">
+            <w:drawing>
+              <wp:anchor distT="0" distB="0" distL="114300" distR="114300" simplePos="0" relativeHeight="251669504" behindDoc="0" locked="0" layoutInCell="1" allowOverlap="1" wp14:anchorId="2F1B6A70" wp14:editId="0DC6BA52">
+                <wp:simplePos x="0" y="0"/>
+                <wp:positionH relativeFrom="column">
+                  <wp:posOffset>2857500</wp:posOffset>
+                </wp:positionH>
+                <wp:positionV relativeFrom="paragraph">
+                  <wp:posOffset>406400</wp:posOffset>
+                </wp:positionV>
+                <wp:extent cx="3169" cy="210312"/>
+                <wp:effectExtent l="76200" t="0" r="73660" b="56515"/>
+                <wp:wrapNone/>
+                <wp:docPr id="20" name="Straight Arrow Connector 20"/>
+                <wp:cNvGraphicFramePr/>
+                <a:graphic xmlns:a="http://schemas.openxmlformats.org/drawingml/2006/main">
+                  <a:graphicData uri="http://schemas.microsoft.com/office/word/2010/wordprocessingShape">
+                    <wps:wsp>
+                      <wps:cNvCnPr/>
+                      <wps:spPr>
+                        <a:xfrm>
+                          <a:off x="0" y="0"/>
+                          <a:ext cx="3169" cy="210312"/>
+                        </a:xfrm>
+                        <a:prstGeom prst="straightConnector1">
+                          <a:avLst/>
+                        </a:prstGeom>
+                        <a:ln>
+                          <a:tailEnd type="triangle"/>
+                        </a:ln>
+                      </wps:spPr>
+                      <wps:style>
+                        <a:lnRef idx="1">
+                          <a:schemeClr val="dk1"/>
+                        </a:lnRef>
+                        <a:fillRef idx="0">
+                          <a:schemeClr val="dk1"/>
+                        </a:fillRef>
+                        <a:effectRef idx="0">
+                          <a:schemeClr val="dk1"/>
+                        </a:effectRef>
+                        <a:fontRef idx="minor">
+                          <a:schemeClr val="tx1"/>
+                        </a:fontRef>
+                      </wps:style>
+                      <wps:bodyPr/>
+                    </wps:wsp>
+                  </a:graphicData>
+                </a:graphic>
+                <wp14:sizeRelH relativeFrom="margin">
+                  <wp14:pctWidth>0</wp14:pctWidth>
+                </wp14:sizeRelH>
+                <wp14:sizeRelV relativeFrom="margin">
+                  <wp14:pctHeight>0</wp14:pctHeight>
+                </wp14:sizeRelV>
+              </wp:anchor>
+            </w:drawing>
+          </mc:Choice>
+          <mc:Fallback>
+            <w:pict>
+              <v:shape w14:anchorId="4D0E2866" id="Straight Arrow Connector 20" o:spid="_x0000_s1026" type="#_x0000_t32" style="position:absolute;margin-left:225pt;margin-top:32pt;width:.25pt;height:16.55pt;z-index:251669504;visibility:visible;mso-wrap-style:square;mso-width-percent:0;mso-height-percent:0;mso-wrap-distance-left:9pt;mso-wrap-distance-top:0;mso-wrap-distance-right:9pt;mso-wrap-distance-bottom:0;mso-position-horizontal:absolute;mso-position-horizontal-relative:text;mso-position-vertical:absolute;mso-position-vertical-relative:text;mso-width-percent:0;mso-height-percent:0;mso-width-relative:margin;mso-height-relative:margin" o:gfxdata="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" strokecolor="black [3200]" strokeweight=".5pt">
+                <v:stroke endarrow="block" joinstyle="miter"/>
+              </v:shape>
+            </w:pict>
+          </mc:Fallback>
+        </mc:AlternateContent>
+      </w:r>
+      <w:r>
+        <w:rPr>
+          <w:rFonts w:eastAsia="等线" w:hint="eastAsia"/>
+        </w:rPr>
+        <w:t>Connect the three LEDs and temperature sensor to the Arduino on the breadboard.</w:t>
+      </w:r>
+    </w:p>
+    <w:p>
+      <w:pPr>
+        <w:pStyle w:val="NormalWeb"/>
+        <w:jc w:val="center"/>
+        <w:rPr>
+          <w:rFonts w:eastAsia="等线"/>
+        </w:rPr>
+      </w:pPr>
+      <w:r>
+        <w:rPr>
+          <w:rFonts w:eastAsia="等线"/>
+          <w:noProof/>
+        </w:rPr>
+        <mc:AlternateContent>
+          <mc:Choice Requires="wps">
+            <w:drawing>
+              <wp:anchor distT="0" distB="0" distL="114300" distR="114300" simplePos="0" relativeHeight="251662336" behindDoc="1" locked="0" layoutInCell="1" allowOverlap="1" wp14:anchorId="0C83E2FA" wp14:editId="646696ED">
+                <wp:simplePos x="0" y="0"/>
+                <wp:positionH relativeFrom="margin">
+                  <wp:posOffset>598805</wp:posOffset>
+                </wp:positionH>
+                <wp:positionV relativeFrom="paragraph">
+                  <wp:posOffset>187960</wp:posOffset>
+                </wp:positionV>
+                <wp:extent cx="4505325" cy="457200"/>
+                <wp:effectExtent l="0" t="0" r="28575" b="19050"/>
+                <wp:wrapNone/>
+                <wp:docPr id="8" name="Rectangle 8"/>
+                <wp:cNvGraphicFramePr/>
+                <a:graphic xmlns:a="http://schemas.openxmlformats.org/drawingml/2006/main">
+                  <a:graphicData uri="http://schemas.microsoft.com/office/word/2010/wordprocessingShape">
+                    <wps:wsp>
+                      <wps:cNvSpPr/>
+                      <wps:spPr>
+                        <a:xfrm>
+                          <a:off x="0" y="0"/>
+                          <a:ext cx="4505325" cy="457200"/>
+                        </a:xfrm>
+                        <a:prstGeom prst="rect">
+                          <a:avLst/>
+                        </a:prstGeom>
+                      </wps:spPr>
+                      <wps:style>
+                        <a:lnRef idx="2">
+                          <a:schemeClr val="dk1"/>
+                        </a:lnRef>
+                        <a:fillRef idx="1">
+                          <a:schemeClr val="lt1"/>
+                        </a:fillRef>
+                        <a:effectRef idx="0">
+                          <a:schemeClr val="dk1"/>
+                        </a:effectRef>
+                        <a:fontRef idx="minor">
+                          <a:schemeClr val="dk1"/>
+                        </a:fontRef>
+                      </wps:style>
+                      <wps:bodyPr rot="0" spcFirstLastPara="0" vertOverflow="overflow" horzOverflow="overflow" vert="horz" wrap="square" lIns="91440" tIns="45720" rIns="91440" bIns="45720" numCol="1" spcCol="0" rtlCol="0" fromWordArt="0" anchor="ctr" anchorCtr="0" forceAA="0" compatLnSpc="1">
+                        <a:prstTxWarp prst="textNoShape">
+                          <a:avLst/>
+                        </a:prstTxWarp>
+                        <a:noAutofit/>
+                      </wps:bodyPr>
+                    </wps:wsp>
+                  </a:graphicData>
+                </a:graphic>
+                <wp14:sizeRelH relativeFrom="margin">
+                  <wp14:pctWidth>0</wp14:pctWidth>
+                </wp14:sizeRelH>
+                <wp14:sizeRelV relativeFrom="margin">
+                  <wp14:pctHeight>0</wp14:pctHeight>
+                </wp14:sizeRelV>
+              </wp:anchor>
+            </w:drawing>
+          </mc:Choice>
+          <mc:Fallback>
+            <w:pict>
+              <v:rect w14:anchorId="69A88558" id="Rectangle 8" o:spid="_x0000_s1026" style="position:absolute;margin-left:47.15pt;margin-top:14.8pt;width:354.75pt;height:36pt;z-index:-251654144;visibility:visible;mso-wrap-style:square;mso-width-percent:0;mso-height-percent:0;mso-wrap-distance-left:9pt;mso-wrap-distance-top:0;mso-wrap-distance-right:9pt;mso-wrap-distance-bottom:0;mso-position-horizontal:absolute;mso-position-horizontal-relative:margin;mso-position-vertical:absolute;mso-position-vertical-relative:text;mso-width-percent:0;mso-height-percent:0;mso-width-relative:margin;mso-height-relative:margin;v-text-anchor:middle" o:gfxdata="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" fillcolor="white [3201]" strokecolor="black [3200]" strokeweight="1pt">
+                <w10:wrap anchorx="margin"/>
+              </v:rect>
+            </w:pict>
+          </mc:Fallback>
+        </mc:AlternateContent>
+      </w:r>
+    </w:p>
+    <w:p>
+      <w:pPr>
+        <w:pStyle w:val="NormalWeb"/>
+        <w:jc w:val="center"/>
+        <w:rPr>
+          <w:rFonts w:eastAsia="等线"/>
+        </w:rPr>
+      </w:pPr>
+      <w:r>
+        <w:rPr>
+          <w:rFonts w:eastAsia="等线" w:hint="eastAsia"/>
+          <w:noProof/>
+        </w:rPr>
+        <mc:AlternateContent>
+          <mc:Choice Requires="wps">
+            <w:drawing>
+              <wp:anchor distT="0" distB="0" distL="114300" distR="114300" simplePos="0" relativeHeight="251671552" behindDoc="0" locked="0" layoutInCell="1" allowOverlap="1" wp14:anchorId="421782D0" wp14:editId="443E1D62">
+                <wp:simplePos x="0" y="0"/>
+                <wp:positionH relativeFrom="column">
+                  <wp:posOffset>2859196</wp:posOffset>
+                </wp:positionH>
+                <wp:positionV relativeFrom="paragraph">
+                  <wp:posOffset>287368</wp:posOffset>
+                </wp:positionV>
+                <wp:extent cx="3169" cy="265176"/>
+                <wp:effectExtent l="76200" t="0" r="73660" b="59055"/>
+                <wp:wrapNone/>
+                <wp:docPr id="21" name="Straight Arrow Connector 21"/>
+                <wp:cNvGraphicFramePr/>
+                <a:graphic xmlns:a="http://schemas.openxmlformats.org/drawingml/2006/main">
+                  <a:graphicData uri="http://schemas.microsoft.com/office/word/2010/wordprocessingShape">
+                    <wps:wsp>
+                      <wps:cNvCnPr/>
+                      <wps:spPr>
+                        <a:xfrm>
+                          <a:off x="0" y="0"/>
+                          <a:ext cx="3169" cy="265176"/>
+                        </a:xfrm>
+                        <a:prstGeom prst="straightConnector1">
+                          <a:avLst/>
+                        </a:prstGeom>
+                        <a:ln>
+                          <a:tailEnd type="triangle"/>
+                        </a:ln>
+                      </wps:spPr>
+                      <wps:style>
+                        <a:lnRef idx="1">
+                          <a:schemeClr val="dk1"/>
+                        </a:lnRef>
+                        <a:fillRef idx="0">
+                          <a:schemeClr val="dk1"/>
+                        </a:fillRef>
+                        <a:effectRef idx="0">
+                          <a:schemeClr val="dk1"/>
+                        </a:effectRef>
+                        <a:fontRef idx="minor">
+                          <a:schemeClr val="tx1"/>
+                        </a:fontRef>
+                      </wps:style>
+                      <wps:bodyPr/>
+                    </wps:wsp>
+                  </a:graphicData>
+                </a:graphic>
+                <wp14:sizeRelH relativeFrom="margin">
+                  <wp14:pctWidth>0</wp14:pctWidth>
+                </wp14:sizeRelH>
+                <wp14:sizeRelV relativeFrom="margin">
+                  <wp14:pctHeight>0</wp14:pctHeight>
+                </wp14:sizeRelV>
+              </wp:anchor>
+            </w:drawing>
+          </mc:Choice>
+          <mc:Fallback>
+            <w:pict>
+              <v:shape w14:anchorId="6BFC2C5A" id="Straight Arrow Connector 21" o:spid="_x0000_s1026" type="#_x0000_t32" style="position:absolute;margin-left:225.15pt;margin-top:22.65pt;width:.25pt;height:20.9pt;z-index:251671552;visibility:visible;mso-wrap-style:square;mso-width-percent:0;mso-height-percent:0;mso-wrap-distance-left:9pt;mso-wrap-distance-top:0;mso-wrap-distance-right:9pt;mso-wrap-distance-bottom:0;mso-position-horizontal:absolute;mso-position-horizontal-relative:text;mso-position-vertical:absolute;mso-position-vertical-relative:text;mso-width-percent:0;mso-height-percent:0;mso-width-relative:margin;mso-height-relative:margin" o:gfxdata="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" strokecolor="black [3200]" strokeweight=".5pt">
+                <v:stroke endarrow="block" joinstyle="miter"/>
+              </v:shape>
+            </w:pict>
+          </mc:Fallback>
+        </mc:AlternateContent>
+      </w:r>
+      <w:r>
+        <w:rPr>
+          <w:rFonts w:eastAsia="等线" w:hint="eastAsia"/>
+        </w:rPr>
+        <w:t>Set green/yellow/red pins as OUTPUT, and turn all LEDs OFF.</w:t>
+      </w:r>
+    </w:p>
+    <w:p>
+      <w:pPr>
+        <w:pStyle w:val="NormalWeb"/>
+        <w:jc w:val="center"/>
+        <w:rPr>
+          <w:rFonts w:eastAsia="等线"/>
+        </w:rPr>
+      </w:pPr>
+      <w:r>
+        <w:rPr>
+          <w:rFonts w:eastAsia="等线"/>
+          <w:noProof/>
+        </w:rPr>
+        <mc:AlternateContent>
+          <mc:Choice Requires="wps">
+            <w:drawing>
+              <wp:anchor distT="0" distB="0" distL="114300" distR="114300" simplePos="0" relativeHeight="251711488" behindDoc="1" locked="0" layoutInCell="1" allowOverlap="1" wp14:anchorId="31A43203" wp14:editId="15354CD7">
+                <wp:simplePos x="0" y="0"/>
+                <wp:positionH relativeFrom="margin">
+                  <wp:posOffset>1895475</wp:posOffset>
+                </wp:positionH>
+                <wp:positionV relativeFrom="paragraph">
+                  <wp:posOffset>202565</wp:posOffset>
+                </wp:positionV>
+                <wp:extent cx="1905000" cy="457200"/>
+                <wp:effectExtent l="0" t="0" r="19050" b="19050"/>
+                <wp:wrapNone/>
+                <wp:docPr id="49" name="Rectangle 49"/>
+                <wp:cNvGraphicFramePr/>
+                <a:graphic xmlns:a="http://schemas.openxmlformats.org/drawingml/2006/main">
+                  <a:graphicData uri="http://schemas.microsoft.com/office/word/2010/wordprocessingShape">
+                    <wps:wsp>
+                      <wps:cNvSpPr/>
+                      <wps:spPr>
+                        <a:xfrm>
+                          <a:off x="0" y="0"/>
+                          <a:ext cx="1905000" cy="457200"/>
+                        </a:xfrm>
+                        <a:prstGeom prst="rect">
+                          <a:avLst/>
+                        </a:prstGeom>
+                      </wps:spPr>
+                      <wps:style>
+                        <a:lnRef idx="2">
+                          <a:schemeClr val="dk1"/>
+                        </a:lnRef>
+                        <a:fillRef idx="1">
+                          <a:schemeClr val="lt1"/>
+                        </a:fillRef>
+                        <a:effectRef idx="0">
+                          <a:schemeClr val="dk1"/>
+                        </a:effectRef>
+                        <a:fontRef idx="minor">
+                          <a:schemeClr val="dk1"/>
+                        </a:fontRef>
+                      </wps:style>
+                      <wps:bodyPr rot="0" spcFirstLastPara="0" vertOverflow="overflow" horzOverflow="overflow" vert="horz" wrap="square" lIns="91440" tIns="45720" rIns="91440" bIns="45720" numCol="1" spcCol="0" rtlCol="0" fromWordArt="0" anchor="ctr" anchorCtr="0" forceAA="0" compatLnSpc="1">
+                        <a:prstTxWarp prst="textNoShape">
+                          <a:avLst/>
+                        </a:prstTxWarp>
+                        <a:noAutofit/>
+                      </wps:bodyPr>
+                    </wps:wsp>
+                  </a:graphicData>
+                </a:graphic>
+                <wp14:sizeRelV relativeFrom="margin">
+                  <wp14:pctHeight>0</wp14:pctHeight>
+                </wp14:sizeRelV>
+              </wp:anchor>
+            </w:drawing>
+          </mc:Choice>
+          <mc:Fallback>
+            <w:pict>
+              <v:rect w14:anchorId="396FD291" id="Rectangle 49" o:spid="_x0000_s1026" style="position:absolute;margin-left:149.25pt;margin-top:15.95pt;width:150pt;height:36pt;z-index:-251604992;visibility:visible;mso-wrap-style:square;mso-height-percent:0;mso-wrap-distance-left:9pt;mso-wrap-distance-top:0;mso-wrap-distance-right:9pt;mso-wrap-distance-bottom:0;mso-position-horizontal:absolute;mso-position-horizontal-relative:margin;mso-position-vertical:absolute;mso-position-vertical-relative:text;mso-height-percent:0;mso-height-relative:margin;v-text-anchor:middle" o:gfxdata="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" fillcolor="white [3201]" strokecolor="black [3200]" strokeweight="1pt">
+                <w10:wrap anchorx="margin"/>
+              </v:rect>
+            </w:pict>
+          </mc:Fallback>
+        </mc:AlternateContent>
+      </w:r>
+    </w:p>
+    <w:p>
+      <w:pPr>
+        <w:pStyle w:val="NormalWeb"/>
+        <w:jc w:val="center"/>
+        <w:rPr>
+          <w:rFonts w:eastAsia="等线"/>
+        </w:rPr>
+      </w:pPr>
+      <w:r>
+        <w:rPr>
+          <w:rFonts w:eastAsia="等线" w:hint="eastAsia"/>
+          <w:noProof/>
+        </w:rPr>
+        <mc:AlternateContent>
+          <mc:Choice Requires="wps">
+            <w:drawing>
+              <wp:anchor distT="0" distB="0" distL="114300" distR="114300" simplePos="0" relativeHeight="251710463" behindDoc="1" locked="0" layoutInCell="1" allowOverlap="1" wp14:anchorId="485E46CC" wp14:editId="38C8764C">
+                <wp:simplePos x="0" y="0"/>
+                <wp:positionH relativeFrom="column">
+                  <wp:posOffset>2867025</wp:posOffset>
+                </wp:positionH>
+                <wp:positionV relativeFrom="paragraph">
+                  <wp:posOffset>281940</wp:posOffset>
+                </wp:positionV>
+                <wp:extent cx="3169" cy="265176"/>
+                <wp:effectExtent l="76200" t="0" r="73660" b="59055"/>
+                <wp:wrapNone/>
+                <wp:docPr id="50" name="Straight Arrow Connector 50"/>
+                <wp:cNvGraphicFramePr/>
+                <a:graphic xmlns:a="http://schemas.openxmlformats.org/drawingml/2006/main">
+                  <a:graphicData uri="http://schemas.microsoft.com/office/word/2010/wordprocessingShape">
+                    <wps:wsp>
+                      <wps:cNvCnPr/>
+                      <wps:spPr>
+                        <a:xfrm>
+                          <a:off x="0" y="0"/>
+                          <a:ext cx="3169" cy="265176"/>
+                        </a:xfrm>
+                        <a:prstGeom prst="straightConnector1">
+                          <a:avLst/>
+                        </a:prstGeom>
+                        <a:ln>
+                          <a:tailEnd type="triangle"/>
+                        </a:ln>
+                      </wps:spPr>
+                      <wps:style>
+                        <a:lnRef idx="1">
+                          <a:schemeClr val="dk1"/>
+                        </a:lnRef>
+                        <a:fillRef idx="0">
+                          <a:schemeClr val="dk1"/>
+                        </a:fillRef>
+                        <a:effectRef idx="0">
+                          <a:schemeClr val="dk1"/>
+                        </a:effectRef>
+                        <a:fontRef idx="minor">
+                          <a:schemeClr val="tx1"/>
+                        </a:fontRef>
+                      </wps:style>
+                      <wps:bodyPr/>
+                    </wps:wsp>
+                  </a:graphicData>
+                </a:graphic>
+                <wp14:sizeRelH relativeFrom="margin">
+                  <wp14:pctWidth>0</wp14:pctWidth>
+                </wp14:sizeRelH>
+                <wp14:sizeRelV relativeFrom="margin">
+                  <wp14:pctHeight>0</wp14:pctHeight>
+                </wp14:sizeRelV>
+              </wp:anchor>
+            </w:drawing>
+          </mc:Choice>
+          <mc:Fallback>
+            <w:pict>
+              <v:shape w14:anchorId="63013B99" id="Straight Arrow Connector 50" o:spid="_x0000_s1026" type="#_x0000_t32" style="position:absolute;margin-left:225.75pt;margin-top:22.2pt;width:.25pt;height:20.9pt;z-index:-251606017;visibility:visible;mso-wrap-style:square;mso-width-percent:0;mso-height-percent:0;mso-wrap-distance-left:9pt;mso-wrap-distance-top:0;mso-wrap-distance-right:9pt;mso-wrap-distance-bottom:0;mso-position-horizontal:absolute;mso-position-horizontal-relative:text;mso-position-vertical:absolute;mso-position-vertical-relative:text;mso-width-percent:0;mso-height-percent:0;mso-width-relative:margin;mso-height-relative:margin" o:gfxdata="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" strokecolor="black [3200]" strokeweight=".5pt">
+                <v:stroke endarrow="block" joinstyle="miter"/>
+              </v:shape>
+            </w:pict>
+          </mc:Fallback>
+        </mc:AlternateContent>
+      </w:r>
+      <w:r>
+        <w:rPr>
+          <w:rFonts w:eastAsia="等线" w:hint="eastAsia"/>
+        </w:rPr>
+        <w:t>Infinite While loop start</w:t>
+      </w:r>
+    </w:p>
+    <w:p>
+      <w:pPr>
+        <w:pStyle w:val="NormalWeb"/>
+        <w:jc w:val="center"/>
+        <w:rPr>
+          <w:rFonts w:eastAsia="等线" w:hint="eastAsia"/>
+        </w:rPr>
+      </w:pPr>
+      <w:r>
+        <w:rPr>
+          <w:rFonts w:eastAsia="等线" w:hint="eastAsia"/>
+          <w:noProof/>
+        </w:rPr>
+        <mc:AlternateContent>
+          <mc:Choice Requires="wps">
+            <w:drawing>
+              <wp:anchor distT="0" distB="0" distL="114300" distR="114300" simplePos="0" relativeHeight="251707392" behindDoc="0" locked="0" layoutInCell="1" allowOverlap="1" wp14:anchorId="20F39CFB" wp14:editId="45D29668">
+                <wp:simplePos x="0" y="0"/>
+                <wp:positionH relativeFrom="column">
+                  <wp:posOffset>723265</wp:posOffset>
+                </wp:positionH>
+                <wp:positionV relativeFrom="paragraph">
+                  <wp:posOffset>328295</wp:posOffset>
+                </wp:positionV>
+                <wp:extent cx="1171575" cy="5267325"/>
+                <wp:effectExtent l="628650" t="76200" r="0" b="28575"/>
+                <wp:wrapNone/>
+                <wp:docPr id="44" name="Connector: Elbow 44"/>
+                <wp:cNvGraphicFramePr/>
+                <a:graphic xmlns:a="http://schemas.openxmlformats.org/drawingml/2006/main">
+                  <a:graphicData uri="http://schemas.microsoft.com/office/word/2010/wordprocessingShape">
+                    <wps:wsp>
+                      <wps:cNvCnPr/>
+                      <wps:spPr>
+                        <a:xfrm flipV="1">
+                          <a:off x="0" y="0"/>
+                          <a:ext cx="1171575" cy="5267325"/>
+                        </a:xfrm>
+                        <a:prstGeom prst="bentConnector3">
+                          <a:avLst>
+                            <a:gd name="adj1" fmla="val -52439"/>
+                          </a:avLst>
+                        </a:prstGeom>
+                        <a:ln>
+                          <a:tailEnd type="triangle"/>
+                        </a:ln>
+                      </wps:spPr>
+                      <wps:style>
+                        <a:lnRef idx="1">
+                          <a:schemeClr val="dk1"/>
+                        </a:lnRef>
+                        <a:fillRef idx="0">
+                          <a:schemeClr val="dk1"/>
+                        </a:fillRef>
+                        <a:effectRef idx="0">
+                          <a:schemeClr val="dk1"/>
+                        </a:effectRef>
+                        <a:fontRef idx="minor">
+                          <a:schemeClr val="tx1"/>
+                        </a:fontRef>
+                      </wps:style>
+                      <wps:bodyPr/>
+                    </wps:wsp>
+                  </a:graphicData>
+                </a:graphic>
+                <wp14:sizeRelH relativeFrom="margin">
+                  <wp14:pctWidth>0</wp14:pctWidth>
+                </wp14:sizeRelH>
+                <wp14:sizeRelV relativeFrom="margin">
+                  <wp14:pctHeight>0</wp14:pctHeight>
+                </wp14:sizeRelV>
+              </wp:anchor>
+            </w:drawing>
+          </mc:Choice>
+          <mc:Fallback>
+            <w:pict>
+              <v:shapetype w14:anchorId="02C6199B" id="_x0000_t34" coordsize="21600,21600" o:spt="34" o:oned="t" adj="10800" path="m,l@0,0@0,21600,21600,21600e" filled="f">
+                <v:stroke joinstyle="miter"/>
+                <v:formulas>
+                  <v:f eqn="val #0"/>
+                </v:formulas>
+                <v:path arrowok="t" fillok="f" o:connecttype="none"/>
+                <v:handles>
+                  <v:h position="#0,center"/>
+                </v:handles>
+                <o:lock v:ext="edit" shapetype="t"/>
+              </v:shapetype>
+              <v:shape id="Connector: Elbow 44" o:spid="_x0000_s1026" type="#_x0000_t34" style="position:absolute;margin-left:56.95pt;margin-top:25.85pt;width:92.25pt;height:414.75pt;flip:y;z-index:251707392;visibility:visible;mso-wrap-style:square;mso-width-percent:0;mso-height-percent:0;mso-wrap-distance-left:9pt;mso-wrap-distance-top:0;mso-wrap-distance-right:9pt;mso-wrap-distance-bottom:0;mso-position-horizontal:absolute;mso-position-horizontal-relative:text;mso-position-vertical:absolute;mso-position-vertical-relative:text;mso-width-percent:0;mso-height-percent:0;mso-width-relative:margin;mso-height-relative:margin" o:gfxdata="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" adj="-11327" strokecolor="black [3200]" strokeweight=".5pt">
+                <v:stroke endarrow="block"/>
+              </v:shape>
+            </w:pict>
+          </mc:Fallback>
+        </mc:AlternateContent>
+      </w:r>
+      <w:r>
+        <w:rPr>
+          <w:rFonts w:eastAsia="等线"/>
+          <w:noProof/>
+        </w:rPr>
+        <mc:AlternateContent>
+          <mc:Choice Requires="wps">
+            <w:drawing>
+              <wp:anchor distT="0" distB="0" distL="114300" distR="114300" simplePos="0" relativeHeight="251663360" behindDoc="1" locked="0" layoutInCell="1" allowOverlap="1" wp14:anchorId="77FCABCA" wp14:editId="2AD42BD0">
+                <wp:simplePos x="0" y="0"/>
+                <wp:positionH relativeFrom="margin">
+                  <wp:posOffset>1903730</wp:posOffset>
+                </wp:positionH>
+                <wp:positionV relativeFrom="paragraph">
+                  <wp:posOffset>194945</wp:posOffset>
+                </wp:positionV>
+                <wp:extent cx="1905000" cy="457200"/>
+                <wp:effectExtent l="0" t="0" r="19050" b="19050"/>
+                <wp:wrapNone/>
+                <wp:docPr id="9" name="Rectangle 9"/>
+                <wp:cNvGraphicFramePr/>
+                <a:graphic xmlns:a="http://schemas.openxmlformats.org/drawingml/2006/main">
+                  <a:graphicData uri="http://schemas.microsoft.com/office/word/2010/wordprocessingShape">
+                    <wps:wsp>
+                      <wps:cNvSpPr/>
+                      <wps:spPr>
+                        <a:xfrm>
+                          <a:off x="0" y="0"/>
+                          <a:ext cx="1905000" cy="457200"/>
+                        </a:xfrm>
+                        <a:prstGeom prst="rect">
+                          <a:avLst/>
+                        </a:prstGeom>
+                      </wps:spPr>
+                      <wps:style>
+                        <a:lnRef idx="2">
+                          <a:schemeClr val="dk1"/>
+                        </a:lnRef>
+                        <a:fillRef idx="1">
+                          <a:schemeClr val="lt1"/>
+                        </a:fillRef>
+                        <a:effectRef idx="0">
+                          <a:schemeClr val="dk1"/>
+                        </a:effectRef>
+                        <a:fontRef idx="minor">
+                          <a:schemeClr val="dk1"/>
+                        </a:fontRef>
+                      </wps:style>
+                      <wps:bodyPr rot="0" spcFirstLastPara="0" vertOverflow="overflow" horzOverflow="overflow" vert="horz" wrap="square" lIns="91440" tIns="45720" rIns="91440" bIns="45720" numCol="1" spcCol="0" rtlCol="0" fromWordArt="0" anchor="ctr" anchorCtr="0" forceAA="0" compatLnSpc="1">
+                        <a:prstTxWarp prst="textNoShape">
+                          <a:avLst/>
+                        </a:prstTxWarp>
+                        <a:noAutofit/>
+                      </wps:bodyPr>
+                    </wps:wsp>
+                  </a:graphicData>
+                </a:graphic>
+                <wp14:sizeRelV relativeFrom="margin">
+                  <wp14:pctHeight>0</wp14:pctHeight>
+                </wp14:sizeRelV>
+              </wp:anchor>
+            </w:drawing>
+          </mc:Choice>
+          <mc:Fallback>
+            <w:pict>
+              <v:rect w14:anchorId="217FD96D" id="Rectangle 9" o:spid="_x0000_s1026" style="position:absolute;margin-left:149.9pt;margin-top:15.35pt;width:150pt;height:36pt;z-index:-251653120;visibility:visible;mso-wrap-style:square;mso-height-percent:0;mso-wrap-distance-left:9pt;mso-wrap-distance-top:0;mso-wrap-distance-right:9pt;mso-wrap-distance-bottom:0;mso-position-horizontal:absolute;mso-position-horizontal-relative:margin;mso-position-vertical:absolute;mso-position-vertical-relative:text;mso-height-percent:0;mso-height-relative:margin;v-text-anchor:middle" o:gfxdata="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" fillcolor="white [3201]" strokecolor="black [3200]" strokeweight="1pt">
+                <w10:wrap anchorx="margin"/>
+              </v:rect>
+            </w:pict>
+          </mc:Fallback>
+        </mc:AlternateContent>
+      </w:r>
+    </w:p>
+    <w:p>
+      <w:pPr>
+        <w:pStyle w:val="NormalWeb"/>
+        <w:jc w:val="center"/>
+        <w:rPr>
+          <w:rFonts w:eastAsia="等线"/>
+        </w:rPr>
+      </w:pPr>
+      <w:r>
+        <w:rPr>
+          <w:rFonts w:eastAsia="等线" w:hint="eastAsia"/>
+          <w:noProof/>
+          <w:lang w:val="en-GB"/>
+        </w:rPr>
+        <mc:AlternateContent>
+          <mc:Choice Requires="wps">
+            <w:drawing>
+              <wp:anchor distT="0" distB="0" distL="114300" distR="114300" simplePos="0" relativeHeight="251696128" behindDoc="0" locked="0" layoutInCell="1" allowOverlap="1" wp14:anchorId="65FE2973" wp14:editId="67208C5A">
+                <wp:simplePos x="0" y="0"/>
+                <wp:positionH relativeFrom="column">
+                  <wp:posOffset>3810000</wp:posOffset>
+                </wp:positionH>
+                <wp:positionV relativeFrom="paragraph">
+                  <wp:posOffset>80645</wp:posOffset>
+                </wp:positionV>
+                <wp:extent cx="1197610" cy="3543300"/>
+                <wp:effectExtent l="38100" t="76200" r="612140" b="19050"/>
+                <wp:wrapNone/>
+                <wp:docPr id="36" name="Connector: Elbow 36"/>
+                <wp:cNvGraphicFramePr/>
+                <a:graphic xmlns:a="http://schemas.openxmlformats.org/drawingml/2006/main">
+                  <a:graphicData uri="http://schemas.microsoft.com/office/word/2010/wordprocessingShape">
+                    <wps:wsp>
+                      <wps:cNvCnPr/>
+                      <wps:spPr>
+                        <a:xfrm flipH="1" flipV="1">
+                          <a:off x="0" y="0"/>
+                          <a:ext cx="1197610" cy="3543300"/>
+                        </a:xfrm>
+                        <a:prstGeom prst="bentConnector3">
+                          <a:avLst>
+                            <a:gd name="adj1" fmla="val -49417"/>
+                          </a:avLst>
+                        </a:prstGeom>
+                        <a:ln>
+                          <a:tailEnd type="triangle"/>
+                        </a:ln>
+                      </wps:spPr>
+                      <wps:style>
+                        <a:lnRef idx="1">
+                          <a:schemeClr val="dk1"/>
+                        </a:lnRef>
+                        <a:fillRef idx="0">
+                          <a:schemeClr val="dk1"/>
+                        </a:fillRef>
+                        <a:effectRef idx="0">
+                          <a:schemeClr val="dk1"/>
+                        </a:effectRef>
+                        <a:fontRef idx="minor">
+                          <a:schemeClr val="tx1"/>
+                        </a:fontRef>
+                      </wps:style>
+                      <wps:bodyPr/>
+                    </wps:wsp>
+                  </a:graphicData>
+                </a:graphic>
+                <wp14:sizeRelH relativeFrom="margin">
+                  <wp14:pctWidth>0</wp14:pctWidth>
+                </wp14:sizeRelH>
+                <wp14:sizeRelV relativeFrom="margin">
+                  <wp14:pctHeight>0</wp14:pctHeight>
+                </wp14:sizeRelV>
+              </wp:anchor>
+            </w:drawing>
+          </mc:Choice>
+          <mc:Fallback>
+            <w:pict>
+              <v:shape w14:anchorId="0B30D41E" id="Connector: Elbow 36" o:spid="_x0000_s1026" type="#_x0000_t34" style="position:absolute;margin-left:300pt;margin-top:6.35pt;width:94.3pt;height:279pt;flip:x y;z-index:251696128;visibility:visible;mso-wrap-style:square;mso-width-percent:0;mso-height-percent:0;mso-wrap-distance-left:9pt;mso-wrap-distance-top:0;mso-wrap-distance-right:9pt;mso-wrap-distance-bottom:0;mso-position-horizontal:absolute;mso-position-horizontal-relative:text;mso-position-vertical:absolute;mso-position-vertical-relative:text;mso-width-percent:0;mso-height-percent:0;mso-width-relative:margin;mso-height-relative:margin" o:gfxdata="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" adj="-10674" strokecolor="black [3200]" strokeweight=".5pt">
+                <v:stroke endarrow="block"/>
+              </v:shape>
+            </w:pict>
+          </mc:Fallback>
+        </mc:AlternateContent>
+      </w:r>
+      <w:r>
+        <w:rPr>
+          <w:rFonts w:eastAsia="等线" w:hint="eastAsia"/>
+          <w:noProof/>
+          <w:lang w:val="en-GB"/>
+        </w:rPr>
+        <mc:AlternateContent>
+          <mc:Choice Requires="wps">
+            <w:drawing>
+              <wp:anchor distT="0" distB="0" distL="114300" distR="114300" simplePos="0" relativeHeight="251695104" behindDoc="0" locked="0" layoutInCell="1" allowOverlap="1" wp14:anchorId="7F62D662" wp14:editId="1D6EBB5B">
+                <wp:simplePos x="0" y="0"/>
+                <wp:positionH relativeFrom="column">
+                  <wp:posOffset>723900</wp:posOffset>
+                </wp:positionH>
+                <wp:positionV relativeFrom="paragraph">
+                  <wp:posOffset>80645</wp:posOffset>
+                </wp:positionV>
+                <wp:extent cx="1181100" cy="1714500"/>
+                <wp:effectExtent l="381000" t="76200" r="0" b="19050"/>
+                <wp:wrapNone/>
+                <wp:docPr id="35" name="Connector: Elbow 35"/>
+                <wp:cNvGraphicFramePr/>
+                <a:graphic xmlns:a="http://schemas.openxmlformats.org/drawingml/2006/main">
+                  <a:graphicData uri="http://schemas.microsoft.com/office/word/2010/wordprocessingShape">
+                    <wps:wsp>
+                      <wps:cNvCnPr/>
+                      <wps:spPr>
+                        <a:xfrm flipV="1">
+                          <a:off x="0" y="0"/>
+                          <a:ext cx="1181100" cy="1714500"/>
+                        </a:xfrm>
+                        <a:prstGeom prst="bentConnector3">
+                          <a:avLst>
+                            <a:gd name="adj1" fmla="val -31452"/>
+                          </a:avLst>
+                        </a:prstGeom>
+                        <a:ln>
+                          <a:tailEnd type="triangle"/>
+                        </a:ln>
+                      </wps:spPr>
+                      <wps:style>
+                        <a:lnRef idx="1">
+                          <a:schemeClr val="dk1"/>
+                        </a:lnRef>
+                        <a:fillRef idx="0">
+                          <a:schemeClr val="dk1"/>
+                        </a:fillRef>
+                        <a:effectRef idx="0">
+                          <a:schemeClr val="dk1"/>
+                        </a:effectRef>
+                        <a:fontRef idx="minor">
+                          <a:schemeClr val="tx1"/>
+                        </a:fontRef>
+                      </wps:style>
+                      <wps:bodyPr/>
+                    </wps:wsp>
+                  </a:graphicData>
+                </a:graphic>
+                <wp14:sizeRelH relativeFrom="margin">
+                  <wp14:pctWidth>0</wp14:pctWidth>
+                </wp14:sizeRelH>
+                <wp14:sizeRelV relativeFrom="margin">
+                  <wp14:pctHeight>0</wp14:pctHeight>
+                </wp14:sizeRelV>
+              </wp:anchor>
+            </w:drawing>
+          </mc:Choice>
+          <mc:Fallback>
+            <w:pict>
+              <v:shape w14:anchorId="35E9E007" id="Connector: Elbow 35" o:spid="_x0000_s1026" type="#_x0000_t34" style="position:absolute;margin-left:57pt;margin-top:6.35pt;width:93pt;height:135pt;flip:y;z-index:251695104;visibility:visible;mso-wrap-style:square;mso-width-percent:0;mso-height-percent:0;mso-wrap-distance-left:9pt;mso-wrap-distance-top:0;mso-wrap-distance-right:9pt;mso-wrap-distance-bottom:0;mso-position-horizontal:absolute;mso-position-horizontal-relative:text;mso-position-vertical:absolute;mso-position-vertical-relative:text;mso-width-percent:0;mso-height-percent:0;mso-width-relative:margin;mso-height-relative:margin" o:gfxdata="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" adj="-6794" strokecolor="black [3200]" strokeweight=".5pt">
+                <v:stroke endarrow="block"/>
+              </v:shape>
+            </w:pict>
+          </mc:Fallback>
+        </mc:AlternateContent>
+      </w:r>
+      <w:r>
+        <w:rPr>
+          <w:rFonts w:eastAsia="等线" w:hint="eastAsia"/>
+          <w:noProof/>
+        </w:rPr>
+        <mc:AlternateContent>
+          <mc:Choice Requires="wps">
+            <w:drawing>
+              <wp:anchor distT="0" distB="0" distL="114300" distR="114300" simplePos="0" relativeHeight="251673600" behindDoc="0" locked="0" layoutInCell="1" allowOverlap="1" wp14:anchorId="134862ED" wp14:editId="266478DA">
+                <wp:simplePos x="0" y="0"/>
+                <wp:positionH relativeFrom="column">
+                  <wp:posOffset>2860040</wp:posOffset>
+                </wp:positionH>
+                <wp:positionV relativeFrom="paragraph">
+                  <wp:posOffset>302260</wp:posOffset>
+                </wp:positionV>
+                <wp:extent cx="3169" cy="256032"/>
+                <wp:effectExtent l="76200" t="0" r="73660" b="48895"/>
+                <wp:wrapNone/>
+                <wp:docPr id="22" name="Straight Arrow Connector 22"/>
+                <wp:cNvGraphicFramePr/>
+                <a:graphic xmlns:a="http://schemas.openxmlformats.org/drawingml/2006/main">
+                  <a:graphicData uri="http://schemas.microsoft.com/office/word/2010/wordprocessingShape">
+                    <wps:wsp>
+                      <wps:cNvCnPr/>
+                      <wps:spPr>
+                        <a:xfrm>
+                          <a:off x="0" y="0"/>
+                          <a:ext cx="3169" cy="256032"/>
+                        </a:xfrm>
+                        <a:prstGeom prst="straightConnector1">
+                          <a:avLst/>
+                        </a:prstGeom>
+                        <a:ln>
+                          <a:tailEnd type="triangle"/>
+                        </a:ln>
+                      </wps:spPr>
+                      <wps:style>
+                        <a:lnRef idx="1">
+                          <a:schemeClr val="dk1"/>
+                        </a:lnRef>
+                        <a:fillRef idx="0">
+                          <a:schemeClr val="dk1"/>
+                        </a:fillRef>
+                        <a:effectRef idx="0">
+                          <a:schemeClr val="dk1"/>
+                        </a:effectRef>
+                        <a:fontRef idx="minor">
+                          <a:schemeClr val="tx1"/>
+                        </a:fontRef>
+                      </wps:style>
+                      <wps:bodyPr/>
+                    </wps:wsp>
+                  </a:graphicData>
+                </a:graphic>
+                <wp14:sizeRelH relativeFrom="margin">
+                  <wp14:pctWidth>0</wp14:pctWidth>
+                </wp14:sizeRelH>
+                <wp14:sizeRelV relativeFrom="margin">
+                  <wp14:pctHeight>0</wp14:pctHeight>
+                </wp14:sizeRelV>
+              </wp:anchor>
+            </w:drawing>
+          </mc:Choice>
+          <mc:Fallback>
+            <w:pict>
+              <v:shape w14:anchorId="35D813B1" id="Straight Arrow Connector 22" o:spid="_x0000_s1026" type="#_x0000_t32" style="position:absolute;margin-left:225.2pt;margin-top:23.8pt;width:.25pt;height:20.15pt;z-index:251673600;visibility:visible;mso-wrap-style:square;mso-width-percent:0;mso-height-percent:0;mso-wrap-distance-left:9pt;mso-wrap-distance-top:0;mso-wrap-distance-right:9pt;mso-wrap-distance-bottom:0;mso-position-horizontal:absolute;mso-position-horizontal-relative:text;mso-position-vertical:absolute;mso-position-vertical-relative:text;mso-width-percent:0;mso-height-percent:0;mso-width-relative:margin;mso-height-relative:margin" o:gfxdata="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" strokecolor="black [3200]" strokeweight=".5pt">
+                <v:stroke endarrow="block" joinstyle="miter"/>
+              </v:shape>
+            </w:pict>
+          </mc:Fallback>
+        </mc:AlternateContent>
+      </w:r>
+      <w:r>
+        <w:rPr>
+          <w:rFonts w:eastAsia="等线" w:hint="eastAsia"/>
+        </w:rPr>
+        <w:t>Read current temperature</w:t>
+      </w:r>
+    </w:p>
+    <w:p>
+      <w:pPr>
+        <w:pStyle w:val="NormalWeb"/>
+        <w:jc w:val="center"/>
+        <w:rPr>
+          <w:rFonts w:eastAsia="等线"/>
+        </w:rPr>
+      </w:pPr>
+      <w:r>
+        <w:rPr>
+          <w:rFonts w:eastAsia="等线"/>
+          <w:noProof/>
+        </w:rPr>
+        <mc:AlternateContent>
+          <mc:Choice Requires="wps">
+            <w:drawing>
+              <wp:anchor distT="45720" distB="45720" distL="114300" distR="114300" simplePos="0" relativeHeight="251702272" behindDoc="0" locked="0" layoutInCell="1" allowOverlap="1" wp14:anchorId="3C6A556B" wp14:editId="3459F988">
+                <wp:simplePos x="0" y="0"/>
+                <wp:positionH relativeFrom="column">
+                  <wp:posOffset>4873625</wp:posOffset>
+                </wp:positionH>
+                <wp:positionV relativeFrom="paragraph">
+                  <wp:posOffset>154940</wp:posOffset>
+                </wp:positionV>
+                <wp:extent cx="457200" cy="236855"/>
+                <wp:effectExtent l="0" t="0" r="19050" b="10795"/>
+                <wp:wrapNone/>
+                <wp:docPr id="41" name="Text Box 2"/>
+                <wp:cNvGraphicFramePr>
+                  <a:graphicFrameLocks xmlns:a="http://schemas.openxmlformats.org/drawingml/2006/main"/>
+                </wp:cNvGraphicFramePr>
+                <a:graphic xmlns:a="http://schemas.openxmlformats.org/drawingml/2006/main">
+                  <a:graphicData uri="http://schemas.microsoft.com/office/word/2010/wordprocessingShape">
+                    <wps:wsp>
+                      <wps:cNvSpPr txBox="1">
+                        <a:spLocks noChangeArrowheads="1"/>
+                      </wps:cNvSpPr>
+                      <wps:spPr bwMode="auto">
+                        <a:xfrm>
+                          <a:off x="0" y="0"/>
+                          <a:ext cx="457200" cy="236855"/>
+                        </a:xfrm>
+                        <a:prstGeom prst="rect">
+                          <a:avLst/>
+                        </a:prstGeom>
+                        <a:solidFill>
+                          <a:srgbClr val="FFFFFF"/>
+                        </a:solidFill>
+                        <a:ln w="9525">
+                          <a:solidFill>
+                            <a:schemeClr val="bg1"/>
+                          </a:solidFill>
+                          <a:miter lim="800000"/>
+                          <a:headEnd/>
+                          <a:tailEnd/>
+                        </a:ln>
+                      </wps:spPr>
+                      <wps:txbx>
+                        <w:txbxContent>
+                          <w:p>
+                            <w:pPr>
+                              <w:rPr>
+                                <w:rFonts w:hint="eastAsia"/>
+                              </w:rPr>
+                            </w:pPr>
+                            <w:r>
+                              <w:rPr>
+                                <w:rFonts w:hint="eastAsia"/>
+                                <w:lang w:eastAsia="zh-CN"/>
+                              </w:rPr>
+                              <w:t>No</w:t>
+                            </w:r>
+                          </w:p>
+                        </w:txbxContent>
+                      </wps:txbx>
+                      <wps:bodyPr rot="0" vert="horz" wrap="square" lIns="91440" tIns="45720" rIns="91440" bIns="45720" anchor="t" anchorCtr="0">
+                        <a:noAutofit/>
+                      </wps:bodyPr>
+                    </wps:wsp>
+                  </a:graphicData>
+                </a:graphic>
+                <wp14:sizeRelH relativeFrom="margin">
+                  <wp14:pctWidth>0</wp14:pctWidth>
+                </wp14:sizeRelH>
+                <wp14:sizeRelV relativeFrom="margin">
+                  <wp14:pctHeight>0</wp14:pctHeight>
+                </wp14:sizeRelV>
+              </wp:anchor>
+            </w:drawing>
+          </mc:Choice>
+          <mc:Fallback>
+            <w:pict>
+              <v:shapetype w14:anchorId="3C6A556B" id="_x0000_t202" coordsize="21600,21600" o:spt="202" path="m,l,21600r21600,l21600,xe">
+                <v:stroke joinstyle="miter"/>
+                <v:path gradientshapeok="t" o:connecttype="rect"/>
+              </v:shapetype>
+              <v:shape id="Text Box 2" o:spid="_x0000_s1026" type="#_x0000_t202" style="position:absolute;left:0;text-align:left;margin-left:383.75pt;margin-top:12.2pt;width:36pt;height:18.65pt;z-index:251702272;visibility:visible;mso-wrap-style:square;mso-width-percent:0;mso-height-percent:0;mso-wrap-distance-left:9pt;mso-wrap-distance-top:3.6pt;mso-wrap-distance-right:9pt;mso-wrap-distance-bottom:3.6pt;mso-position-horizontal:absolute;mso-position-horizontal-relative:text;mso-position-vertical:absolute;mso-position-vertical-relative:text;mso-width-percent:0;mso-height-percent:0;mso-width-relative:margin;mso-height-relative:margin;v-text-anchor:top" o:gfxdata="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" strokecolor="white [3212]">
+                <v:textbox>
+                  <w:txbxContent>
+                    <w:p>
+                      <w:pPr>
+                        <w:rPr>
+                          <w:rFonts w:hint="eastAsia"/>
+                        </w:rPr>
+                      </w:pPr>
+                      <w:r>
+                        <w:rPr>
+                          <w:rFonts w:hint="eastAsia"/>
+                          <w:lang w:eastAsia="zh-CN"/>
+                        </w:rPr>
+                        <w:t>No</w:t>
+                      </w:r>
+                    </w:p>
+                  </w:txbxContent>
+                </v:textbox>
+              </v:shape>
+            </w:pict>
+          </mc:Fallback>
+        </mc:AlternateContent>
+      </w:r>
+      <w:r>
+        <w:rPr>
+          <w:rFonts w:eastAsia="等线"/>
+          <w:noProof/>
+        </w:rPr>
+        <mc:AlternateContent>
+          <mc:Choice Requires="wps">
+            <w:drawing>
+              <wp:anchor distT="0" distB="0" distL="114300" distR="114300" simplePos="0" relativeHeight="251664384" behindDoc="1" locked="0" layoutInCell="1" allowOverlap="1" wp14:anchorId="39E057CA" wp14:editId="4B21E4E9">
+                <wp:simplePos x="0" y="0"/>
+                <wp:positionH relativeFrom="margin">
+                  <wp:posOffset>885825</wp:posOffset>
+                </wp:positionH>
+                <wp:positionV relativeFrom="paragraph">
+                  <wp:posOffset>183103</wp:posOffset>
+                </wp:positionV>
+                <wp:extent cx="3962400" cy="466725"/>
+                <wp:effectExtent l="38100" t="19050" r="0" b="47625"/>
+                <wp:wrapNone/>
+                <wp:docPr id="10" name="Diamond 10"/>
+                <wp:cNvGraphicFramePr/>
+                <a:graphic xmlns:a="http://schemas.openxmlformats.org/drawingml/2006/main">
+                  <a:graphicData uri="http://schemas.microsoft.com/office/word/2010/wordprocessingShape">
+                    <wps:wsp>
+                      <wps:cNvSpPr/>
+                      <wps:spPr>
+                        <a:xfrm>
+                          <a:off x="0" y="0"/>
+                          <a:ext cx="3962400" cy="466725"/>
+                        </a:xfrm>
+                        <a:prstGeom prst="diamond">
+                          <a:avLst/>
+                        </a:prstGeom>
+                      </wps:spPr>
+                      <wps:style>
+                        <a:lnRef idx="2">
+                          <a:schemeClr val="dk1"/>
+                        </a:lnRef>
+                        <a:fillRef idx="1">
+                          <a:schemeClr val="lt1"/>
+                        </a:fillRef>
+                        <a:effectRef idx="0">
+                          <a:schemeClr val="dk1"/>
+                        </a:effectRef>
+                        <a:fontRef idx="minor">
+                          <a:schemeClr val="dk1"/>
+                        </a:fontRef>
+                      </wps:style>
+                      <wps:bodyPr rot="0" spcFirstLastPara="0" vertOverflow="overflow" horzOverflow="overflow" vert="horz" wrap="square" lIns="91440" tIns="45720" rIns="91440" bIns="45720" numCol="1" spcCol="0" rtlCol="0" fromWordArt="0" anchor="ctr" anchorCtr="0" forceAA="0" compatLnSpc="1">
+                        <a:prstTxWarp prst="textNoShape">
+                          <a:avLst/>
+                        </a:prstTxWarp>
+                        <a:noAutofit/>
+                      </wps:bodyPr>
+                    </wps:wsp>
+                  </a:graphicData>
+                </a:graphic>
+                <wp14:sizeRelH relativeFrom="margin">
+                  <wp14:pctWidth>0</wp14:pctWidth>
+                </wp14:sizeRelH>
+              </wp:anchor>
+            </w:drawing>
+          </mc:Choice>
+          <mc:Fallback>
+            <w:pict>
+              <v:shapetype w14:anchorId="536650A0" id="_x0000_t4" coordsize="21600,21600" o:spt="4" path="m10800,l,10800,10800,21600,21600,10800xe">
+                <v:stroke joinstyle="miter"/>
+                <v:path gradientshapeok="t" o:connecttype="rect" textboxrect="5400,5400,16200,16200"/>
+              </v:shapetype>
+              <v:shape id="Diamond 10" o:spid="_x0000_s1026" type="#_x0000_t4" style="position:absolute;margin-left:69.75pt;margin-top:14.4pt;width:312pt;height:36.75pt;z-index:-251652096;visibility:visible;mso-wrap-style:square;mso-width-percent:0;mso-wrap-distance-left:9pt;mso-wrap-distance-top:0;mso-wrap-distance-right:9pt;mso-wrap-distance-bottom:0;mso-position-horizontal:absolute;mso-position-horizontal-relative:margin;mso-position-vertical:absolute;mso-position-vertical-relative:text;mso-width-percent:0;mso-width-relative:margin;v-text-anchor:middle" o:gfxdata="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" fillcolor="white [3201]" strokecolor="black [3200]" strokeweight="1pt">
+                <w10:wrap anchorx="margin"/>
+              </v:shape>
+            </w:pict>
+          </mc:Fallback>
+        </mc:AlternateContent>
+      </w:r>
+    </w:p>
+    <w:p>
+      <w:pPr>
+        <w:pStyle w:val="NormalWeb"/>
+        <w:jc w:val="center"/>
+        <w:rPr>
+          <w:rFonts w:eastAsia="等线" w:hint="eastAsia"/>
+          <w:lang w:val="en-GB"/>
+        </w:rPr>
+      </w:pPr>
+      <w:r>
+        <w:rPr>
+          <w:rFonts w:eastAsia="等线" w:hint="eastAsia"/>
+          <w:noProof/>
+        </w:rPr>
+        <mc:AlternateContent>
+          <mc:Choice Requires="wps">
+            <w:drawing>
+              <wp:anchor distT="0" distB="0" distL="114300" distR="114300" simplePos="0" relativeHeight="251678720" behindDoc="0" locked="0" layoutInCell="1" allowOverlap="1" wp14:anchorId="29402DB1" wp14:editId="1ABAEFBE">
+                <wp:simplePos x="0" y="0"/>
+                <wp:positionH relativeFrom="column">
+                  <wp:posOffset>2856155</wp:posOffset>
+                </wp:positionH>
+                <wp:positionV relativeFrom="paragraph">
+                  <wp:posOffset>319853</wp:posOffset>
+                </wp:positionV>
+                <wp:extent cx="2540" cy="566928"/>
+                <wp:effectExtent l="76200" t="0" r="73660" b="62230"/>
+                <wp:wrapNone/>
+                <wp:docPr id="23" name="Straight Arrow Connector 23"/>
+                <wp:cNvGraphicFramePr/>
+                <a:graphic xmlns:a="http://schemas.openxmlformats.org/drawingml/2006/main">
+                  <a:graphicData uri="http://schemas.microsoft.com/office/word/2010/wordprocessingShape">
+                    <wps:wsp>
+                      <wps:cNvCnPr/>
+                      <wps:spPr>
+                        <a:xfrm>
+                          <a:off x="0" y="0"/>
+                          <a:ext cx="2540" cy="566928"/>
+                        </a:xfrm>
+                        <a:prstGeom prst="straightConnector1">
+                          <a:avLst/>
+                        </a:prstGeom>
+                        <a:ln>
+                          <a:tailEnd type="triangle"/>
+                        </a:ln>
+                      </wps:spPr>
+                      <wps:style>
+                        <a:lnRef idx="1">
+                          <a:schemeClr val="dk1"/>
+                        </a:lnRef>
+                        <a:fillRef idx="0">
+                          <a:schemeClr val="dk1"/>
+                        </a:fillRef>
+                        <a:effectRef idx="0">
+                          <a:schemeClr val="dk1"/>
+                        </a:effectRef>
+                        <a:fontRef idx="minor">
+                          <a:schemeClr val="tx1"/>
+                        </a:fontRef>
+                      </wps:style>
+                      <wps:bodyPr/>
+                    </wps:wsp>
+                  </a:graphicData>
+                </a:graphic>
+                <wp14:sizeRelH relativeFrom="margin">
+                  <wp14:pctWidth>0</wp14:pctWidth>
+                </wp14:sizeRelH>
+                <wp14:sizeRelV relativeFrom="margin">
+                  <wp14:pctHeight>0</wp14:pctHeight>
+                </wp14:sizeRelV>
+              </wp:anchor>
+            </w:drawing>
+          </mc:Choice>
+          <mc:Fallback>
+            <w:pict>
+              <v:shape w14:anchorId="3F831317" id="Straight Arrow Connector 23" o:spid="_x0000_s1026" type="#_x0000_t32" style="position:absolute;margin-left:224.9pt;margin-top:25.2pt;width:.2pt;height:44.65pt;z-index:251678720;visibility:visible;mso-wrap-style:square;mso-width-percent:0;mso-height-percent:0;mso-wrap-distance-left:9pt;mso-wrap-distance-top:0;mso-wrap-distance-right:9pt;mso-wrap-distance-bottom:0;mso-position-horizontal:absolute;mso-position-horizontal-relative:text;mso-position-vertical:absolute;mso-position-vertical-relative:text;mso-width-percent:0;mso-height-percent:0;mso-width-relative:margin;mso-height-relative:margin" o:gfxdata="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" strokecolor="black [3200]" strokeweight=".5pt">
+                <v:stroke endarrow="block" joinstyle="miter"/>
+              </v:shape>
+            </w:pict>
+          </mc:Fallback>
+        </mc:AlternateContent>
+      </w:r>
+      <w:r>
+        <w:rPr>
+          <w:rFonts w:eastAsia="等线" w:hint="eastAsia"/>
+          <w:noProof/>
+        </w:rPr>
+        <mc:AlternateContent>
+          <mc:Choice Requires="wps">
+            <w:drawing>
+              <wp:anchor distT="0" distB="0" distL="114300" distR="114300" simplePos="0" relativeHeight="251693056" behindDoc="0" locked="0" layoutInCell="1" allowOverlap="1" wp14:anchorId="779F4F54" wp14:editId="657291C5">
+                <wp:simplePos x="0" y="0"/>
+                <wp:positionH relativeFrom="column">
+                  <wp:posOffset>4806367</wp:posOffset>
+                </wp:positionH>
+                <wp:positionV relativeFrom="paragraph">
+                  <wp:posOffset>57235</wp:posOffset>
+                </wp:positionV>
+                <wp:extent cx="45719" cy="1831889"/>
+                <wp:effectExtent l="38100" t="0" r="545465" b="92710"/>
+                <wp:wrapNone/>
+                <wp:docPr id="33" name="Connector: Elbow 33"/>
+                <wp:cNvGraphicFramePr/>
+                <a:graphic xmlns:a="http://schemas.openxmlformats.org/drawingml/2006/main">
+                  <a:graphicData uri="http://schemas.microsoft.com/office/word/2010/wordprocessingShape">
+                    <wps:wsp>
+                      <wps:cNvCnPr/>
+                      <wps:spPr>
+                        <a:xfrm flipH="1">
+                          <a:off x="0" y="0"/>
+                          <a:ext cx="45719" cy="1831889"/>
+                        </a:xfrm>
+                        <a:prstGeom prst="bentConnector3">
+                          <a:avLst>
+                            <a:gd name="adj1" fmla="val -1139909"/>
+                          </a:avLst>
+                        </a:prstGeom>
+                        <a:ln>
+                          <a:tailEnd type="triangle"/>
+                        </a:ln>
+                      </wps:spPr>
+                      <wps:style>
+                        <a:lnRef idx="1">
+                          <a:schemeClr val="dk1"/>
+                        </a:lnRef>
+                        <a:fillRef idx="0">
+                          <a:schemeClr val="dk1"/>
+                        </a:fillRef>
+                        <a:effectRef idx="0">
+                          <a:schemeClr val="dk1"/>
+                        </a:effectRef>
+                        <a:fontRef idx="minor">
+                          <a:schemeClr val="tx1"/>
+                        </a:fontRef>
+                      </wps:style>
+                      <wps:bodyPr/>
+                    </wps:wsp>
+                  </a:graphicData>
+                </a:graphic>
+                <wp14:sizeRelH relativeFrom="margin">
+                  <wp14:pctWidth>0</wp14:pctWidth>
+                </wp14:sizeRelH>
+                <wp14:sizeRelV relativeFrom="margin">
+                  <wp14:pctHeight>0</wp14:pctHeight>
+                </wp14:sizeRelV>
+              </wp:anchor>
+            </w:drawing>
+          </mc:Choice>
+          <mc:Fallback>
+            <w:pict>
+              <v:shape w14:anchorId="67AA07D2" id="Connector: Elbow 33" o:spid="_x0000_s1026" type="#_x0000_t34" style="position:absolute;margin-left:378.45pt;margin-top:4.5pt;width:3.6pt;height:144.25pt;flip:x;z-index:251693056;visibility:visible;mso-wrap-style:square;mso-width-percent:0;mso-height-percent:0;mso-wrap-distance-left:9pt;mso-wrap-distance-top:0;mso-wrap-distance-right:9pt;mso-wrap-distance-bottom:0;mso-position-horizontal:absolute;mso-position-horizontal-relative:text;mso-position-vertical:absolute;mso-position-vertical-relative:text;mso-width-percent:0;mso-height-percent:0;mso-width-relative:margin;mso-height-relative:margin" o:gfxdata="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" adj="-246220" strokecolor="black [3200]" strokeweight=".5pt">
+                <v:stroke endarrow="block"/>
+              </v:shape>
+            </w:pict>
+          </mc:Fallback>
+        </mc:AlternateContent>
+      </w:r>
+      <w:r>
+        <w:rPr>
+          <w:rFonts w:eastAsia="等线" w:hint="eastAsia"/>
+        </w:rPr>
+        <w:t xml:space="preserve">Is </w:t>
+      </w:r>
+      <w:r>
+        <w:rPr>
+          <w:rFonts w:eastAsia="等线" w:hint="eastAsia"/>
+        </w:rPr>
+        <w:t xml:space="preserve">the </w:t>
+      </w:r>
+      <w:r>
+        <w:rPr>
+          <w:rFonts w:eastAsia="等线" w:hint="eastAsia"/>
+        </w:rPr>
+        <w:t>temperature in the range 18-24</w:t>
+      </w:r>
+      <w:r>
+        <w:rPr>
+          <w:rFonts w:ascii="Arial" w:eastAsia="宋体" w:hAnsi="Arial" w:cs="Arial"/>
+          <w:sz w:val="22"/>
+          <w:szCs w:val="22"/>
+          <w:lang w:val="en-GB" w:eastAsia="en-US"/>
+        </w:rPr>
+        <w:t xml:space="preserve"> </w:t>
+      </w:r>
+      <w:r>
+        <w:rPr>
+          <w:rFonts w:eastAsia="等线"/>
+          <w:lang w:val="en-GB"/>
+        </w:rPr>
+        <w:t>°C</w:t>
+      </w:r>
+      <w:r>
+        <w:rPr>
+          <w:rFonts w:eastAsia="等线" w:hint="eastAsia"/>
+          <w:lang w:val="en-GB"/>
+        </w:rPr>
+        <w:t>?</w:t>
+      </w:r>
+    </w:p>
+    <w:p>
+      <w:pPr>
+        <w:pStyle w:val="NormalWeb"/>
+        <w:jc w:val="center"/>
+        <w:rPr>
+          <w:rFonts w:eastAsia="等线"/>
+          <w:lang w:val="en-GB"/>
+        </w:rPr>
+      </w:pPr>
+      <w:r>
+        <w:rPr>
+          <w:rFonts w:eastAsia="等线"/>
+          <w:noProof/>
+        </w:rPr>
+        <mc:AlternateContent>
+          <mc:Choice Requires="wps">
+            <w:drawing>
+              <wp:anchor distT="45720" distB="45720" distL="114300" distR="114300" simplePos="0" relativeHeight="251677696" behindDoc="0" locked="0" layoutInCell="1" allowOverlap="1" wp14:anchorId="38F7B435" wp14:editId="34342C8E">
+                <wp:simplePos x="0" y="0"/>
+                <wp:positionH relativeFrom="column">
+                  <wp:posOffset>2406512</wp:posOffset>
+                </wp:positionH>
+                <wp:positionV relativeFrom="paragraph">
+                  <wp:posOffset>117254</wp:posOffset>
+                </wp:positionV>
+                <wp:extent cx="457200" cy="228600"/>
+                <wp:effectExtent l="0" t="0" r="0" b="0"/>
+                <wp:wrapSquare wrapText="bothSides"/>
+                <wp:docPr id="217" name="Text Box 2"/>
+                <wp:cNvGraphicFramePr>
+                  <a:graphicFrameLocks xmlns:a="http://schemas.openxmlformats.org/drawingml/2006/main"/>
+                </wp:cNvGraphicFramePr>
+                <a:graphic xmlns:a="http://schemas.openxmlformats.org/drawingml/2006/main">
+                  <a:graphicData uri="http://schemas.microsoft.com/office/word/2010/wordprocessingShape">
+                    <wps:wsp>
+                      <wps:cNvSpPr txBox="1">
+                        <a:spLocks noChangeArrowheads="1"/>
+                      </wps:cNvSpPr>
+                      <wps:spPr bwMode="auto">
+                        <a:xfrm>
+                          <a:off x="0" y="0"/>
+                          <a:ext cx="457200" cy="228600"/>
+                        </a:xfrm>
+                        <a:prstGeom prst="rect">
+                          <a:avLst/>
+                        </a:prstGeom>
+                        <a:solidFill>
+                          <a:srgbClr val="FFFFFF"/>
+                        </a:solidFill>
+                        <a:ln w="9525">
+                          <a:noFill/>
+                          <a:miter lim="800000"/>
+                          <a:headEnd/>
+                          <a:tailEnd/>
+                        </a:ln>
+                      </wps:spPr>
+                      <wps:txbx>
+                        <w:txbxContent>
+                          <w:p>
+                            <w:pPr>
+                              <w:rPr>
+                                <w:rFonts w:hint="eastAsia"/>
+                              </w:rPr>
+                            </w:pPr>
+                            <w:r>
+                              <w:rPr>
+                                <w:rFonts w:hint="eastAsia"/>
+                                <w:lang w:eastAsia="zh-CN"/>
+                              </w:rPr>
+                              <w:t>Yes</w:t>
+                            </w:r>
+                          </w:p>
+                        </w:txbxContent>
+                      </wps:txbx>
+                      <wps:bodyPr rot="0" vert="horz" wrap="square" lIns="91440" tIns="45720" rIns="91440" bIns="45720" anchor="t" anchorCtr="0">
+                        <a:noAutofit/>
+                      </wps:bodyPr>
+                    </wps:wsp>
+                  </a:graphicData>
+                </a:graphic>
+                <wp14:sizeRelH relativeFrom="margin">
+                  <wp14:pctWidth>0</wp14:pctWidth>
+                </wp14:sizeRelH>
+                <wp14:sizeRelV relativeFrom="margin">
+                  <wp14:pctHeight>0</wp14:pctHeight>
+                </wp14:sizeRelV>
+              </wp:anchor>
+            </w:drawing>
+          </mc:Choice>
+          <mc:Fallback>
+            <w:pict>
+              <v:shape w14:anchorId="38F7B435" id="_x0000_s1027" type="#_x0000_t202" style="position:absolute;left:0;text-align:left;margin-left:189.5pt;margin-top:9.25pt;width:36pt;height:18pt;z-index:251677696;visibility:visible;mso-wrap-style:square;mso-width-percent:0;mso-height-percent:0;mso-wrap-distance-left:9pt;mso-wrap-distance-top:3.6pt;mso-wrap-distance-right:9pt;mso-wrap-distance-bottom:3.6pt;mso-position-horizontal:absolute;mso-position-horizontal-relative:text;mso-position-vertical:absolute;mso-position-vertical-relative:text;mso-width-percent:0;mso-height-percent:0;mso-width-relative:margin;mso-height-relative:margin;v-text-anchor:top" o:gfxdata="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" stroked="f">
+                <v:textbox>
+                  <w:txbxContent>
+                    <w:p>
+                      <w:pPr>
+                        <w:rPr>
+                          <w:rFonts w:hint="eastAsia"/>
+                        </w:rPr>
+                      </w:pPr>
+                      <w:r>
+                        <w:rPr>
+                          <w:rFonts w:hint="eastAsia"/>
+                          <w:lang w:eastAsia="zh-CN"/>
+                        </w:rPr>
+                        <w:t>Yes</w:t>
+                      </w:r>
+                    </w:p>
+                  </w:txbxContent>
+                </v:textbox>
+                <w10:wrap type="square"/>
+              </v:shape>
+            </w:pict>
+          </mc:Fallback>
+        </mc:AlternateContent>
+      </w:r>
+    </w:p>
+    <w:p>
+      <w:pPr>
+        <w:pStyle w:val="NormalWeb"/>
+        <w:jc w:val="center"/>
+        <w:rPr>
+          <w:rFonts w:eastAsia="等线"/>
+          <w:lang w:val="en-GB"/>
+        </w:rPr>
+      </w:pPr>
+      <w:r>
+        <w:rPr>
+          <w:rFonts w:eastAsia="等线"/>
+          <w:noProof/>
+          <w:lang w:val="en-GB"/>
+        </w:rPr>
+        <mc:AlternateContent>
+          <mc:Choice Requires="wps">
+            <w:drawing>
+              <wp:anchor distT="0" distB="0" distL="114300" distR="114300" simplePos="0" relativeHeight="251665408" behindDoc="1" locked="0" layoutInCell="1" allowOverlap="1" wp14:anchorId="50C328F5" wp14:editId="4818BBA3">
+                <wp:simplePos x="0" y="0"/>
+                <wp:positionH relativeFrom="margin">
+                  <wp:posOffset>723265</wp:posOffset>
+                </wp:positionH>
+                <wp:positionV relativeFrom="paragraph">
+                  <wp:posOffset>182880</wp:posOffset>
+                </wp:positionV>
+                <wp:extent cx="4276725" cy="457200"/>
+                <wp:effectExtent l="0" t="0" r="28575" b="19050"/>
+                <wp:wrapNone/>
+                <wp:docPr id="13" name="Rectangle 13"/>
+                <wp:cNvGraphicFramePr/>
+                <a:graphic xmlns:a="http://schemas.openxmlformats.org/drawingml/2006/main">
+                  <a:graphicData uri="http://schemas.microsoft.com/office/word/2010/wordprocessingShape">
+                    <wps:wsp>
+                      <wps:cNvSpPr/>
+                      <wps:spPr>
+                        <a:xfrm>
+                          <a:off x="0" y="0"/>
+                          <a:ext cx="4276725" cy="457200"/>
+                        </a:xfrm>
+                        <a:prstGeom prst="rect">
+                          <a:avLst/>
+                        </a:prstGeom>
+                      </wps:spPr>
+                      <wps:style>
+                        <a:lnRef idx="2">
+                          <a:schemeClr val="dk1"/>
+                        </a:lnRef>
+                        <a:fillRef idx="1">
+                          <a:schemeClr val="lt1"/>
+                        </a:fillRef>
+                        <a:effectRef idx="0">
+                          <a:schemeClr val="dk1"/>
+                        </a:effectRef>
+                        <a:fontRef idx="minor">
+                          <a:schemeClr val="dk1"/>
+                        </a:fontRef>
+                      </wps:style>
+                      <wps:bodyPr rot="0" spcFirstLastPara="0" vertOverflow="overflow" horzOverflow="overflow" vert="horz" wrap="square" lIns="91440" tIns="45720" rIns="91440" bIns="45720" numCol="1" spcCol="0" rtlCol="0" fromWordArt="0" anchor="ctr" anchorCtr="0" forceAA="0" compatLnSpc="1">
+                        <a:prstTxWarp prst="textNoShape">
+                          <a:avLst/>
+                        </a:prstTxWarp>
+                        <a:noAutofit/>
+                      </wps:bodyPr>
+                    </wps:wsp>
+                  </a:graphicData>
+                </a:graphic>
+                <wp14:sizeRelH relativeFrom="margin">
+                  <wp14:pctWidth>0</wp14:pctWidth>
+                </wp14:sizeRelH>
+                <wp14:sizeRelV relativeFrom="margin">
+                  <wp14:pctHeight>0</wp14:pctHeight>
+                </wp14:sizeRelV>
+              </wp:anchor>
+            </w:drawing>
+          </mc:Choice>
+          <mc:Fallback>
+            <w:pict>
+              <v:rect w14:anchorId="45654F9D" id="Rectangle 13" o:spid="_x0000_s1026" style="position:absolute;margin-left:56.95pt;margin-top:14.4pt;width:336.75pt;height:36pt;z-index:-251651072;visibility:visible;mso-wrap-style:square;mso-width-percent:0;mso-height-percent:0;mso-wrap-distance-left:9pt;mso-wrap-distance-top:0;mso-wrap-distance-right:9pt;mso-wrap-distance-bottom:0;mso-position-horizontal:absolute;mso-position-horizontal-relative:margin;mso-position-vertical:absolute;mso-position-vertical-relative:text;mso-width-percent:0;mso-height-percent:0;mso-width-relative:margin;mso-height-relative:margin;v-text-anchor:middle" o:gfxdata="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" fillcolor="white [3201]" strokecolor="black [3200]" strokeweight="1pt">
+                <w10:wrap anchorx="margin"/>
+              </v:rect>
+            </w:pict>
+          </mc:Fallback>
+        </mc:AlternateContent>
+      </w:r>
+    </w:p>
+    <w:p>
+      <w:pPr>
+        <w:pStyle w:val="NormalWeb"/>
+        <w:jc w:val="center"/>
+        <w:rPr>
+          <w:rFonts w:eastAsia="等线"/>
+          <w:lang w:val="en-GB"/>
+        </w:rPr>
+      </w:pPr>
+      <w:r>
+        <w:rPr>
+          <w:rFonts w:eastAsia="等线" w:hint="eastAsia"/>
+          <w:lang w:val="en-GB"/>
+        </w:rPr>
+        <w:t>Turn on green LED constantly</w:t>
+      </w:r>
+      <w:r>
+        <w:rPr>
+          <w:rFonts w:eastAsia="等线" w:hint="eastAsia"/>
+          <w:lang w:val="en-GB"/>
+        </w:rPr>
+        <w:t xml:space="preserve"> and turn</w:t>
+      </w:r>
+      <w:r>
+        <w:rPr>
+          <w:rFonts w:eastAsia="等线" w:hint="eastAsia"/>
+          <w:lang w:val="en-GB"/>
+        </w:rPr>
+        <w:t xml:space="preserve"> off y</w:t>
+      </w:r>
+      <w:r>
+        <w:rPr>
+          <w:rFonts w:eastAsia="等线" w:hint="eastAsia"/>
+          <w:lang w:val="en-GB"/>
+        </w:rPr>
+        <w:t xml:space="preserve">ellow and </w:t>
+      </w:r>
+      <w:r>
+        <w:rPr>
+          <w:rFonts w:eastAsia="等线" w:hint="eastAsia"/>
+          <w:lang w:val="en-GB"/>
+        </w:rPr>
+        <w:t>red LEDs.</w:t>
+      </w:r>
+    </w:p>
+    <w:p>
+      <w:pPr>
+        <w:pStyle w:val="NormalWeb"/>
+        <w:jc w:val="center"/>
+        <w:rPr>
+          <w:rFonts w:eastAsia="等线"/>
+          <w:lang w:val="en-GB"/>
+        </w:rPr>
+      </w:pPr>
+      <w:r>
+        <w:rPr>
+          <w:rFonts w:eastAsia="等线"/>
+          <w:noProof/>
+        </w:rPr>
+        <mc:AlternateContent>
+          <mc:Choice Requires="wps">
+            <w:drawing>
+              <wp:anchor distT="45720" distB="45720" distL="114300" distR="114300" simplePos="0" relativeHeight="251704320" behindDoc="0" locked="0" layoutInCell="1" allowOverlap="1" wp14:anchorId="28023654" wp14:editId="4FDEF207">
+                <wp:simplePos x="0" y="0"/>
+                <wp:positionH relativeFrom="column">
+                  <wp:posOffset>472440</wp:posOffset>
+                </wp:positionH>
+                <wp:positionV relativeFrom="paragraph">
+                  <wp:posOffset>209550</wp:posOffset>
+                </wp:positionV>
+                <wp:extent cx="457200" cy="236855"/>
+                <wp:effectExtent l="0" t="0" r="19050" b="10795"/>
+                <wp:wrapNone/>
+                <wp:docPr id="42" name="Text Box 2"/>
+                <wp:cNvGraphicFramePr>
+                  <a:graphicFrameLocks xmlns:a="http://schemas.openxmlformats.org/drawingml/2006/main"/>
+                </wp:cNvGraphicFramePr>
+                <a:graphic xmlns:a="http://schemas.openxmlformats.org/drawingml/2006/main">
+                  <a:graphicData uri="http://schemas.microsoft.com/office/word/2010/wordprocessingShape">
+                    <wps:wsp>
+                      <wps:cNvSpPr txBox="1">
+                        <a:spLocks noChangeArrowheads="1"/>
+                      </wps:cNvSpPr>
+                      <wps:spPr bwMode="auto">
+                        <a:xfrm>
+                          <a:off x="0" y="0"/>
+                          <a:ext cx="457200" cy="236855"/>
+                        </a:xfrm>
+                        <a:prstGeom prst="rect">
+                          <a:avLst/>
+                        </a:prstGeom>
+                        <a:solidFill>
+                          <a:srgbClr val="FFFFFF"/>
+                        </a:solidFill>
+                        <a:ln w="9525">
+                          <a:solidFill>
+                            <a:schemeClr val="bg1"/>
+                          </a:solidFill>
+                          <a:miter lim="800000"/>
+                          <a:headEnd/>
+                          <a:tailEnd/>
+                        </a:ln>
+                      </wps:spPr>
+                      <wps:txbx>
+                        <w:txbxContent>
+                          <w:p>
+                            <w:pPr>
+                              <w:rPr>
+                                <w:rFonts w:hint="eastAsia"/>
+                              </w:rPr>
+                            </w:pPr>
+                            <w:r>
+                              <w:rPr>
+                                <w:rFonts w:hint="eastAsia"/>
+                                <w:lang w:eastAsia="zh-CN"/>
+                              </w:rPr>
+                              <w:t>No</w:t>
+                            </w:r>
+                          </w:p>
+                        </w:txbxContent>
+                      </wps:txbx>
+                      <wps:bodyPr rot="0" vert="horz" wrap="square" lIns="91440" tIns="45720" rIns="91440" bIns="45720" anchor="t" anchorCtr="0">
+                        <a:noAutofit/>
+                      </wps:bodyPr>
+                    </wps:wsp>
+                  </a:graphicData>
+                </a:graphic>
+                <wp14:sizeRelH relativeFrom="margin">
+                  <wp14:pctWidth>0</wp14:pctWidth>
+                </wp14:sizeRelH>
+                <wp14:sizeRelV relativeFrom="margin">
+                  <wp14:pctHeight>0</wp14:pctHeight>
+                </wp14:sizeRelV>
+              </wp:anchor>
+            </w:drawing>
+          </mc:Choice>
+          <mc:Fallback>
+            <w:pict>
+              <v:shape w14:anchorId="28023654" id="_x0000_s1028" type="#_x0000_t202" style="position:absolute;left:0;text-align:left;margin-left:37.2pt;margin-top:16.5pt;width:36pt;height:18.65pt;z-index:251704320;visibility:visible;mso-wrap-style:square;mso-width-percent:0;mso-height-percent:0;mso-wrap-distance-left:9pt;mso-wrap-distance-top:3.6pt;mso-wrap-distance-right:9pt;mso-wrap-distance-bottom:3.6pt;mso-position-horizontal:absolute;mso-position-horizontal-relative:text;mso-position-vertical:absolute;mso-position-vertical-relative:text;mso-width-percent:0;mso-height-percent:0;mso-width-relative:margin;mso-height-relative:margin;v-text-anchor:top" o:gfxdata="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" strokecolor="white [3212]">
+                <v:textbox>
+                  <w:txbxContent>
+                    <w:p>
+                      <w:pPr>
+                        <w:rPr>
+                          <w:rFonts w:hint="eastAsia"/>
+                        </w:rPr>
+                      </w:pPr>
+                      <w:r>
+                        <w:rPr>
+                          <w:rFonts w:hint="eastAsia"/>
+                          <w:lang w:eastAsia="zh-CN"/>
+                        </w:rPr>
+                        <w:t>No</w:t>
+                      </w:r>
+                    </w:p>
+                  </w:txbxContent>
+                </v:textbox>
+              </v:shape>
+            </w:pict>
+          </mc:Fallback>
+        </mc:AlternateContent>
+      </w:r>
+      <w:r>
+        <w:rPr>
+          <w:rFonts w:eastAsia="等线"/>
+          <w:noProof/>
+        </w:rPr>
+        <mc:AlternateContent>
+          <mc:Choice Requires="wps">
+            <w:drawing>
+              <wp:anchor distT="0" distB="0" distL="114300" distR="114300" simplePos="0" relativeHeight="251681792" behindDoc="1" locked="0" layoutInCell="1" allowOverlap="1" wp14:anchorId="6E6E9C97" wp14:editId="00205F85">
+                <wp:simplePos x="0" y="0"/>
+                <wp:positionH relativeFrom="margin">
+                  <wp:posOffset>845185</wp:posOffset>
+                </wp:positionH>
+                <wp:positionV relativeFrom="paragraph">
+                  <wp:posOffset>249555</wp:posOffset>
+                </wp:positionV>
+                <wp:extent cx="3962400" cy="466725"/>
+                <wp:effectExtent l="38100" t="19050" r="57150" b="47625"/>
+                <wp:wrapNone/>
+                <wp:docPr id="25" name="Diamond 25"/>
+                <wp:cNvGraphicFramePr/>
+                <a:graphic xmlns:a="http://schemas.openxmlformats.org/drawingml/2006/main">
+                  <a:graphicData uri="http://schemas.microsoft.com/office/word/2010/wordprocessingShape">
+                    <wps:wsp>
+                      <wps:cNvSpPr/>
+                      <wps:spPr>
+                        <a:xfrm>
+                          <a:off x="0" y="0"/>
+                          <a:ext cx="3962400" cy="466725"/>
+                        </a:xfrm>
+                        <a:prstGeom prst="diamond">
+                          <a:avLst/>
+                        </a:prstGeom>
+                      </wps:spPr>
+                      <wps:style>
+                        <a:lnRef idx="2">
+                          <a:schemeClr val="dk1"/>
+                        </a:lnRef>
+                        <a:fillRef idx="1">
+                          <a:schemeClr val="lt1"/>
+                        </a:fillRef>
+                        <a:effectRef idx="0">
+                          <a:schemeClr val="dk1"/>
+                        </a:effectRef>
+                        <a:fontRef idx="minor">
+                          <a:schemeClr val="dk1"/>
+                        </a:fontRef>
+                      </wps:style>
+                      <wps:bodyPr rot="0" spcFirstLastPara="0" vertOverflow="overflow" horzOverflow="overflow" vert="horz" wrap="square" lIns="91440" tIns="45720" rIns="91440" bIns="45720" numCol="1" spcCol="0" rtlCol="0" fromWordArt="0" anchor="ctr" anchorCtr="0" forceAA="0" compatLnSpc="1">
+                        <a:prstTxWarp prst="textNoShape">
+                          <a:avLst/>
+                        </a:prstTxWarp>
+                        <a:noAutofit/>
+                      </wps:bodyPr>
+                    </wps:wsp>
+                  </a:graphicData>
+                </a:graphic>
+                <wp14:sizeRelH relativeFrom="margin">
+                  <wp14:pctWidth>0</wp14:pctWidth>
+                </wp14:sizeRelH>
+                <wp14:sizeRelV relativeFrom="margin">
+                  <wp14:pctHeight>0</wp14:pctHeight>
+                </wp14:sizeRelV>
+              </wp:anchor>
+            </w:drawing>
+          </mc:Choice>
+          <mc:Fallback>
+            <w:pict>
+              <v:shape w14:anchorId="2BC919E2" id="Diamond 25" o:spid="_x0000_s1026" type="#_x0000_t4" style="position:absolute;margin-left:66.55pt;margin-top:19.65pt;width:312pt;height:36.75pt;z-index:-251634688;visibility:visible;mso-wrap-style:square;mso-width-percent:0;mso-height-percent:0;mso-wrap-distance-left:9pt;mso-wrap-distance-top:0;mso-wrap-distance-right:9pt;mso-wrap-distance-bottom:0;mso-position-horizontal:absolute;mso-position-horizontal-relative:margin;mso-position-vertical:absolute;mso-position-vertical-relative:text;mso-width-percent:0;mso-height-percent:0;mso-width-relative:margin;mso-height-relative:margin;v-text-anchor:middle" o:gfxdata="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" fillcolor="white [3201]" strokecolor="black [3200]" strokeweight="1pt">
+                <w10:wrap anchorx="margin"/>
+              </v:shape>
+            </w:pict>
+          </mc:Fallback>
+        </mc:AlternateContent>
+      </w:r>
+    </w:p>
+    <w:p>
+      <w:pPr>
+        <w:pStyle w:val="NormalWeb"/>
+        <w:jc w:val="center"/>
+        <w:rPr>
+          <w:rFonts w:eastAsia="等线"/>
+          <w:lang w:val="en-GB"/>
+        </w:rPr>
+      </w:pPr>
+      <w:r>
+        <w:rPr>
+          <w:rFonts w:eastAsia="等线" w:hint="eastAsia"/>
+          <w:noProof/>
+        </w:rPr>
+        <mc:AlternateContent>
+          <mc:Choice Requires="wps">
+            <w:drawing>
+              <wp:anchor distT="0" distB="0" distL="114300" distR="114300" simplePos="0" relativeHeight="251694080" behindDoc="0" locked="0" layoutInCell="1" allowOverlap="1" wp14:anchorId="38498910" wp14:editId="59EDBA26">
+                <wp:simplePos x="0" y="0"/>
+                <wp:positionH relativeFrom="column">
+                  <wp:posOffset>932815</wp:posOffset>
+                </wp:positionH>
+                <wp:positionV relativeFrom="paragraph">
+                  <wp:posOffset>114300</wp:posOffset>
+                </wp:positionV>
+                <wp:extent cx="45719" cy="1724025"/>
+                <wp:effectExtent l="571500" t="0" r="50165" b="85725"/>
+                <wp:wrapNone/>
+                <wp:docPr id="34" name="Connector: Elbow 34"/>
+                <wp:cNvGraphicFramePr/>
+                <a:graphic xmlns:a="http://schemas.openxmlformats.org/drawingml/2006/main">
+                  <a:graphicData uri="http://schemas.microsoft.com/office/word/2010/wordprocessingShape">
+                    <wps:wsp>
+                      <wps:cNvCnPr/>
+                      <wps:spPr>
+                        <a:xfrm flipH="1">
+                          <a:off x="0" y="0"/>
+                          <a:ext cx="45719" cy="1724025"/>
+                        </a:xfrm>
+                        <a:prstGeom prst="bentConnector3">
+                          <a:avLst>
+                            <a:gd name="adj1" fmla="val 1350747"/>
+                          </a:avLst>
+                        </a:prstGeom>
+                        <a:ln>
+                          <a:tailEnd type="triangle"/>
+                        </a:ln>
+                      </wps:spPr>
+                      <wps:style>
+                        <a:lnRef idx="1">
+                          <a:schemeClr val="dk1"/>
+                        </a:lnRef>
+                        <a:fillRef idx="0">
+                          <a:schemeClr val="dk1"/>
+                        </a:fillRef>
+                        <a:effectRef idx="0">
+                          <a:schemeClr val="dk1"/>
+                        </a:effectRef>
+                        <a:fontRef idx="minor">
+                          <a:schemeClr val="tx1"/>
+                        </a:fontRef>
+                      </wps:style>
+                      <wps:bodyPr/>
+                    </wps:wsp>
+                  </a:graphicData>
+                </a:graphic>
+                <wp14:sizeRelH relativeFrom="margin">
+                  <wp14:pctWidth>0</wp14:pctWidth>
+                </wp14:sizeRelH>
+                <wp14:sizeRelV relativeFrom="margin">
+                  <wp14:pctHeight>0</wp14:pctHeight>
+                </wp14:sizeRelV>
+              </wp:anchor>
+            </w:drawing>
+          </mc:Choice>
+          <mc:Fallback>
+            <w:pict>
+              <v:shape w14:anchorId="19054E33" id="Connector: Elbow 34" o:spid="_x0000_s1026" type="#_x0000_t34" style="position:absolute;margin-left:73.45pt;margin-top:9pt;width:3.6pt;height:135.75pt;flip:x;z-index:251694080;visibility:visible;mso-wrap-style:square;mso-width-percent:0;mso-height-percent:0;mso-wrap-distance-left:9pt;mso-wrap-distance-top:0;mso-wrap-distance-right:9pt;mso-wrap-distance-bottom:0;mso-position-horizontal:absolute;mso-position-horizontal-relative:text;mso-position-vertical:absolute;mso-position-vertical-relative:text;mso-width-percent:0;mso-height-percent:0;mso-width-relative:margin;mso-height-relative:margin" o:gfxdata="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" adj="291761" strokecolor="black [3200]" strokeweight=".5pt">
+                <v:stroke endarrow="block"/>
+              </v:shape>
+            </w:pict>
+          </mc:Fallback>
+        </mc:AlternateContent>
+      </w:r>
+      <w:r>
+        <w:rPr>
+          <w:rFonts w:eastAsia="等线" w:hint="eastAsia"/>
+          <w:noProof/>
+        </w:rPr>
+        <mc:AlternateContent>
+          <mc:Choice Requires="wps">
+            <w:drawing>
+              <wp:anchor distT="0" distB="0" distL="114300" distR="114300" simplePos="0" relativeHeight="251658239" behindDoc="1" locked="0" layoutInCell="1" allowOverlap="1" wp14:anchorId="5F3B8755" wp14:editId="31982827">
+                <wp:simplePos x="0" y="0"/>
+                <wp:positionH relativeFrom="column">
+                  <wp:posOffset>2860040</wp:posOffset>
+                </wp:positionH>
+                <wp:positionV relativeFrom="paragraph">
+                  <wp:posOffset>304800</wp:posOffset>
+                </wp:positionV>
+                <wp:extent cx="2540" cy="548640"/>
+                <wp:effectExtent l="76200" t="0" r="73660" b="60960"/>
+                <wp:wrapNone/>
+                <wp:docPr id="31" name="Straight Arrow Connector 31"/>
+                <wp:cNvGraphicFramePr/>
+                <a:graphic xmlns:a="http://schemas.openxmlformats.org/drawingml/2006/main">
+                  <a:graphicData uri="http://schemas.microsoft.com/office/word/2010/wordprocessingShape">
+                    <wps:wsp>
+                      <wps:cNvCnPr/>
+                      <wps:spPr>
+                        <a:xfrm>
+                          <a:off x="0" y="0"/>
+                          <a:ext cx="2540" cy="548640"/>
+                        </a:xfrm>
+                        <a:prstGeom prst="straightConnector1">
+                          <a:avLst/>
+                        </a:prstGeom>
+                        <a:ln>
+                          <a:tailEnd type="triangle"/>
+                        </a:ln>
+                      </wps:spPr>
+                      <wps:style>
+                        <a:lnRef idx="1">
+                          <a:schemeClr val="dk1"/>
+                        </a:lnRef>
+                        <a:fillRef idx="0">
+                          <a:schemeClr val="dk1"/>
+                        </a:fillRef>
+                        <a:effectRef idx="0">
+                          <a:schemeClr val="dk1"/>
+                        </a:effectRef>
+                        <a:fontRef idx="minor">
+                          <a:schemeClr val="tx1"/>
+                        </a:fontRef>
+                      </wps:style>
+                      <wps:bodyPr/>
+                    </wps:wsp>
+                  </a:graphicData>
+                </a:graphic>
+                <wp14:sizeRelH relativeFrom="margin">
+                  <wp14:pctWidth>0</wp14:pctWidth>
+                </wp14:sizeRelH>
+                <wp14:sizeRelV relativeFrom="margin">
+                  <wp14:pctHeight>0</wp14:pctHeight>
+                </wp14:sizeRelV>
+              </wp:anchor>
+            </w:drawing>
+          </mc:Choice>
+          <mc:Fallback>
+            <w:pict>
+              <v:shape w14:anchorId="4935AD2D" id="Straight Arrow Connector 31" o:spid="_x0000_s1026" type="#_x0000_t32" style="position:absolute;margin-left:225.2pt;margin-top:24pt;width:.2pt;height:43.2pt;z-index:-251658241;visibility:visible;mso-wrap-style:square;mso-width-percent:0;mso-height-percent:0;mso-wrap-distance-left:9pt;mso-wrap-distance-top:0;mso-wrap-distance-right:9pt;mso-wrap-distance-bottom:0;mso-position-horizontal:absolute;mso-position-horizontal-relative:text;mso-position-vertical:absolute;mso-position-vertical-relative:text;mso-width-percent:0;mso-height-percent:0;mso-width-relative:margin;mso-height-relative:margin" o:gfxdata="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" strokecolor="black [3200]" strokeweight=".5pt">
+                <v:stroke endarrow="block" joinstyle="miter"/>
+              </v:shape>
+            </w:pict>
+          </mc:Fallback>
+        </mc:AlternateContent>
+      </w:r>
+      <w:r>
+        <w:rPr>
+          <w:rFonts w:eastAsia="等线" w:hint="eastAsia"/>
+        </w:rPr>
+        <w:t xml:space="preserve">Is </w:t>
+      </w:r>
+      <w:r>
+        <w:rPr>
+          <w:rFonts w:eastAsia="等线" w:hint="eastAsia"/>
+        </w:rPr>
+        <w:t xml:space="preserve">the </w:t>
+      </w:r>
+      <w:r>
+        <w:rPr>
+          <w:rFonts w:eastAsia="等线" w:hint="eastAsia"/>
+        </w:rPr>
+        <w:t xml:space="preserve">temperature </w:t>
+      </w:r>
+      <w:r>
+        <w:rPr>
+          <w:rFonts w:eastAsia="等线" w:hint="eastAsia"/>
+        </w:rPr>
+        <w:t>below</w:t>
+      </w:r>
+      <w:r>
+        <w:rPr>
+          <w:rFonts w:eastAsia="等线" w:hint="eastAsia"/>
+        </w:rPr>
+        <w:t xml:space="preserve"> 18</w:t>
+      </w:r>
+      <w:r>
+        <w:rPr>
+          <w:rFonts w:ascii="Arial" w:eastAsia="宋体" w:hAnsi="Arial" w:cs="Arial"/>
+          <w:sz w:val="22"/>
+          <w:szCs w:val="22"/>
+          <w:lang w:val="en-GB" w:eastAsia="en-US"/>
+        </w:rPr>
+        <w:t xml:space="preserve"> </w:t>
+      </w:r>
+      <w:r>
+        <w:rPr>
+          <w:rFonts w:eastAsia="等线"/>
+          <w:lang w:val="en-GB"/>
+        </w:rPr>
+        <w:t>°C</w:t>
+      </w:r>
+      <w:r>
+        <w:rPr>
+          <w:rFonts w:eastAsia="等线" w:hint="eastAsia"/>
+          <w:lang w:val="en-GB"/>
+        </w:rPr>
+        <w:t>?</w:t>
+      </w:r>
+    </w:p>
+    <w:p>
+      <w:pPr>
+        <w:pStyle w:val="NormalWeb"/>
+        <w:jc w:val="center"/>
+        <w:rPr>
+          <w:rFonts w:eastAsia="等线"/>
+          <w:lang w:val="en-GB"/>
+        </w:rPr>
+      </w:pPr>
+      <w:r>
+        <w:rPr>
+          <w:rFonts w:eastAsia="等线"/>
+          <w:noProof/>
+        </w:rPr>
+        <mc:AlternateContent>
+          <mc:Choice Requires="wps">
+            <w:drawing>
+              <wp:anchor distT="45720" distB="45720" distL="114300" distR="114300" simplePos="0" relativeHeight="251709440" behindDoc="0" locked="0" layoutInCell="1" allowOverlap="1" wp14:anchorId="30244F75" wp14:editId="0D254876">
+                <wp:simplePos x="0" y="0"/>
+                <wp:positionH relativeFrom="column">
+                  <wp:posOffset>2924175</wp:posOffset>
+                </wp:positionH>
+                <wp:positionV relativeFrom="paragraph">
+                  <wp:posOffset>98425</wp:posOffset>
+                </wp:positionV>
+                <wp:extent cx="457200" cy="342900"/>
+                <wp:effectExtent l="0" t="0" r="0" b="0"/>
+                <wp:wrapSquare wrapText="bothSides"/>
+                <wp:docPr id="47" name="Text Box 2"/>
+                <wp:cNvGraphicFramePr>
+                  <a:graphicFrameLocks xmlns:a="http://schemas.openxmlformats.org/drawingml/2006/main"/>
+                </wp:cNvGraphicFramePr>
+                <a:graphic xmlns:a="http://schemas.openxmlformats.org/drawingml/2006/main">
+                  <a:graphicData uri="http://schemas.microsoft.com/office/word/2010/wordprocessingShape">
+                    <wps:wsp>
+                      <wps:cNvSpPr txBox="1">
+                        <a:spLocks noChangeArrowheads="1"/>
+                      </wps:cNvSpPr>
+                      <wps:spPr bwMode="auto">
+                        <a:xfrm>
+                          <a:off x="0" y="0"/>
+                          <a:ext cx="457200" cy="342900"/>
+                        </a:xfrm>
+                        <a:prstGeom prst="rect">
+                          <a:avLst/>
+                        </a:prstGeom>
+                        <a:solidFill>
+                          <a:srgbClr val="FFFFFF"/>
+                        </a:solidFill>
+                        <a:ln w="9525">
+                          <a:noFill/>
+                          <a:miter lim="800000"/>
+                          <a:headEnd/>
+                          <a:tailEnd/>
+                        </a:ln>
+                      </wps:spPr>
+                      <wps:txbx>
+                        <w:txbxContent>
+                          <w:p>
+                            <w:pPr>
+                              <w:rPr>
+                                <w:rFonts w:hint="eastAsia"/>
+                              </w:rPr>
+                            </w:pPr>
+                            <w:r>
+                              <w:rPr>
+                                <w:rFonts w:hint="eastAsia"/>
+                                <w:lang w:eastAsia="zh-CN"/>
+                              </w:rPr>
+                              <w:t>Yes</w:t>
+                            </w:r>
+                          </w:p>
+                        </w:txbxContent>
+                      </wps:txbx>
+                      <wps:bodyPr rot="0" vert="horz" wrap="square" lIns="91440" tIns="45720" rIns="91440" bIns="45720" anchor="t" anchorCtr="0">
+                        <a:noAutofit/>
+                      </wps:bodyPr>
+                    </wps:wsp>
+                  </a:graphicData>
+                </a:graphic>
+                <wp14:sizeRelH relativeFrom="margin">
+                  <wp14:pctWidth>0</wp14:pctWidth>
+                </wp14:sizeRelH>
+                <wp14:sizeRelV relativeFrom="margin">
+                  <wp14:pctHeight>0</wp14:pctHeight>
+                </wp14:sizeRelV>
+              </wp:anchor>
+            </w:drawing>
+          </mc:Choice>
+          <mc:Fallback>
+            <w:pict>
+              <v:shape w14:anchorId="30244F75" id="_x0000_s1029" type="#_x0000_t202" style="position:absolute;left:0;text-align:left;margin-left:230.25pt;margin-top:7.75pt;width:36pt;height:27pt;z-index:251709440;visibility:visible;mso-wrap-style:square;mso-width-percent:0;mso-height-percent:0;mso-wrap-distance-left:9pt;mso-wrap-distance-top:3.6pt;mso-wrap-distance-right:9pt;mso-wrap-distance-bottom:3.6pt;mso-position-horizontal:absolute;mso-position-horizontal-relative:text;mso-position-vertical:absolute;mso-position-vertical-relative:text;mso-width-percent:0;mso-height-percent:0;mso-width-relative:margin;mso-height-relative:margin;v-text-anchor:top" o:gfxdata="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" stroked="f">
+                <v:textbox>
+                  <w:txbxContent>
+                    <w:p>
+                      <w:pPr>
+                        <w:rPr>
+                          <w:rFonts w:hint="eastAsia"/>
+                        </w:rPr>
+                      </w:pPr>
+                      <w:r>
+                        <w:rPr>
+                          <w:rFonts w:hint="eastAsia"/>
+                          <w:lang w:eastAsia="zh-CN"/>
+                        </w:rPr>
+                        <w:t>Yes</w:t>
+                      </w:r>
+                    </w:p>
+                  </w:txbxContent>
+                </v:textbox>
+                <w10:wrap type="square"/>
+              </v:shape>
+            </w:pict>
+          </mc:Fallback>
+        </mc:AlternateContent>
+      </w:r>
+    </w:p>
+    <w:p>
+      <w:pPr>
+        <w:pStyle w:val="NormalWeb"/>
+        <w:jc w:val="center"/>
+        <w:rPr>
+          <w:rFonts w:eastAsia="等线"/>
+          <w:lang w:val="en-GB"/>
+        </w:rPr>
+      </w:pPr>
+      <w:r>
+        <w:rPr>
+          <w:rFonts w:eastAsia="等线"/>
+          <w:noProof/>
+          <w:lang w:val="en-GB"/>
+        </w:rPr>
+        <mc:AlternateContent>
+          <mc:Choice Requires="wps">
+            <w:drawing>
+              <wp:anchor distT="0" distB="0" distL="114300" distR="114300" simplePos="0" relativeHeight="251685888" behindDoc="1" locked="0" layoutInCell="1" allowOverlap="1" wp14:anchorId="4A635443" wp14:editId="5D57B55E">
+                <wp:simplePos x="0" y="0"/>
+                <wp:positionH relativeFrom="margin">
+                  <wp:posOffset>733425</wp:posOffset>
+                </wp:positionH>
+                <wp:positionV relativeFrom="paragraph">
+                  <wp:posOffset>147320</wp:posOffset>
+                </wp:positionV>
+                <wp:extent cx="4276725" cy="457200"/>
+                <wp:effectExtent l="0" t="0" r="28575" b="19050"/>
+                <wp:wrapNone/>
+                <wp:docPr id="29" name="Rectangle 29"/>
+                <wp:cNvGraphicFramePr/>
+                <a:graphic xmlns:a="http://schemas.openxmlformats.org/drawingml/2006/main">
+                  <a:graphicData uri="http://schemas.microsoft.com/office/word/2010/wordprocessingShape">
+                    <wps:wsp>
+                      <wps:cNvSpPr/>
+                      <wps:spPr>
+                        <a:xfrm>
+                          <a:off x="0" y="0"/>
+                          <a:ext cx="4276725" cy="457200"/>
+                        </a:xfrm>
+                        <a:prstGeom prst="rect">
+                          <a:avLst/>
+                        </a:prstGeom>
+                      </wps:spPr>
+                      <wps:style>
+                        <a:lnRef idx="2">
+                          <a:schemeClr val="dk1"/>
+                        </a:lnRef>
+                        <a:fillRef idx="1">
+                          <a:schemeClr val="lt1"/>
+                        </a:fillRef>
+                        <a:effectRef idx="0">
+                          <a:schemeClr val="dk1"/>
+                        </a:effectRef>
+                        <a:fontRef idx="minor">
+                          <a:schemeClr val="dk1"/>
+                        </a:fontRef>
+                      </wps:style>
+                      <wps:bodyPr rot="0" spcFirstLastPara="0" vertOverflow="overflow" horzOverflow="overflow" vert="horz" wrap="square" lIns="91440" tIns="45720" rIns="91440" bIns="45720" numCol="1" spcCol="0" rtlCol="0" fromWordArt="0" anchor="ctr" anchorCtr="0" forceAA="0" compatLnSpc="1">
+                        <a:prstTxWarp prst="textNoShape">
+                          <a:avLst/>
+                        </a:prstTxWarp>
+                        <a:noAutofit/>
+                      </wps:bodyPr>
+                    </wps:wsp>
+                  </a:graphicData>
+                </a:graphic>
+                <wp14:sizeRelH relativeFrom="margin">
+                  <wp14:pctWidth>0</wp14:pctWidth>
+                </wp14:sizeRelH>
+                <wp14:sizeRelV relativeFrom="margin">
+                  <wp14:pctHeight>0</wp14:pctHeight>
+                </wp14:sizeRelV>
+              </wp:anchor>
+            </w:drawing>
+          </mc:Choice>
+          <mc:Fallback>
+            <w:pict>
+              <v:rect w14:anchorId="2B871A86" id="Rectangle 29" o:spid="_x0000_s1026" style="position:absolute;margin-left:57.75pt;margin-top:11.6pt;width:336.75pt;height:36pt;z-index:-251630592;visibility:visible;mso-wrap-style:square;mso-width-percent:0;mso-height-percent:0;mso-wrap-distance-left:9pt;mso-wrap-distance-top:0;mso-wrap-distance-right:9pt;mso-wrap-distance-bottom:0;mso-position-horizontal:absolute;mso-position-horizontal-relative:margin;mso-position-vertical:absolute;mso-position-vertical-relative:text;mso-width-percent:0;mso-height-percent:0;mso-width-relative:margin;mso-height-relative:margin;v-text-anchor:middle" o:gfxdata="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" fillcolor="white [3201]" strokecolor="black [3200]" strokeweight="1pt">
+                <w10:wrap anchorx="margin"/>
+              </v:rect>
+            </w:pict>
+          </mc:Fallback>
+        </mc:AlternateContent>
+      </w:r>
+    </w:p>
+    <w:p>
+      <w:pPr>
+        <w:pStyle w:val="NormalWeb"/>
+        <w:jc w:val="center"/>
+        <w:rPr>
+          <w:rFonts w:eastAsia="等线"/>
+          <w:lang w:val="en-GB"/>
+        </w:rPr>
+      </w:pPr>
+      <w:r>
+        <w:rPr>
+          <w:rFonts w:eastAsia="等线" w:hint="eastAsia"/>
+          <w:lang w:val="en-GB"/>
+        </w:rPr>
+        <w:t>Yellow</w:t>
+      </w:r>
+      <w:r>
+        <w:rPr>
+          <w:rFonts w:eastAsia="等线" w:hint="eastAsia"/>
+          <w:lang w:val="en-GB"/>
+        </w:rPr>
+        <w:t xml:space="preserve"> LED </w:t>
+      </w:r>
+      <w:r>
+        <w:rPr>
+          <w:rFonts w:eastAsia="等线" w:hint="eastAsia"/>
+          <w:lang w:val="en-GB"/>
+        </w:rPr>
+        <w:t>blinks every 0.5s</w:t>
+      </w:r>
+      <w:r>
+        <w:rPr>
+          <w:rFonts w:eastAsia="等线" w:hint="eastAsia"/>
+          <w:lang w:val="en-GB"/>
+        </w:rPr>
+        <w:t xml:space="preserve"> and turn off </w:t>
+      </w:r>
+      <w:r>
+        <w:rPr>
+          <w:rFonts w:eastAsia="等线" w:hint="eastAsia"/>
+          <w:lang w:val="en-GB"/>
+        </w:rPr>
+        <w:t>green</w:t>
+      </w:r>
+      <w:r>
+        <w:rPr>
+          <w:rFonts w:eastAsia="等线" w:hint="eastAsia"/>
+          <w:lang w:val="en-GB"/>
+        </w:rPr>
+        <w:t xml:space="preserve"> and red LEDs.</w:t>
+      </w:r>
+    </w:p>
+    <w:p>
+      <w:pPr>
+        <w:pStyle w:val="NormalWeb"/>
+        <w:jc w:val="center"/>
+        <w:rPr>
+          <w:rFonts w:eastAsia="等线"/>
+          <w:lang w:val="en-GB"/>
+        </w:rPr>
+      </w:pPr>
+      <w:r>
+        <w:rPr>
+          <w:rFonts w:eastAsia="等线"/>
+          <w:noProof/>
+        </w:rPr>
+        <mc:AlternateContent>
+          <mc:Choice Requires="wps">
+            <w:drawing>
+              <wp:anchor distT="0" distB="0" distL="114300" distR="114300" simplePos="0" relativeHeight="251683840" behindDoc="1" locked="0" layoutInCell="1" allowOverlap="1" wp14:anchorId="7D17853C" wp14:editId="0A9FA51C">
+                <wp:simplePos x="0" y="0"/>
+                <wp:positionH relativeFrom="margin">
+                  <wp:posOffset>885825</wp:posOffset>
+                </wp:positionH>
+                <wp:positionV relativeFrom="paragraph">
+                  <wp:posOffset>197485</wp:posOffset>
+                </wp:positionV>
+                <wp:extent cx="3962400" cy="466725"/>
+                <wp:effectExtent l="38100" t="19050" r="0" b="47625"/>
+                <wp:wrapNone/>
+                <wp:docPr id="28" name="Diamond 28"/>
+                <wp:cNvGraphicFramePr/>
+                <a:graphic xmlns:a="http://schemas.openxmlformats.org/drawingml/2006/main">
+                  <a:graphicData uri="http://schemas.microsoft.com/office/word/2010/wordprocessingShape">
+                    <wps:wsp>
+                      <wps:cNvSpPr/>
+                      <wps:spPr>
+                        <a:xfrm>
+                          <a:off x="0" y="0"/>
+                          <a:ext cx="3962400" cy="466725"/>
+                        </a:xfrm>
+                        <a:prstGeom prst="diamond">
+                          <a:avLst/>
+                        </a:prstGeom>
+                      </wps:spPr>
+                      <wps:style>
+                        <a:lnRef idx="2">
+                          <a:schemeClr val="dk1"/>
+                        </a:lnRef>
+                        <a:fillRef idx="1">
+                          <a:schemeClr val="lt1"/>
+                        </a:fillRef>
+                        <a:effectRef idx="0">
+                          <a:schemeClr val="dk1"/>
+                        </a:effectRef>
+                        <a:fontRef idx="minor">
+                          <a:schemeClr val="dk1"/>
+                        </a:fontRef>
+                      </wps:style>
+                      <wps:bodyPr rot="0" spcFirstLastPara="0" vertOverflow="overflow" horzOverflow="overflow" vert="horz" wrap="square" lIns="91440" tIns="45720" rIns="91440" bIns="45720" numCol="1" spcCol="0" rtlCol="0" fromWordArt="0" anchor="ctr" anchorCtr="0" forceAA="0" compatLnSpc="1">
+                        <a:prstTxWarp prst="textNoShape">
+                          <a:avLst/>
+                        </a:prstTxWarp>
+                        <a:noAutofit/>
+                      </wps:bodyPr>
+                    </wps:wsp>
+                  </a:graphicData>
+                </a:graphic>
+                <wp14:sizeRelH relativeFrom="margin">
+                  <wp14:pctWidth>0</wp14:pctWidth>
+                </wp14:sizeRelH>
+              </wp:anchor>
+            </w:drawing>
+          </mc:Choice>
+          <mc:Fallback>
+            <w:pict>
+              <v:shape w14:anchorId="25E5B93A" id="Diamond 28" o:spid="_x0000_s1026" type="#_x0000_t4" style="position:absolute;margin-left:69.75pt;margin-top:15.55pt;width:312pt;height:36.75pt;z-index:-251632640;visibility:visible;mso-wrap-style:square;mso-width-percent:0;mso-wrap-distance-left:9pt;mso-wrap-distance-top:0;mso-wrap-distance-right:9pt;mso-wrap-distance-bottom:0;mso-position-horizontal:absolute;mso-position-horizontal-relative:margin;mso-position-vertical:absolute;mso-position-vertical-relative:text;mso-width-percent:0;mso-width-relative:margin;v-text-anchor:middle" o:gfxdata="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" fillcolor="white [3201]" strokecolor="black [3200]" strokeweight="1pt">
+                <w10:wrap anchorx="margin"/>
+              </v:shape>
+            </w:pict>
+          </mc:Fallback>
+        </mc:AlternateContent>
+      </w:r>
+    </w:p>
+    <w:p>
+      <w:pPr>
+        <w:pStyle w:val="NormalWeb"/>
+        <w:jc w:val="center"/>
+        <w:rPr>
+          <w:rFonts w:eastAsia="等线"/>
+          <w:lang w:val="en-GB"/>
+        </w:rPr>
+      </w:pPr>
+      <w:r>
+        <w:rPr>
+          <w:rFonts w:eastAsia="等线" w:hint="eastAsia"/>
+          <w:noProof/>
+        </w:rPr>
+        <mc:AlternateContent>
+          <mc:Choice Requires="wps">
+            <w:drawing>
+              <wp:anchor distT="0" distB="0" distL="114300" distR="114300" simplePos="0" relativeHeight="251692032" behindDoc="0" locked="0" layoutInCell="1" allowOverlap="1" wp14:anchorId="3D761CE3" wp14:editId="336C0F94">
+                <wp:simplePos x="0" y="0"/>
+                <wp:positionH relativeFrom="column">
+                  <wp:posOffset>2857500</wp:posOffset>
+                </wp:positionH>
+                <wp:positionV relativeFrom="paragraph">
+                  <wp:posOffset>314325</wp:posOffset>
+                </wp:positionV>
+                <wp:extent cx="2540" cy="457200"/>
+                <wp:effectExtent l="76200" t="0" r="73660" b="57150"/>
+                <wp:wrapNone/>
+                <wp:docPr id="32" name="Straight Arrow Connector 32"/>
+                <wp:cNvGraphicFramePr/>
+                <a:graphic xmlns:a="http://schemas.openxmlformats.org/drawingml/2006/main">
+                  <a:graphicData uri="http://schemas.microsoft.com/office/word/2010/wordprocessingShape">
+                    <wps:wsp>
+                      <wps:cNvCnPr/>
+                      <wps:spPr>
+                        <a:xfrm>
+                          <a:off x="0" y="0"/>
+                          <a:ext cx="2540" cy="457200"/>
+                        </a:xfrm>
+                        <a:prstGeom prst="straightConnector1">
+                          <a:avLst/>
+                        </a:prstGeom>
+                        <a:ln>
+                          <a:tailEnd type="triangle"/>
+                        </a:ln>
+                      </wps:spPr>
+                      <wps:style>
+                        <a:lnRef idx="1">
+                          <a:schemeClr val="dk1"/>
+                        </a:lnRef>
+                        <a:fillRef idx="0">
+                          <a:schemeClr val="dk1"/>
+                        </a:fillRef>
+                        <a:effectRef idx="0">
+                          <a:schemeClr val="dk1"/>
+                        </a:effectRef>
+                        <a:fontRef idx="minor">
+                          <a:schemeClr val="tx1"/>
+                        </a:fontRef>
+                      </wps:style>
+                      <wps:bodyPr/>
+                    </wps:wsp>
+                  </a:graphicData>
+                </a:graphic>
+                <wp14:sizeRelH relativeFrom="margin">
+                  <wp14:pctWidth>0</wp14:pctWidth>
+                </wp14:sizeRelH>
+                <wp14:sizeRelV relativeFrom="margin">
+                  <wp14:pctHeight>0</wp14:pctHeight>
+                </wp14:sizeRelV>
+              </wp:anchor>
+            </w:drawing>
+          </mc:Choice>
+          <mc:Fallback>
+            <w:pict>
+              <v:shape w14:anchorId="1EA2251F" id="Straight Arrow Connector 32" o:spid="_x0000_s1026" type="#_x0000_t32" style="position:absolute;margin-left:225pt;margin-top:24.75pt;width:.2pt;height:36pt;z-index:251692032;visibility:visible;mso-wrap-style:square;mso-width-percent:0;mso-height-percent:0;mso-wrap-distance-left:9pt;mso-wrap-distance-top:0;mso-wrap-distance-right:9pt;mso-wrap-distance-bottom:0;mso-position-horizontal:absolute;mso-position-horizontal-relative:text;mso-position-vertical:absolute;mso-position-vertical-relative:text;mso-width-percent:0;mso-height-percent:0;mso-width-relative:margin;mso-height-relative:margin" o:gfxdata="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" strokecolor="black [3200]" strokeweight=".5pt">
+                <v:stroke endarrow="block" joinstyle="miter"/>
+              </v:shape>
+            </w:pict>
+          </mc:Fallback>
+        </mc:AlternateContent>
+      </w:r>
+      <w:r>
+        <w:rPr>
+          <w:rFonts w:eastAsia="等线" w:hint="eastAsia"/>
+        </w:rPr>
+        <w:t xml:space="preserve">Is the temperature </w:t>
+      </w:r>
+      <w:r>
+        <w:rPr>
+          <w:rFonts w:eastAsia="等线" w:hint="eastAsia"/>
+        </w:rPr>
+        <w:t>above</w:t>
+      </w:r>
+      <w:r>
+        <w:rPr>
+          <w:rFonts w:eastAsia="等线" w:hint="eastAsia"/>
+        </w:rPr>
+        <w:t xml:space="preserve"> </w:t>
+      </w:r>
+      <w:r>
+        <w:rPr>
+          <w:rFonts w:eastAsia="等线" w:hint="eastAsia"/>
+        </w:rPr>
+        <w:t>24</w:t>
+      </w:r>
+      <w:r>
+        <w:rPr>
+          <w:rFonts w:ascii="Arial" w:eastAsia="宋体" w:hAnsi="Arial" w:cs="Arial"/>
+          <w:sz w:val="22"/>
+          <w:szCs w:val="22"/>
+          <w:lang w:val="en-GB" w:eastAsia="en-US"/>
+        </w:rPr>
+        <w:t xml:space="preserve"> </w:t>
+      </w:r>
+      <w:r>
+        <w:rPr>
+          <w:rFonts w:eastAsia="等线"/>
+          <w:lang w:val="en-GB"/>
+        </w:rPr>
+        <w:t>°C</w:t>
+      </w:r>
+      <w:r>
+        <w:rPr>
+          <w:rFonts w:eastAsia="等线" w:hint="eastAsia"/>
+          <w:lang w:val="en-GB"/>
+        </w:rPr>
+        <w:t>?</w:t>
+      </w:r>
+    </w:p>
+    <w:p>
+      <w:pPr>
+        <w:spacing w:line="259" w:lineRule="auto"/>
+        <w:jc w:val="center"/>
+        <w:rPr>
           <w:color w:val="000000" w:themeColor="text1"/>
           <w:lang w:eastAsia="zh-CN"/>
         </w:rPr>
       </w:pPr>
+      <w:r>
+        <w:rPr>
+          <w:rFonts w:eastAsia="等线"/>
+          <w:noProof/>
+        </w:rPr>
+        <mc:AlternateContent>
+          <mc:Choice Requires="wps">
+            <w:drawing>
+              <wp:anchor distT="45720" distB="45720" distL="114300" distR="114300" simplePos="0" relativeHeight="251706368" behindDoc="0" locked="0" layoutInCell="1" allowOverlap="1" wp14:anchorId="1063CE9C" wp14:editId="58BCA205">
+                <wp:simplePos x="0" y="0"/>
+                <wp:positionH relativeFrom="column">
+                  <wp:posOffset>2924175</wp:posOffset>
+                </wp:positionH>
+                <wp:positionV relativeFrom="paragraph">
+                  <wp:posOffset>67310</wp:posOffset>
+                </wp:positionV>
+                <wp:extent cx="457200" cy="352425"/>
+                <wp:effectExtent l="0" t="0" r="0" b="9525"/>
+                <wp:wrapSquare wrapText="bothSides"/>
+                <wp:docPr id="43" name="Text Box 2"/>
+                <wp:cNvGraphicFramePr>
+                  <a:graphicFrameLocks xmlns:a="http://schemas.openxmlformats.org/drawingml/2006/main"/>
+                </wp:cNvGraphicFramePr>
+                <a:graphic xmlns:a="http://schemas.openxmlformats.org/drawingml/2006/main">
+                  <a:graphicData uri="http://schemas.microsoft.com/office/word/2010/wordprocessingShape">
+                    <wps:wsp>
+                      <wps:cNvSpPr txBox="1">
+                        <a:spLocks noChangeArrowheads="1"/>
+                      </wps:cNvSpPr>
+                      <wps:spPr bwMode="auto">
+                        <a:xfrm>
+                          <a:off x="0" y="0"/>
+                          <a:ext cx="457200" cy="352425"/>
+                        </a:xfrm>
+                        <a:prstGeom prst="rect">
+                          <a:avLst/>
+                        </a:prstGeom>
+                        <a:solidFill>
+                          <a:srgbClr val="FFFFFF"/>
+                        </a:solidFill>
+                        <a:ln w="9525">
+                          <a:noFill/>
+                          <a:miter lim="800000"/>
+                          <a:headEnd/>
+                          <a:tailEnd/>
+                        </a:ln>
+                      </wps:spPr>
+                      <wps:txbx>
+                        <w:txbxContent>
+                          <w:p>
+                            <w:pPr>
+                              <w:rPr>
+                                <w:rFonts w:hint="eastAsia"/>
+                              </w:rPr>
+                            </w:pPr>
+                            <w:r>
+                              <w:rPr>
+                                <w:rFonts w:hint="eastAsia"/>
+                                <w:lang w:eastAsia="zh-CN"/>
+                              </w:rPr>
+                              <w:t>Yes</w:t>
+                            </w:r>
+                          </w:p>
+                        </w:txbxContent>
+                      </wps:txbx>
+                      <wps:bodyPr rot="0" vert="horz" wrap="square" lIns="91440" tIns="45720" rIns="91440" bIns="45720" anchor="t" anchorCtr="0">
+                        <a:noAutofit/>
+                      </wps:bodyPr>
+                    </wps:wsp>
+                  </a:graphicData>
+                </a:graphic>
+                <wp14:sizeRelH relativeFrom="margin">
+                  <wp14:pctWidth>0</wp14:pctWidth>
+                </wp14:sizeRelH>
+                <wp14:sizeRelV relativeFrom="margin">
+                  <wp14:pctHeight>0</wp14:pctHeight>
+                </wp14:sizeRelV>
+              </wp:anchor>
+            </w:drawing>
+          </mc:Choice>
+          <mc:Fallback>
+            <w:pict>
+              <v:shape w14:anchorId="1063CE9C" id="_x0000_s1030" type="#_x0000_t202" style="position:absolute;left:0;text-align:left;margin-left:230.25pt;margin-top:5.3pt;width:36pt;height:27.75pt;z-index:251706368;visibility:visible;mso-wrap-style:square;mso-width-percent:0;mso-height-percent:0;mso-wrap-distance-left:9pt;mso-wrap-distance-top:3.6pt;mso-wrap-distance-right:9pt;mso-wrap-distance-bottom:3.6pt;mso-position-horizontal:absolute;mso-position-horizontal-relative:text;mso-position-vertical:absolute;mso-position-vertical-relative:text;mso-width-percent:0;mso-height-percent:0;mso-width-relative:margin;mso-height-relative:margin;v-text-anchor:top" o:gfxdata="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" stroked="f">
+                <v:textbox>
+                  <w:txbxContent>
+                    <w:p>
+                      <w:pPr>
+                        <w:rPr>
+                          <w:rFonts w:hint="eastAsia"/>
+                        </w:rPr>
+                      </w:pPr>
+                      <w:r>
+                        <w:rPr>
+                          <w:rFonts w:hint="eastAsia"/>
+                          <w:lang w:eastAsia="zh-CN"/>
+                        </w:rPr>
+                        <w:t>Yes</w:t>
+                      </w:r>
+                    </w:p>
+                  </w:txbxContent>
+                </v:textbox>
+                <w10:wrap type="square"/>
+              </v:shape>
+            </w:pict>
+          </mc:Fallback>
+        </mc:AlternateContent>
+      </w:r>
     </w:p>
     <w:p>
       <w:pPr>
         <w:spacing w:line="259" w:lineRule="auto"/>
-        <w:jc w:val="both"/>
-        <w:rPr>
-          <w:color w:val="808080" w:themeColor="background1" w:themeShade="80"/>
+        <w:jc w:val="center"/>
+        <w:rPr>
+          <w:color w:val="000000" w:themeColor="text1"/>
+          <w:highlight w:val="cyan"/>
           <w:lang w:eastAsia="zh-CN"/>
         </w:rPr>
       </w:pPr>
+      <w:r>
+        <w:rPr>
+          <w:rFonts w:eastAsia="等线"/>
+          <w:noProof/>
+        </w:rPr>
+        <mc:AlternateContent>
+          <mc:Choice Requires="wps">
+            <w:drawing>
+              <wp:anchor distT="0" distB="0" distL="114300" distR="114300" simplePos="0" relativeHeight="251687936" behindDoc="1" locked="0" layoutInCell="1" allowOverlap="1" wp14:anchorId="6FAB7831" wp14:editId="0BA825C1">
+                <wp:simplePos x="0" y="0"/>
+                <wp:positionH relativeFrom="margin">
+                  <wp:posOffset>733425</wp:posOffset>
+                </wp:positionH>
+                <wp:positionV relativeFrom="paragraph">
+                  <wp:posOffset>140335</wp:posOffset>
+                </wp:positionV>
+                <wp:extent cx="4276725" cy="457200"/>
+                <wp:effectExtent l="0" t="0" r="28575" b="19050"/>
+                <wp:wrapNone/>
+                <wp:docPr id="30" name="Rectangle 30"/>
+                <wp:cNvGraphicFramePr/>
+                <a:graphic xmlns:a="http://schemas.openxmlformats.org/drawingml/2006/main">
+                  <a:graphicData uri="http://schemas.microsoft.com/office/word/2010/wordprocessingShape">
+                    <wps:wsp>
+                      <wps:cNvSpPr/>
+                      <wps:spPr>
+                        <a:xfrm>
+                          <a:off x="0" y="0"/>
+                          <a:ext cx="4276725" cy="457200"/>
+                        </a:xfrm>
+                        <a:prstGeom prst="rect">
+                          <a:avLst/>
+                        </a:prstGeom>
+                      </wps:spPr>
+                      <wps:style>
+                        <a:lnRef idx="2">
+                          <a:schemeClr val="dk1"/>
+                        </a:lnRef>
+                        <a:fillRef idx="1">
+                          <a:schemeClr val="lt1"/>
+                        </a:fillRef>
+                        <a:effectRef idx="0">
+                          <a:schemeClr val="dk1"/>
+                        </a:effectRef>
+                        <a:fontRef idx="minor">
+                          <a:schemeClr val="dk1"/>
+                        </a:fontRef>
+                      </wps:style>
+                      <wps:bodyPr rot="0" spcFirstLastPara="0" vertOverflow="overflow" horzOverflow="overflow" vert="horz" wrap="square" lIns="91440" tIns="45720" rIns="91440" bIns="45720" numCol="1" spcCol="0" rtlCol="0" fromWordArt="0" anchor="ctr" anchorCtr="0" forceAA="0" compatLnSpc="1">
+                        <a:prstTxWarp prst="textNoShape">
+                          <a:avLst/>
+                        </a:prstTxWarp>
+                        <a:noAutofit/>
+                      </wps:bodyPr>
+                    </wps:wsp>
+                  </a:graphicData>
+                </a:graphic>
+                <wp14:sizeRelH relativeFrom="margin">
+                  <wp14:pctWidth>0</wp14:pctWidth>
+                </wp14:sizeRelH>
+                <wp14:sizeRelV relativeFrom="margin">
+                  <wp14:pctHeight>0</wp14:pctHeight>
+                </wp14:sizeRelV>
+              </wp:anchor>
+            </w:drawing>
+          </mc:Choice>
+          <mc:Fallback>
+            <w:pict>
+              <v:rect w14:anchorId="1879077B" id="Rectangle 30" o:spid="_x0000_s1026" style="position:absolute;margin-left:57.75pt;margin-top:11.05pt;width:336.75pt;height:36pt;z-index:-251628544;visibility:visible;mso-wrap-style:square;mso-width-percent:0;mso-height-percent:0;mso-wrap-distance-left:9pt;mso-wrap-distance-top:0;mso-wrap-distance-right:9pt;mso-wrap-distance-bottom:0;mso-position-horizontal:absolute;mso-position-horizontal-relative:margin;mso-position-vertical:absolute;mso-position-vertical-relative:text;mso-width-percent:0;mso-height-percent:0;mso-width-relative:margin;mso-height-relative:margin;v-text-anchor:middle" o:gfxdata="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" fillcolor="white [3201]" strokecolor="black [3200]" strokeweight="1pt">
+                <w10:wrap anchorx="margin"/>
+              </v:rect>
+            </w:pict>
+          </mc:Fallback>
+        </mc:AlternateContent>
+      </w:r>
     </w:p>
     <w:p>
       <w:pPr>
         <w:spacing w:line="259" w:lineRule="auto"/>
-        <w:jc w:val="both"/>
+        <w:jc w:val="center"/>
+        <w:rPr>
+          <w:color w:val="000000" w:themeColor="text1"/>
+          <w:highlight w:val="cyan"/>
+          <w:lang w:eastAsia="zh-CN"/>
+        </w:rPr>
+      </w:pPr>
+      <w:r>
+        <w:rPr>
+          <w:rFonts w:eastAsia="等线" w:hint="eastAsia"/>
+          <w:lang w:eastAsia="zh-CN"/>
+        </w:rPr>
+        <w:t>Red</w:t>
+      </w:r>
+      <w:r>
+        <w:rPr>
+          <w:rFonts w:eastAsia="等线" w:hint="eastAsia"/>
+        </w:rPr>
+        <w:t xml:space="preserve"> LED </w:t>
+      </w:r>
+      <w:r>
+        <w:rPr>
+          <w:rFonts w:eastAsia="等线" w:hint="eastAsia"/>
+          <w:lang w:eastAsia="zh-CN"/>
+        </w:rPr>
+        <w:t>blinks every 0.25s</w:t>
+      </w:r>
+      <w:r>
+        <w:rPr>
+          <w:rFonts w:eastAsia="等线" w:hint="eastAsia"/>
+        </w:rPr>
+        <w:t xml:space="preserve"> and turn off </w:t>
+      </w:r>
+      <w:r>
+        <w:rPr>
+          <w:rFonts w:eastAsia="等线" w:hint="eastAsia"/>
+          <w:lang w:eastAsia="zh-CN"/>
+        </w:rPr>
+        <w:t>green</w:t>
+      </w:r>
+      <w:r>
+        <w:rPr>
+          <w:rFonts w:eastAsia="等线" w:hint="eastAsia"/>
+        </w:rPr>
+        <w:t xml:space="preserve"> and </w:t>
+      </w:r>
+      <w:r>
+        <w:rPr>
+          <w:rFonts w:eastAsia="等线" w:hint="eastAsia"/>
+          <w:lang w:eastAsia="zh-CN"/>
+        </w:rPr>
+        <w:t>yellow</w:t>
+      </w:r>
+      <w:r>
+        <w:rPr>
+          <w:rFonts w:eastAsia="等线" w:hint="eastAsia"/>
+        </w:rPr>
+        <w:t xml:space="preserve"> LEDs.</w:t>
+      </w:r>
+    </w:p>
+    <w:p>
+      <w:pPr>
+        <w:spacing w:line="259" w:lineRule="auto"/>
+        <w:jc w:val="center"/>
         <w:rPr>
           <w:rFonts w:hint="eastAsia"/>
           <w:color w:val="000000" w:themeColor="text1"/>
@@ -364,10 +3453,10 @@
       </w:pPr>
     </w:p>
     <w:sectPr>
-      <w:headerReference w:type="default" r:id="rId10"/>
-      <w:footerReference w:type="default" r:id="rId11"/>
-      <w:headerReference w:type="first" r:id="rId12"/>
-      <w:footerReference w:type="first" r:id="rId13"/>
+      <w:headerReference w:type="default" r:id="rId11"/>
+      <w:footerReference w:type="default" r:id="rId12"/>
+      <w:headerReference w:type="first" r:id="rId13"/>
+      <w:footerReference w:type="first" r:id="rId14"/>
       <w:pgSz w:w="11906" w:h="16838"/>
       <w:pgMar w:top="1440" w:right="1440" w:bottom="1440" w:left="1440" w:header="850" w:footer="708" w:gutter="0"/>
       <w:cols w:space="708"/>
@@ -479,7 +3568,7 @@
                 </wp:anchor>
               </w:drawing>
             </mc:Choice>
-            <mc:Fallback xmlns:w16sdtfl="http://schemas.microsoft.com/office/word/2024/wordml/sdtformatlock" xmlns:w16du="http://schemas.microsoft.com/office/word/2023/wordml/word16du">
+            <mc:Fallback xmlns:w16du="http://schemas.microsoft.com/office/word/2023/wordml/word16du" xmlns:w16sdtfl="http://schemas.microsoft.com/office/word/2024/wordml/sdtformatlock">
               <w:pict>
                 <v:line w14:anchorId="68CAF598" id="Straight Connector 4" o:spid="_x0000_s1026" style="position:absolute;z-index:251658243;visibility:visible;mso-wrap-style:square;mso-wrap-distance-left:9pt;mso-wrap-distance-top:0;mso-wrap-distance-right:9pt;mso-wrap-distance-bottom:0;mso-position-horizontal:absolute;mso-position-horizontal-relative:text;mso-position-vertical:absolute;mso-position-vertical-relative:text" from="-.75pt,-10.2pt" to="454.5pt,-10.2pt" o:gfxdata="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" strokecolor="#4472c4 [3204]" strokeweight=".5pt">
                   <v:stroke joinstyle="miter"/>
@@ -516,7 +3605,6 @@
     <w:pPr>
       <w:pStyle w:val="Footer"/>
       <w:rPr>
-        <w:rFonts w:hint="eastAsia"/>
         <w:i/>
         <w:iCs/>
         <w:sz w:val="18"/>
@@ -697,7 +3785,7 @@
               <v:stroke joinstyle="miter"/>
               <v:path gradientshapeok="t" o:connecttype="rect"/>
             </v:shapetype>
-            <v:shape id="Text Box 15" o:spid="_x0000_s1026" type="#_x0000_t202" style="position:absolute;margin-left:302.75pt;margin-top:-36.05pt;width:215.5pt;height:37pt;z-index:251658241;visibility:visible;mso-wrap-style:square;mso-width-percent:0;mso-height-percent:0;mso-wrap-distance-left:9pt;mso-wrap-distance-top:0;mso-wrap-distance-right:9pt;mso-wrap-distance-bottom:0;mso-position-horizontal:absolute;mso-position-horizontal-relative:text;mso-position-vertical:absolute;mso-position-vertical-relative:text;mso-width-percent:0;mso-height-percent:0;mso-width-relative:margin;mso-height-relative:margin;v-text-anchor:top" o:gfxdata="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" fillcolor="white [3201]" stroked="f" strokeweight=".5pt">
+            <v:shape id="Text Box 15" o:spid="_x0000_s1031" type="#_x0000_t202" style="position:absolute;margin-left:302.75pt;margin-top:-36.05pt;width:215.5pt;height:37pt;z-index:251658241;visibility:visible;mso-wrap-style:square;mso-width-percent:0;mso-height-percent:0;mso-wrap-distance-left:9pt;mso-wrap-distance-top:0;mso-wrap-distance-right:9pt;mso-wrap-distance-bottom:0;mso-position-horizontal:absolute;mso-position-horizontal-relative:text;mso-position-vertical:absolute;mso-position-vertical-relative:text;mso-width-percent:0;mso-height-percent:0;mso-width-relative:margin;mso-height-relative:margin;v-text-anchor:top" o:gfxdata="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" fillcolor="white [3201]" stroked="f" strokeweight=".5pt">
               <v:textbox>
                 <w:txbxContent>
                   <w:p>
@@ -1945,7 +5033,6 @@
     <w:name w:val="Normal (Web)"/>
     <w:basedOn w:val="Normal"/>
     <w:uiPriority w:val="99"/>
-    <w:semiHidden/>
     <w:unhideWhenUsed/>
     <w:rsid w:val="00985133"/>
     <w:pPr>

</xml_diff>

<commit_message>
Task 2 i complete
</commit_message>
<xml_diff>
--- a/MATLAB Coursework 2  Word Template.docx
+++ b/MATLAB Coursework 2  Word Template.docx
@@ -2,7 +2,10 @@
 <file path=word/document.xml><?xml version="1.0" encoding="utf-8"?>
 <w:document xmlns:wpc="http://schemas.microsoft.com/office/word/2010/wordprocessingCanvas" xmlns:cx="http://schemas.microsoft.com/office/drawing/2014/chartex" xmlns:cx1="http://schemas.microsoft.com/office/drawing/2015/9/8/chartex" xmlns:cx2="http://schemas.microsoft.com/office/drawing/2015/10/21/chartex" xmlns:cx3="http://schemas.microsoft.com/office/drawing/2016/5/9/chartex" xmlns:cx4="http://schemas.microsoft.com/office/drawing/2016/5/10/chartex" xmlns:cx5="http://schemas.microsoft.com/office/drawing/2016/5/11/chartex" xmlns:cx6="http://schemas.microsoft.com/office/drawing/2016/5/12/chartex" xmlns:cx7="http://schemas.microsoft.com/office/drawing/2016/5/13/chartex" xmlns:cx8="http://schemas.microsoft.com/office/drawing/2016/5/14/chartex" xmlns:mc="http://schemas.openxmlformats.org/markup-compatibility/2006" xmlns:aink="http://schemas.microsoft.com/office/drawing/2016/ink" xmlns:am3d="http://schemas.microsoft.com/office/drawing/2017/model3d" xmlns:o="urn:schemas-microsoft-com:office:office" xmlns:oel="http://schemas.microsoft.com/office/2019/extlst" xmlns:r="http://schemas.openxmlformats.org/officeDocument/2006/relationships" xmlns:m="http://schemas.openxmlformats.org/officeDocument/2006/math" xmlns:v="urn:schemas-microsoft-com:vml" xmlns:wp14="http://schemas.microsoft.com/office/word/2010/wordprocessingDrawing" xmlns:wp="http://schemas.openxmlformats.org/drawingml/2006/wordprocessingDrawing" xmlns:w10="urn:schemas-microsoft-com:office:word" xmlns:w="http://schemas.openxmlformats.org/wordprocessingml/2006/main" xmlns:w14="http://schemas.microsoft.com/office/word/2010/wordml" xmlns:w15="http://schemas.microsoft.com/office/word/2012/wordml" xmlns:w16cex="http://schemas.microsoft.com/office/word/2018/wordml/cex" xmlns:w16cid="http://schemas.microsoft.com/office/word/2016/wordml/cid" xmlns:w16="http://schemas.microsoft.com/office/word/2018/wordml" xmlns:w16sdtdh="http://schemas.microsoft.com/office/word/2020/wordml/sdtdatahash" xmlns:w16se="http://schemas.microsoft.com/office/word/2015/wordml/symex" xmlns:wpg="http://schemas.microsoft.com/office/word/2010/wordprocessingGroup" xmlns:wpi="http://schemas.microsoft.com/office/word/2010/wordprocessingInk" xmlns:wne="http://schemas.microsoft.com/office/word/2006/wordml" xmlns:wps="http://schemas.microsoft.com/office/word/2010/wordprocessingShape" mc:Ignorable="w14 w15 w16se w16cid w16 w16cex w16sdtdh wp14">
   <w:body>
-    <w:p/>
+    <w:p>
+      <w:bookmarkStart w:id="0" w:name="_Hlk228215276"/>
+      <w:bookmarkEnd w:id="0"/>
+    </w:p>
     <w:p/>
     <w:p/>
     <w:p/>
@@ -418,25 +421,20 @@
     <w:p>
       <w:pPr>
         <w:spacing w:line="259" w:lineRule="auto"/>
-        <w:rPr>
-          <w:rFonts w:ascii="Times New Roman" w:hAnsi="Times New Roman" w:cs="Times New Roman"/>
-          <w:sz w:val="24"/>
-          <w:szCs w:val="24"/>
+        <w:jc w:val="center"/>
+        <w:rPr>
           <w:lang w:val="en-US"/>
         </w:rPr>
       </w:pPr>
       <w:r>
         <w:rPr>
-          <w:rFonts w:ascii="Times New Roman" w:hAnsi="Times New Roman" w:cs="Times New Roman"/>
-          <w:sz w:val="24"/>
-          <w:szCs w:val="24"/>
           <w:lang w:val="en-US"/>
         </w:rPr>
         <w:drawing>
-          <wp:inline distT="0" distB="0" distL="0" distR="0" wp14:anchorId="2A87B8BD" wp14:editId="73249762">
-            <wp:extent cx="5731510" cy="4300855"/>
-            <wp:effectExtent l="0" t="0" r="2540" b="4445"/>
-            <wp:docPr id="46" name="Picture 46"/>
+          <wp:inline distT="0" distB="0" distL="0" distR="0" wp14:anchorId="407D3AC2" wp14:editId="1342A6AE">
+            <wp:extent cx="5006202" cy="6675120"/>
+            <wp:effectExtent l="0" t="0" r="4445" b="0"/>
+            <wp:docPr id="54" name="Picture 54"/>
             <wp:cNvGraphicFramePr>
               <a:graphicFrameLocks xmlns:a="http://schemas.openxmlformats.org/drawingml/2006/main" noChangeAspect="1"/>
             </wp:cNvGraphicFramePr>
@@ -444,7 +442,7 @@
               <a:graphicData uri="http://schemas.openxmlformats.org/drawingml/2006/picture">
                 <pic:pic xmlns:pic="http://schemas.openxmlformats.org/drawingml/2006/picture">
                   <pic:nvPicPr>
-                    <pic:cNvPr id="0" name="Picture 6"/>
+                    <pic:cNvPr id="0" name="Picture 13"/>
                     <pic:cNvPicPr>
                       <a:picLocks noChangeAspect="1" noChangeArrowheads="1"/>
                     </pic:cNvPicPr>
@@ -465,7 +463,7 @@
                   <pic:spPr bwMode="auto">
                     <a:xfrm>
                       <a:off x="0" y="0"/>
-                      <a:ext cx="5731510" cy="4300855"/>
+                      <a:ext cx="5006202" cy="6675120"/>
                     </a:xfrm>
                     <a:prstGeom prst="rect">
                       <a:avLst/>
@@ -481,6 +479,14 @@
           </wp:inline>
         </w:drawing>
       </w:r>
+      <w:r>
+        <w:rPr>
+          <w:rFonts w:ascii="Times New Roman" w:hAnsi="Times New Roman" w:cs="Times New Roman"/>
+          <w:sz w:val="24"/>
+          <w:szCs w:val="24"/>
+        </w:rPr>
+        <w:br w:type="page"/>
+      </w:r>
     </w:p>
     <w:p>
       <w:pPr>
@@ -492,14 +498,6 @@
           <w:lang w:val="en-US" w:eastAsia="zh-CN"/>
         </w:rPr>
       </w:pPr>
-      <w:r>
-        <w:rPr>
-          <w:rFonts w:ascii="Times New Roman" w:hAnsi="Times New Roman" w:cs="Times New Roman"/>
-          <w:sz w:val="24"/>
-          <w:szCs w:val="24"/>
-        </w:rPr>
-        <w:br w:type="page"/>
-      </w:r>
     </w:p>
     <w:p>
       <w:pPr>
@@ -522,7 +520,6 @@
           <w:szCs w:val="32"/>
           <w:lang w:eastAsia="zh-CN"/>
         </w:rPr>
-        <w:lastRenderedPageBreak/>
         <mc:AlternateContent>
           <mc:Choice Requires="wps">
             <w:drawing>
@@ -586,7 +583,7 @@
           </mc:Choice>
           <mc:Fallback>
             <w:pict>
-              <v:rect w14:anchorId="3F77BC8D" id="Rectangle 2" o:spid="_x0000_s1026" style="position:absolute;margin-left:183.75pt;margin-top:22.9pt;width:82.5pt;height:27pt;z-index:-251657216;visibility:visible;mso-wrap-style:square;mso-width-percent:0;mso-height-percent:0;mso-wrap-distance-left:9pt;mso-wrap-distance-top:0;mso-wrap-distance-right:9pt;mso-wrap-distance-bottom:0;mso-position-horizontal:absolute;mso-position-horizontal-relative:margin;mso-position-vertical:absolute;mso-position-vertical-relative:text;mso-width-percent:0;mso-height-percent:0;mso-width-relative:margin;mso-height-relative:margin;v-text-anchor:middle" o:gfxdata="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" fillcolor="white [3201]" strokecolor="black [3200]" strokeweight="1pt">
+              <v:rect w14:anchorId="10FDC678" id="Rectangle 2" o:spid="_x0000_s1026" style="position:absolute;margin-left:183.75pt;margin-top:22.9pt;width:82.5pt;height:27pt;z-index:-251657216;visibility:visible;mso-wrap-style:square;mso-width-percent:0;mso-height-percent:0;mso-wrap-distance-left:9pt;mso-wrap-distance-top:0;mso-wrap-distance-right:9pt;mso-wrap-distance-bottom:0;mso-position-horizontal:absolute;mso-position-horizontal-relative:margin;mso-position-vertical:absolute;mso-position-vertical-relative:text;mso-width-percent:0;mso-height-percent:0;mso-width-relative:margin;mso-height-relative:margin;v-text-anchor:middle" o:gfxdata="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" fillcolor="white [3201]" strokecolor="black [3200]" strokeweight="1pt">
                 <w10:wrap anchorx="margin"/>
               </v:rect>
             </w:pict>
@@ -713,7 +710,7 @@
           </mc:Choice>
           <mc:Fallback>
             <w:pict>
-              <v:shapetype w14:anchorId="7A8FF69E" id="_x0000_t32" coordsize="21600,21600" o:spt="32" o:oned="t" path="m,l21600,21600e" filled="f">
+              <v:shapetype w14:anchorId="2F78A0CF" id="_x0000_t32" coordsize="21600,21600" o:spt="32" o:oned="t" path="m,l21600,21600e" filled="f">
                 <v:path arrowok="t" fillok="f" o:connecttype="none"/>
                 <o:lock v:ext="edit" shapetype="t"/>
               </v:shapetype>
@@ -815,7 +812,7 @@
           </mc:Choice>
           <mc:Fallback>
             <w:pict>
-              <v:rect w14:anchorId="5B0F0A83" id="Rectangle 6" o:spid="_x0000_s1026" style="position:absolute;margin-left:13.5pt;margin-top:22.45pt;width:426pt;height:36pt;z-index:-251656192;visibility:visible;mso-wrap-style:square;mso-width-percent:0;mso-height-percent:0;mso-wrap-distance-left:9pt;mso-wrap-distance-top:0;mso-wrap-distance-right:9pt;mso-wrap-distance-bottom:0;mso-position-horizontal:absolute;mso-position-horizontal-relative:margin;mso-position-vertical:absolute;mso-position-vertical-relative:text;mso-width-percent:0;mso-height-percent:0;mso-width-relative:margin;mso-height-relative:margin;v-text-anchor:middle" o:gfxdata="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" fillcolor="white [3201]" strokecolor="black [3200]" strokeweight="1pt">
+              <v:rect w14:anchorId="36114E4E" id="Rectangle 6" o:spid="_x0000_s1026" style="position:absolute;margin-left:13.5pt;margin-top:22.45pt;width:426pt;height:36pt;z-index:-251656192;visibility:visible;mso-wrap-style:square;mso-width-percent:0;mso-height-percent:0;mso-wrap-distance-left:9pt;mso-wrap-distance-top:0;mso-wrap-distance-right:9pt;mso-wrap-distance-bottom:0;mso-position-horizontal:absolute;mso-position-horizontal-relative:margin;mso-position-vertical:absolute;mso-position-vertical-relative:text;mso-width-percent:0;mso-height-percent:0;mso-width-relative:margin;mso-height-relative:margin;v-text-anchor:middle" o:gfxdata="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" fillcolor="white [3201]" strokecolor="black [3200]" strokeweight="1pt">
                 <w10:wrap anchorx="margin"/>
               </v:rect>
             </w:pict>
@@ -897,7 +894,7 @@
           </mc:Choice>
           <mc:Fallback>
             <w:pict>
-              <v:shape w14:anchorId="4D0E2866" id="Straight Arrow Connector 20" o:spid="_x0000_s1026" type="#_x0000_t32" style="position:absolute;margin-left:225pt;margin-top:32pt;width:.25pt;height:16.55pt;z-index:251669504;visibility:visible;mso-wrap-style:square;mso-width-percent:0;mso-height-percent:0;mso-wrap-distance-left:9pt;mso-wrap-distance-top:0;mso-wrap-distance-right:9pt;mso-wrap-distance-bottom:0;mso-position-horizontal:absolute;mso-position-horizontal-relative:text;mso-position-vertical:absolute;mso-position-vertical-relative:text;mso-width-percent:0;mso-height-percent:0;mso-width-relative:margin;mso-height-relative:margin" o:gfxdata="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" strokecolor="black [3200]" strokeweight=".5pt">
+              <v:shape w14:anchorId="5668F478" id="Straight Arrow Connector 20" o:spid="_x0000_s1026" type="#_x0000_t32" style="position:absolute;margin-left:225pt;margin-top:32pt;width:.25pt;height:16.55pt;z-index:251669504;visibility:visible;mso-wrap-style:square;mso-width-percent:0;mso-height-percent:0;mso-wrap-distance-left:9pt;mso-wrap-distance-top:0;mso-wrap-distance-right:9pt;mso-wrap-distance-bottom:0;mso-position-horizontal:absolute;mso-position-horizontal-relative:text;mso-position-vertical:absolute;mso-position-vertical-relative:text;mso-width-percent:0;mso-height-percent:0;mso-width-relative:margin;mso-height-relative:margin" o:gfxdata="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" strokecolor="black [3200]" strokeweight=".5pt">
                 <v:stroke endarrow="block" joinstyle="miter"/>
               </v:shape>
             </w:pict>
@@ -987,7 +984,7 @@
           </mc:Choice>
           <mc:Fallback>
             <w:pict>
-              <v:rect w14:anchorId="69A88558" id="Rectangle 8" o:spid="_x0000_s1026" style="position:absolute;margin-left:47.15pt;margin-top:14.8pt;width:354.75pt;height:36pt;z-index:-251654144;visibility:visible;mso-wrap-style:square;mso-width-percent:0;mso-height-percent:0;mso-wrap-distance-left:9pt;mso-wrap-distance-top:0;mso-wrap-distance-right:9pt;mso-wrap-distance-bottom:0;mso-position-horizontal:absolute;mso-position-horizontal-relative:margin;mso-position-vertical:absolute;mso-position-vertical-relative:text;mso-width-percent:0;mso-height-percent:0;mso-width-relative:margin;mso-height-relative:margin;v-text-anchor:middle" o:gfxdata="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" fillcolor="white [3201]" strokecolor="black [3200]" strokeweight="1pt">
+              <v:rect w14:anchorId="76241CAD" id="Rectangle 8" o:spid="_x0000_s1026" style="position:absolute;margin-left:47.15pt;margin-top:14.8pt;width:354.75pt;height:36pt;z-index:-251654144;visibility:visible;mso-wrap-style:square;mso-width-percent:0;mso-height-percent:0;mso-wrap-distance-left:9pt;mso-wrap-distance-top:0;mso-wrap-distance-right:9pt;mso-wrap-distance-bottom:0;mso-position-horizontal:absolute;mso-position-horizontal-relative:margin;mso-position-vertical:absolute;mso-position-vertical-relative:text;mso-width-percent:0;mso-height-percent:0;mso-width-relative:margin;mso-height-relative:margin;v-text-anchor:middle" o:gfxdata="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" fillcolor="white [3201]" strokecolor="black [3200]" strokeweight="1pt">
                 <w10:wrap anchorx="margin"/>
               </v:rect>
             </w:pict>
@@ -1069,7 +1066,7 @@
           </mc:Choice>
           <mc:Fallback>
             <w:pict>
-              <v:shape w14:anchorId="6BFC2C5A" id="Straight Arrow Connector 21" o:spid="_x0000_s1026" type="#_x0000_t32" style="position:absolute;margin-left:225.15pt;margin-top:22.65pt;width:.25pt;height:20.9pt;z-index:251671552;visibility:visible;mso-wrap-style:square;mso-width-percent:0;mso-height-percent:0;mso-wrap-distance-left:9pt;mso-wrap-distance-top:0;mso-wrap-distance-right:9pt;mso-wrap-distance-bottom:0;mso-position-horizontal:absolute;mso-position-horizontal-relative:text;mso-position-vertical:absolute;mso-position-vertical-relative:text;mso-width-percent:0;mso-height-percent:0;mso-width-relative:margin;mso-height-relative:margin" o:gfxdata="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" strokecolor="black [3200]" strokeweight=".5pt">
+              <v:shape w14:anchorId="044651C7" id="Straight Arrow Connector 21" o:spid="_x0000_s1026" type="#_x0000_t32" style="position:absolute;margin-left:225.15pt;margin-top:22.65pt;width:.25pt;height:20.9pt;z-index:251671552;visibility:visible;mso-wrap-style:square;mso-width-percent:0;mso-height-percent:0;mso-wrap-distance-left:9pt;mso-wrap-distance-top:0;mso-wrap-distance-right:9pt;mso-wrap-distance-bottom:0;mso-position-horizontal:absolute;mso-position-horizontal-relative:text;mso-position-vertical:absolute;mso-position-vertical-relative:text;mso-width-percent:0;mso-height-percent:0;mso-width-relative:margin;mso-height-relative:margin" o:gfxdata="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" strokecolor="black [3200]" strokeweight=".5pt">
                 <v:stroke endarrow="block" joinstyle="miter"/>
               </v:shape>
             </w:pict>
@@ -1156,7 +1153,7 @@
           </mc:Choice>
           <mc:Fallback>
             <w:pict>
-              <v:rect w14:anchorId="396FD291" id="Rectangle 49" o:spid="_x0000_s1026" style="position:absolute;margin-left:149.25pt;margin-top:15.95pt;width:150pt;height:36pt;z-index:-251604992;visibility:visible;mso-wrap-style:square;mso-height-percent:0;mso-wrap-distance-left:9pt;mso-wrap-distance-top:0;mso-wrap-distance-right:9pt;mso-wrap-distance-bottom:0;mso-position-horizontal:absolute;mso-position-horizontal-relative:margin;mso-position-vertical:absolute;mso-position-vertical-relative:text;mso-height-percent:0;mso-height-relative:margin;v-text-anchor:middle" o:gfxdata="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" fillcolor="white [3201]" strokecolor="black [3200]" strokeweight="1pt">
+              <v:rect w14:anchorId="714D1393" id="Rectangle 49" o:spid="_x0000_s1026" style="position:absolute;margin-left:149.25pt;margin-top:15.95pt;width:150pt;height:36pt;z-index:-251604992;visibility:visible;mso-wrap-style:square;mso-height-percent:0;mso-wrap-distance-left:9pt;mso-wrap-distance-top:0;mso-wrap-distance-right:9pt;mso-wrap-distance-bottom:0;mso-position-horizontal:absolute;mso-position-horizontal-relative:margin;mso-position-vertical:absolute;mso-position-vertical-relative:text;mso-height-percent:0;mso-height-relative:margin;v-text-anchor:middle" o:gfxdata="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" fillcolor="white [3201]" strokecolor="black [3200]" strokeweight="1pt">
                 <w10:wrap anchorx="margin"/>
               </v:rect>
             </w:pict>
@@ -1238,7 +1235,7 @@
           </mc:Choice>
           <mc:Fallback>
             <w:pict>
-              <v:shape w14:anchorId="63013B99" id="Straight Arrow Connector 50" o:spid="_x0000_s1026" type="#_x0000_t32" style="position:absolute;margin-left:225.75pt;margin-top:22.2pt;width:.25pt;height:20.9pt;z-index:-251606017;visibility:visible;mso-wrap-style:square;mso-width-percent:0;mso-height-percent:0;mso-wrap-distance-left:9pt;mso-wrap-distance-top:0;mso-wrap-distance-right:9pt;mso-wrap-distance-bottom:0;mso-position-horizontal:absolute;mso-position-horizontal-relative:text;mso-position-vertical:absolute;mso-position-vertical-relative:text;mso-width-percent:0;mso-height-percent:0;mso-width-relative:margin;mso-height-relative:margin" o:gfxdata="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" strokecolor="black [3200]" strokeweight=".5pt">
+              <v:shape w14:anchorId="7BCF15CF" id="Straight Arrow Connector 50" o:spid="_x0000_s1026" type="#_x0000_t32" style="position:absolute;margin-left:225.75pt;margin-top:22.2pt;width:.25pt;height:20.9pt;z-index:-251606017;visibility:visible;mso-wrap-style:square;mso-width-percent:0;mso-height-percent:0;mso-wrap-distance-left:9pt;mso-wrap-distance-top:0;mso-wrap-distance-right:9pt;mso-wrap-distance-bottom:0;mso-position-horizontal:absolute;mso-position-horizontal-relative:text;mso-position-vertical:absolute;mso-position-vertical-relative:text;mso-width-percent:0;mso-height-percent:0;mso-width-relative:margin;mso-height-relative:margin" o:gfxdata="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" strokecolor="black [3200]" strokeweight=".5pt">
                 <v:stroke endarrow="block" joinstyle="miter"/>
               </v:shape>
             </w:pict>
@@ -1328,7 +1325,7 @@
           </mc:Choice>
           <mc:Fallback>
             <w:pict>
-              <v:shapetype w14:anchorId="02C6199B" id="_x0000_t34" coordsize="21600,21600" o:spt="34" o:oned="t" adj="10800" path="m,l@0,0@0,21600,21600,21600e" filled="f">
+              <v:shapetype w14:anchorId="72D4ECAD" id="_x0000_t34" coordsize="21600,21600" o:spt="34" o:oned="t" adj="10800" path="m,l@0,0@0,21600,21600,21600e" filled="f">
                 <v:stroke joinstyle="miter"/>
                 <v:formulas>
                   <v:f eqn="val #0"/>
@@ -1411,7 +1408,7 @@
           </mc:Choice>
           <mc:Fallback>
             <w:pict>
-              <v:rect w14:anchorId="217FD96D" id="Rectangle 9" o:spid="_x0000_s1026" style="position:absolute;margin-left:149.9pt;margin-top:15.35pt;width:150pt;height:36pt;z-index:-251653120;visibility:visible;mso-wrap-style:square;mso-height-percent:0;mso-wrap-distance-left:9pt;mso-wrap-distance-top:0;mso-wrap-distance-right:9pt;mso-wrap-distance-bottom:0;mso-position-horizontal:absolute;mso-position-horizontal-relative:margin;mso-position-vertical:absolute;mso-position-vertical-relative:text;mso-height-percent:0;mso-height-relative:margin;v-text-anchor:middle" o:gfxdata="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" fillcolor="white [3201]" strokecolor="black [3200]" strokeweight="1pt">
+              <v:rect w14:anchorId="7C69EAD8" id="Rectangle 9" o:spid="_x0000_s1026" style="position:absolute;margin-left:149.9pt;margin-top:15.35pt;width:150pt;height:36pt;z-index:-251653120;visibility:visible;mso-wrap-style:square;mso-height-percent:0;mso-wrap-distance-left:9pt;mso-wrap-distance-top:0;mso-wrap-distance-right:9pt;mso-wrap-distance-bottom:0;mso-position-horizontal:absolute;mso-position-horizontal-relative:margin;mso-position-vertical:absolute;mso-position-vertical-relative:text;mso-height-percent:0;mso-height-relative:margin;v-text-anchor:middle" o:gfxdata="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" fillcolor="white [3201]" strokecolor="black [3200]" strokeweight="1pt">
                 <w10:wrap anchorx="margin"/>
               </v:rect>
             </w:pict>
@@ -1496,7 +1493,7 @@
           </mc:Choice>
           <mc:Fallback>
             <w:pict>
-              <v:shape w14:anchorId="0B30D41E" id="Connector: Elbow 36" o:spid="_x0000_s1026" type="#_x0000_t34" style="position:absolute;margin-left:300pt;margin-top:6.35pt;width:94.3pt;height:279pt;flip:x y;z-index:251696128;visibility:visible;mso-wrap-style:square;mso-width-percent:0;mso-height-percent:0;mso-wrap-distance-left:9pt;mso-wrap-distance-top:0;mso-wrap-distance-right:9pt;mso-wrap-distance-bottom:0;mso-position-horizontal:absolute;mso-position-horizontal-relative:text;mso-position-vertical:absolute;mso-position-vertical-relative:text;mso-width-percent:0;mso-height-percent:0;mso-width-relative:margin;mso-height-relative:margin" o:gfxdata="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" adj="-10674" strokecolor="black [3200]" strokeweight=".5pt">
+              <v:shape w14:anchorId="23CC0F5C" id="Connector: Elbow 36" o:spid="_x0000_s1026" type="#_x0000_t34" style="position:absolute;margin-left:300pt;margin-top:6.35pt;width:94.3pt;height:279pt;flip:x y;z-index:251696128;visibility:visible;mso-wrap-style:square;mso-width-percent:0;mso-height-percent:0;mso-wrap-distance-left:9pt;mso-wrap-distance-top:0;mso-wrap-distance-right:9pt;mso-wrap-distance-bottom:0;mso-position-horizontal:absolute;mso-position-horizontal-relative:text;mso-position-vertical:absolute;mso-position-vertical-relative:text;mso-width-percent:0;mso-height-percent:0;mso-width-relative:margin;mso-height-relative:margin" o:gfxdata="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" adj="-10674" strokecolor="black [3200]" strokeweight=".5pt">
                 <v:stroke endarrow="block"/>
               </v:shape>
             </w:pict>
@@ -1572,7 +1569,7 @@
           </mc:Choice>
           <mc:Fallback>
             <w:pict>
-              <v:shape w14:anchorId="35E9E007" id="Connector: Elbow 35" o:spid="_x0000_s1026" type="#_x0000_t34" style="position:absolute;margin-left:57pt;margin-top:6.35pt;width:93pt;height:135pt;flip:y;z-index:251695104;visibility:visible;mso-wrap-style:square;mso-width-percent:0;mso-height-percent:0;mso-wrap-distance-left:9pt;mso-wrap-distance-top:0;mso-wrap-distance-right:9pt;mso-wrap-distance-bottom:0;mso-position-horizontal:absolute;mso-position-horizontal-relative:text;mso-position-vertical:absolute;mso-position-vertical-relative:text;mso-width-percent:0;mso-height-percent:0;mso-width-relative:margin;mso-height-relative:margin" o:gfxdata="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" adj="-6794" strokecolor="black [3200]" strokeweight=".5pt">
+              <v:shape w14:anchorId="61CFEFF6" id="Connector: Elbow 35" o:spid="_x0000_s1026" type="#_x0000_t34" style="position:absolute;margin-left:57pt;margin-top:6.35pt;width:93pt;height:135pt;flip:y;z-index:251695104;visibility:visible;mso-wrap-style:square;mso-width-percent:0;mso-height-percent:0;mso-wrap-distance-left:9pt;mso-wrap-distance-top:0;mso-wrap-distance-right:9pt;mso-wrap-distance-bottom:0;mso-position-horizontal:absolute;mso-position-horizontal-relative:text;mso-position-vertical:absolute;mso-position-vertical-relative:text;mso-width-percent:0;mso-height-percent:0;mso-width-relative:margin;mso-height-relative:margin" o:gfxdata="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" adj="-6794" strokecolor="black [3200]" strokeweight=".5pt">
                 <v:stroke endarrow="block"/>
               </v:shape>
             </w:pict>
@@ -1645,7 +1642,7 @@
           </mc:Choice>
           <mc:Fallback>
             <w:pict>
-              <v:shape w14:anchorId="35D813B1" id="Straight Arrow Connector 22" o:spid="_x0000_s1026" type="#_x0000_t32" style="position:absolute;margin-left:225.2pt;margin-top:23.8pt;width:.25pt;height:20.15pt;z-index:251673600;visibility:visible;mso-wrap-style:square;mso-width-percent:0;mso-height-percent:0;mso-wrap-distance-left:9pt;mso-wrap-distance-top:0;mso-wrap-distance-right:9pt;mso-wrap-distance-bottom:0;mso-position-horizontal:absolute;mso-position-horizontal-relative:text;mso-position-vertical:absolute;mso-position-vertical-relative:text;mso-width-percent:0;mso-height-percent:0;mso-width-relative:margin;mso-height-relative:margin" o:gfxdata="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" strokecolor="black [3200]" strokeweight=".5pt">
+              <v:shape w14:anchorId="37A3F097" id="Straight Arrow Connector 22" o:spid="_x0000_s1026" type="#_x0000_t32" style="position:absolute;margin-left:225.2pt;margin-top:23.8pt;width:.25pt;height:20.15pt;z-index:251673600;visibility:visible;mso-wrap-style:square;mso-width-percent:0;mso-height-percent:0;mso-wrap-distance-left:9pt;mso-wrap-distance-top:0;mso-wrap-distance-right:9pt;mso-wrap-distance-bottom:0;mso-position-horizontal:absolute;mso-position-horizontal-relative:text;mso-position-vertical:absolute;mso-position-vertical-relative:text;mso-width-percent:0;mso-height-percent:0;mso-width-relative:margin;mso-height-relative:margin" o:gfxdata="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" strokecolor="black [3200]" strokeweight=".5pt">
                 <v:stroke endarrow="block" joinstyle="miter"/>
               </v:shape>
             </w:pict>
@@ -1844,7 +1841,7 @@
           </mc:Choice>
           <mc:Fallback>
             <w:pict>
-              <v:shapetype w14:anchorId="536650A0" id="_x0000_t4" coordsize="21600,21600" o:spt="4" path="m10800,l,10800,10800,21600,21600,10800xe">
+              <v:shapetype w14:anchorId="484C2F36" id="_x0000_t4" coordsize="21600,21600" o:spt="4" path="m10800,l,10800,10800,21600,21600,10800xe">
                 <v:stroke joinstyle="miter"/>
                 <v:path gradientshapeok="t" o:connecttype="rect" textboxrect="5400,5400,16200,16200"/>
               </v:shapetype>
@@ -1873,7 +1870,82 @@
         <mc:AlternateContent>
           <mc:Choice Requires="wps">
             <w:drawing>
-              <wp:anchor distT="0" distB="0" distL="114300" distR="114300" simplePos="0" relativeHeight="251678720" behindDoc="0" locked="0" layoutInCell="1" allowOverlap="1" wp14:anchorId="29402DB1" wp14:editId="1ABAEFBE">
+              <wp:anchor distT="0" distB="0" distL="114300" distR="114300" simplePos="0" relativeHeight="251693056" behindDoc="0" locked="0" layoutInCell="1" allowOverlap="1" wp14:anchorId="779F4F54" wp14:editId="7138578A">
+                <wp:simplePos x="0" y="0"/>
+                <wp:positionH relativeFrom="column">
+                  <wp:posOffset>4801376</wp:posOffset>
+                </wp:positionH>
+                <wp:positionV relativeFrom="paragraph">
+                  <wp:posOffset>55668</wp:posOffset>
+                </wp:positionV>
+                <wp:extent cx="45719" cy="1806011"/>
+                <wp:effectExtent l="38100" t="0" r="545465" b="99060"/>
+                <wp:wrapNone/>
+                <wp:docPr id="33" name="Connector: Elbow 33"/>
+                <wp:cNvGraphicFramePr/>
+                <a:graphic xmlns:a="http://schemas.openxmlformats.org/drawingml/2006/main">
+                  <a:graphicData uri="http://schemas.microsoft.com/office/word/2010/wordprocessingShape">
+                    <wps:wsp>
+                      <wps:cNvCnPr/>
+                      <wps:spPr>
+                        <a:xfrm flipH="1">
+                          <a:off x="0" y="0"/>
+                          <a:ext cx="45719" cy="1806011"/>
+                        </a:xfrm>
+                        <a:prstGeom prst="bentConnector3">
+                          <a:avLst>
+                            <a:gd name="adj1" fmla="val -1139909"/>
+                          </a:avLst>
+                        </a:prstGeom>
+                        <a:ln>
+                          <a:tailEnd type="triangle"/>
+                        </a:ln>
+                      </wps:spPr>
+                      <wps:style>
+                        <a:lnRef idx="1">
+                          <a:schemeClr val="dk1"/>
+                        </a:lnRef>
+                        <a:fillRef idx="0">
+                          <a:schemeClr val="dk1"/>
+                        </a:fillRef>
+                        <a:effectRef idx="0">
+                          <a:schemeClr val="dk1"/>
+                        </a:effectRef>
+                        <a:fontRef idx="minor">
+                          <a:schemeClr val="tx1"/>
+                        </a:fontRef>
+                      </wps:style>
+                      <wps:bodyPr/>
+                    </wps:wsp>
+                  </a:graphicData>
+                </a:graphic>
+                <wp14:sizeRelH relativeFrom="margin">
+                  <wp14:pctWidth>0</wp14:pctWidth>
+                </wp14:sizeRelH>
+                <wp14:sizeRelV relativeFrom="margin">
+                  <wp14:pctHeight>0</wp14:pctHeight>
+                </wp14:sizeRelV>
+              </wp:anchor>
+            </w:drawing>
+          </mc:Choice>
+          <mc:Fallback>
+            <w:pict>
+              <v:shape w14:anchorId="0BC24D52" id="Connector: Elbow 33" o:spid="_x0000_s1026" type="#_x0000_t34" style="position:absolute;margin-left:378.05pt;margin-top:4.4pt;width:3.6pt;height:142.2pt;flip:x;z-index:251693056;visibility:visible;mso-wrap-style:square;mso-width-percent:0;mso-height-percent:0;mso-wrap-distance-left:9pt;mso-wrap-distance-top:0;mso-wrap-distance-right:9pt;mso-wrap-distance-bottom:0;mso-position-horizontal:absolute;mso-position-horizontal-relative:text;mso-position-vertical:absolute;mso-position-vertical-relative:text;mso-width-percent:0;mso-height-percent:0;mso-width-relative:margin;mso-height-relative:margin" o:gfxdata="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" adj="-246220" strokecolor="black [3200]" strokeweight=".5pt">
+                <v:stroke endarrow="block"/>
+              </v:shape>
+            </w:pict>
+          </mc:Fallback>
+        </mc:AlternateContent>
+      </w:r>
+      <w:r>
+        <w:rPr>
+          <w:rFonts w:eastAsia="等线" w:hint="eastAsia"/>
+          <w:noProof/>
+        </w:rPr>
+        <mc:AlternateContent>
+          <mc:Choice Requires="wps">
+            <w:drawing>
+              <wp:anchor distT="0" distB="0" distL="114300" distR="114300" simplePos="0" relativeHeight="251678720" behindDoc="0" locked="0" layoutInCell="1" allowOverlap="1" wp14:anchorId="29402DB1" wp14:editId="63B57762">
                 <wp:simplePos x="0" y="0"/>
                 <wp:positionH relativeFrom="column">
                   <wp:posOffset>2856155</wp:posOffset>
@@ -1931,83 +2003,8 @@
           </mc:Choice>
           <mc:Fallback>
             <w:pict>
-              <v:shape w14:anchorId="3F831317" id="Straight Arrow Connector 23" o:spid="_x0000_s1026" type="#_x0000_t32" style="position:absolute;margin-left:224.9pt;margin-top:25.2pt;width:.2pt;height:44.65pt;z-index:251678720;visibility:visible;mso-wrap-style:square;mso-width-percent:0;mso-height-percent:0;mso-wrap-distance-left:9pt;mso-wrap-distance-top:0;mso-wrap-distance-right:9pt;mso-wrap-distance-bottom:0;mso-position-horizontal:absolute;mso-position-horizontal-relative:text;mso-position-vertical:absolute;mso-position-vertical-relative:text;mso-width-percent:0;mso-height-percent:0;mso-width-relative:margin;mso-height-relative:margin" o:gfxdata="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" strokecolor="black [3200]" strokeweight=".5pt">
+              <v:shape w14:anchorId="49AD7B04" id="Straight Arrow Connector 23" o:spid="_x0000_s1026" type="#_x0000_t32" style="position:absolute;margin-left:224.9pt;margin-top:25.2pt;width:.2pt;height:44.65pt;z-index:251678720;visibility:visible;mso-wrap-style:square;mso-width-percent:0;mso-height-percent:0;mso-wrap-distance-left:9pt;mso-wrap-distance-top:0;mso-wrap-distance-right:9pt;mso-wrap-distance-bottom:0;mso-position-horizontal:absolute;mso-position-horizontal-relative:text;mso-position-vertical:absolute;mso-position-vertical-relative:text;mso-width-percent:0;mso-height-percent:0;mso-width-relative:margin;mso-height-relative:margin" o:gfxdata="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" strokecolor="black [3200]" strokeweight=".5pt">
                 <v:stroke endarrow="block" joinstyle="miter"/>
-              </v:shape>
-            </w:pict>
-          </mc:Fallback>
-        </mc:AlternateContent>
-      </w:r>
-      <w:r>
-        <w:rPr>
-          <w:rFonts w:eastAsia="等线" w:hint="eastAsia"/>
-          <w:noProof/>
-        </w:rPr>
-        <mc:AlternateContent>
-          <mc:Choice Requires="wps">
-            <w:drawing>
-              <wp:anchor distT="0" distB="0" distL="114300" distR="114300" simplePos="0" relativeHeight="251693056" behindDoc="0" locked="0" layoutInCell="1" allowOverlap="1" wp14:anchorId="779F4F54" wp14:editId="657291C5">
-                <wp:simplePos x="0" y="0"/>
-                <wp:positionH relativeFrom="column">
-                  <wp:posOffset>4806367</wp:posOffset>
-                </wp:positionH>
-                <wp:positionV relativeFrom="paragraph">
-                  <wp:posOffset>57235</wp:posOffset>
-                </wp:positionV>
-                <wp:extent cx="45719" cy="1831889"/>
-                <wp:effectExtent l="38100" t="0" r="545465" b="92710"/>
-                <wp:wrapNone/>
-                <wp:docPr id="33" name="Connector: Elbow 33"/>
-                <wp:cNvGraphicFramePr/>
-                <a:graphic xmlns:a="http://schemas.openxmlformats.org/drawingml/2006/main">
-                  <a:graphicData uri="http://schemas.microsoft.com/office/word/2010/wordprocessingShape">
-                    <wps:wsp>
-                      <wps:cNvCnPr/>
-                      <wps:spPr>
-                        <a:xfrm flipH="1">
-                          <a:off x="0" y="0"/>
-                          <a:ext cx="45719" cy="1831889"/>
-                        </a:xfrm>
-                        <a:prstGeom prst="bentConnector3">
-                          <a:avLst>
-                            <a:gd name="adj1" fmla="val -1139909"/>
-                          </a:avLst>
-                        </a:prstGeom>
-                        <a:ln>
-                          <a:tailEnd type="triangle"/>
-                        </a:ln>
-                      </wps:spPr>
-                      <wps:style>
-                        <a:lnRef idx="1">
-                          <a:schemeClr val="dk1"/>
-                        </a:lnRef>
-                        <a:fillRef idx="0">
-                          <a:schemeClr val="dk1"/>
-                        </a:fillRef>
-                        <a:effectRef idx="0">
-                          <a:schemeClr val="dk1"/>
-                        </a:effectRef>
-                        <a:fontRef idx="minor">
-                          <a:schemeClr val="tx1"/>
-                        </a:fontRef>
-                      </wps:style>
-                      <wps:bodyPr/>
-                    </wps:wsp>
-                  </a:graphicData>
-                </a:graphic>
-                <wp14:sizeRelH relativeFrom="margin">
-                  <wp14:pctWidth>0</wp14:pctWidth>
-                </wp14:sizeRelH>
-                <wp14:sizeRelV relativeFrom="margin">
-                  <wp14:pctHeight>0</wp14:pctHeight>
-                </wp14:sizeRelV>
-              </wp:anchor>
-            </w:drawing>
-          </mc:Choice>
-          <mc:Fallback>
-            <w:pict>
-              <v:shape w14:anchorId="67AA07D2" id="Connector: Elbow 33" o:spid="_x0000_s1026" type="#_x0000_t34" style="position:absolute;margin-left:378.45pt;margin-top:4.5pt;width:3.6pt;height:144.25pt;flip:x;z-index:251693056;visibility:visible;mso-wrap-style:square;mso-width-percent:0;mso-height-percent:0;mso-wrap-distance-left:9pt;mso-wrap-distance-top:0;mso-wrap-distance-right:9pt;mso-wrap-distance-bottom:0;mso-position-horizontal:absolute;mso-position-horizontal-relative:text;mso-position-vertical:absolute;mso-position-vertical-relative:text;mso-width-percent:0;mso-height-percent:0;mso-width-relative:margin;mso-height-relative:margin" o:gfxdata="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" adj="-246220" strokecolor="black [3200]" strokeweight=".5pt">
-                <v:stroke endarrow="block"/>
               </v:shape>
             </w:pict>
           </mc:Fallback>
@@ -2250,7 +2247,7 @@
           </mc:Choice>
           <mc:Fallback>
             <w:pict>
-              <v:rect w14:anchorId="45654F9D" id="Rectangle 13" o:spid="_x0000_s1026" style="position:absolute;margin-left:56.95pt;margin-top:14.4pt;width:336.75pt;height:36pt;z-index:-251651072;visibility:visible;mso-wrap-style:square;mso-width-percent:0;mso-height-percent:0;mso-wrap-distance-left:9pt;mso-wrap-distance-top:0;mso-wrap-distance-right:9pt;mso-wrap-distance-bottom:0;mso-position-horizontal:absolute;mso-position-horizontal-relative:margin;mso-position-vertical:absolute;mso-position-vertical-relative:text;mso-width-percent:0;mso-height-percent:0;mso-width-relative:margin;mso-height-relative:margin;v-text-anchor:middle" o:gfxdata="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" fillcolor="white [3201]" strokecolor="black [3200]" strokeweight="1pt">
+              <v:rect w14:anchorId="5327A1D3" id="Rectangle 13" o:spid="_x0000_s1026" style="position:absolute;margin-left:56.95pt;margin-top:14.4pt;width:336.75pt;height:36pt;z-index:-251651072;visibility:visible;mso-wrap-style:square;mso-width-percent:0;mso-height-percent:0;mso-wrap-distance-left:9pt;mso-wrap-distance-top:0;mso-wrap-distance-right:9pt;mso-wrap-distance-bottom:0;mso-position-horizontal:absolute;mso-position-horizontal-relative:margin;mso-position-vertical:absolute;mso-position-vertical-relative:text;mso-width-percent:0;mso-height-percent:0;mso-width-relative:margin;mso-height-relative:margin;v-text-anchor:middle" o:gfxdata="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" fillcolor="white [3201]" strokecolor="black [3200]" strokeweight="1pt">
                 <w10:wrap anchorx="margin"/>
               </v:rect>
             </w:pict>
@@ -2320,16 +2317,16 @@
         <mc:AlternateContent>
           <mc:Choice Requires="wps">
             <w:drawing>
-              <wp:anchor distT="45720" distB="45720" distL="114300" distR="114300" simplePos="0" relativeHeight="251704320" behindDoc="0" locked="0" layoutInCell="1" allowOverlap="1" wp14:anchorId="28023654" wp14:editId="4FDEF207">
+              <wp:anchor distT="45720" distB="45720" distL="114300" distR="114300" simplePos="0" relativeHeight="251704320" behindDoc="0" locked="0" layoutInCell="1" allowOverlap="1" wp14:anchorId="28023654" wp14:editId="141AEDB6">
                 <wp:simplePos x="0" y="0"/>
                 <wp:positionH relativeFrom="column">
-                  <wp:posOffset>472440</wp:posOffset>
+                  <wp:posOffset>473710</wp:posOffset>
                 </wp:positionH>
                 <wp:positionV relativeFrom="paragraph">
-                  <wp:posOffset>209550</wp:posOffset>
+                  <wp:posOffset>173214</wp:posOffset>
                 </wp:positionV>
-                <wp:extent cx="457200" cy="236855"/>
-                <wp:effectExtent l="0" t="0" r="19050" b="10795"/>
+                <wp:extent cx="458611" cy="236784"/>
+                <wp:effectExtent l="0" t="0" r="17780" b="11430"/>
                 <wp:wrapNone/>
                 <wp:docPr id="42" name="Text Box 2"/>
                 <wp:cNvGraphicFramePr>
@@ -2344,7 +2341,7 @@
                       <wps:spPr bwMode="auto">
                         <a:xfrm>
                           <a:off x="0" y="0"/>
-                          <a:ext cx="457200" cy="236855"/>
+                          <a:ext cx="458611" cy="236784"/>
                         </a:xfrm>
                         <a:prstGeom prst="rect">
                           <a:avLst/>
@@ -2396,7 +2393,7 @@
           </mc:Choice>
           <mc:Fallback>
             <w:pict>
-              <v:shape w14:anchorId="28023654" id="_x0000_s1028" type="#_x0000_t202" style="position:absolute;left:0;text-align:left;margin-left:37.2pt;margin-top:16.5pt;width:36pt;height:18.65pt;z-index:251704320;visibility:visible;mso-wrap-style:square;mso-width-percent:0;mso-height-percent:0;mso-wrap-distance-left:9pt;mso-wrap-distance-top:3.6pt;mso-wrap-distance-right:9pt;mso-wrap-distance-bottom:3.6pt;mso-position-horizontal:absolute;mso-position-horizontal-relative:text;mso-position-vertical:absolute;mso-position-vertical-relative:text;mso-width-percent:0;mso-height-percent:0;mso-width-relative:margin;mso-height-relative:margin;v-text-anchor:top" o:gfxdata="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" strokecolor="white [3212]">
+              <v:shape w14:anchorId="28023654" id="_x0000_s1028" type="#_x0000_t202" style="position:absolute;left:0;text-align:left;margin-left:37.3pt;margin-top:13.65pt;width:36.1pt;height:18.65pt;z-index:251704320;visibility:visible;mso-wrap-style:square;mso-width-percent:0;mso-height-percent:0;mso-wrap-distance-left:9pt;mso-wrap-distance-top:3.6pt;mso-wrap-distance-right:9pt;mso-wrap-distance-bottom:3.6pt;mso-position-horizontal:absolute;mso-position-horizontal-relative:text;mso-position-vertical:absolute;mso-position-vertical-relative:text;mso-width-percent:0;mso-height-percent:0;mso-width-relative:margin;mso-height-relative:margin;v-text-anchor:top" o:gfxdata="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" strokecolor="white [3212]">
                 <v:textbox>
                   <w:txbxContent>
                     <w:p>
@@ -2428,16 +2425,16 @@
         <mc:AlternateContent>
           <mc:Choice Requires="wps">
             <w:drawing>
-              <wp:anchor distT="0" distB="0" distL="114300" distR="114300" simplePos="0" relativeHeight="251681792" behindDoc="1" locked="0" layoutInCell="1" allowOverlap="1" wp14:anchorId="6E6E9C97" wp14:editId="00205F85">
+              <wp:anchor distT="0" distB="0" distL="114300" distR="114300" simplePos="0" relativeHeight="251681792" behindDoc="1" locked="0" layoutInCell="1" allowOverlap="1" wp14:anchorId="6E6E9C97" wp14:editId="10C8ED63">
                 <wp:simplePos x="0" y="0"/>
                 <wp:positionH relativeFrom="margin">
-                  <wp:posOffset>845185</wp:posOffset>
+                  <wp:posOffset>839611</wp:posOffset>
                 </wp:positionH>
                 <wp:positionV relativeFrom="paragraph">
-                  <wp:posOffset>249555</wp:posOffset>
+                  <wp:posOffset>144852</wp:posOffset>
                 </wp:positionV>
-                <wp:extent cx="3962400" cy="466725"/>
-                <wp:effectExtent l="38100" t="19050" r="57150" b="47625"/>
+                <wp:extent cx="3962400" cy="576086"/>
+                <wp:effectExtent l="38100" t="19050" r="57150" b="33655"/>
                 <wp:wrapNone/>
                 <wp:docPr id="25" name="Diamond 25"/>
                 <wp:cNvGraphicFramePr/>
@@ -2448,7 +2445,7 @@
                       <wps:spPr>
                         <a:xfrm>
                           <a:off x="0" y="0"/>
-                          <a:ext cx="3962400" cy="466725"/>
+                          <a:ext cx="3962400" cy="576086"/>
                         </a:xfrm>
                         <a:prstGeom prst="diamond">
                           <a:avLst/>
@@ -2488,7 +2485,7 @@
           </mc:Choice>
           <mc:Fallback>
             <w:pict>
-              <v:shape w14:anchorId="2BC919E2" id="Diamond 25" o:spid="_x0000_s1026" type="#_x0000_t4" style="position:absolute;margin-left:66.55pt;margin-top:19.65pt;width:312pt;height:36.75pt;z-index:-251634688;visibility:visible;mso-wrap-style:square;mso-width-percent:0;mso-height-percent:0;mso-wrap-distance-left:9pt;mso-wrap-distance-top:0;mso-wrap-distance-right:9pt;mso-wrap-distance-bottom:0;mso-position-horizontal:absolute;mso-position-horizontal-relative:margin;mso-position-vertical:absolute;mso-position-vertical-relative:text;mso-width-percent:0;mso-height-percent:0;mso-width-relative:margin;mso-height-relative:margin;v-text-anchor:middle" o:gfxdata="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" fillcolor="white [3201]" strokecolor="black [3200]" strokeweight="1pt">
+              <v:shape w14:anchorId="15C095D2" id="Diamond 25" o:spid="_x0000_s1026" type="#_x0000_t4" style="position:absolute;margin-left:66.1pt;margin-top:11.4pt;width:312pt;height:45.35pt;z-index:-251634688;visibility:visible;mso-wrap-style:square;mso-width-percent:0;mso-height-percent:0;mso-wrap-distance-left:9pt;mso-wrap-distance-top:0;mso-wrap-distance-right:9pt;mso-wrap-distance-bottom:0;mso-position-horizontal:absolute;mso-position-horizontal-relative:margin;mso-position-vertical:absolute;mso-position-vertical-relative:text;mso-width-percent:0;mso-height-percent:0;mso-width-relative:margin;mso-height-relative:margin;v-text-anchor:middle" o:gfxdata="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" fillcolor="white [3201]" strokecolor="black [3200]" strokeweight="1pt">
                 <w10:wrap anchorx="margin"/>
               </v:shape>
             </w:pict>
@@ -2513,16 +2510,16 @@
         <mc:AlternateContent>
           <mc:Choice Requires="wps">
             <w:drawing>
-              <wp:anchor distT="0" distB="0" distL="114300" distR="114300" simplePos="0" relativeHeight="251694080" behindDoc="0" locked="0" layoutInCell="1" allowOverlap="1" wp14:anchorId="38498910" wp14:editId="59EDBA26">
+              <wp:anchor distT="0" distB="0" distL="114300" distR="114300" simplePos="0" relativeHeight="251694080" behindDoc="0" locked="0" layoutInCell="1" allowOverlap="1" wp14:anchorId="38498910" wp14:editId="21EC568E">
                 <wp:simplePos x="0" y="0"/>
                 <wp:positionH relativeFrom="column">
-                  <wp:posOffset>932815</wp:posOffset>
+                  <wp:posOffset>887024</wp:posOffset>
                 </wp:positionH>
                 <wp:positionV relativeFrom="paragraph">
-                  <wp:posOffset>114300</wp:posOffset>
+                  <wp:posOffset>95744</wp:posOffset>
                 </wp:positionV>
-                <wp:extent cx="45719" cy="1724025"/>
-                <wp:effectExtent l="571500" t="0" r="50165" b="85725"/>
+                <wp:extent cx="45719" cy="1747449"/>
+                <wp:effectExtent l="495300" t="0" r="12065" b="100965"/>
                 <wp:wrapNone/>
                 <wp:docPr id="34" name="Connector: Elbow 34"/>
                 <wp:cNvGraphicFramePr/>
@@ -2531,13 +2528,13 @@
                     <wps:wsp>
                       <wps:cNvCnPr/>
                       <wps:spPr>
-                        <a:xfrm flipH="1">
+                        <a:xfrm>
                           <a:off x="0" y="0"/>
-                          <a:ext cx="45719" cy="1724025"/>
+                          <a:ext cx="45719" cy="1747449"/>
                         </a:xfrm>
                         <a:prstGeom prst="bentConnector3">
                           <a:avLst>
-                            <a:gd name="adj1" fmla="val 1350747"/>
+                            <a:gd name="adj1" fmla="val -1087791"/>
                           </a:avLst>
                         </a:prstGeom>
                         <a:ln>
@@ -2573,7 +2570,7 @@
           </mc:Choice>
           <mc:Fallback>
             <w:pict>
-              <v:shape w14:anchorId="19054E33" id="Connector: Elbow 34" o:spid="_x0000_s1026" type="#_x0000_t34" style="position:absolute;margin-left:73.45pt;margin-top:9pt;width:3.6pt;height:135.75pt;flip:x;z-index:251694080;visibility:visible;mso-wrap-style:square;mso-width-percent:0;mso-height-percent:0;mso-wrap-distance-left:9pt;mso-wrap-distance-top:0;mso-wrap-distance-right:9pt;mso-wrap-distance-bottom:0;mso-position-horizontal:absolute;mso-position-horizontal-relative:text;mso-position-vertical:absolute;mso-position-vertical-relative:text;mso-width-percent:0;mso-height-percent:0;mso-width-relative:margin;mso-height-relative:margin" o:gfxdata="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" adj="291761" strokecolor="black [3200]" strokeweight=".5pt">
+              <v:shape w14:anchorId="3AE3C239" id="Connector: Elbow 34" o:spid="_x0000_s1026" type="#_x0000_t34" style="position:absolute;margin-left:69.85pt;margin-top:7.55pt;width:3.6pt;height:137.6pt;z-index:251694080;visibility:visible;mso-wrap-style:square;mso-width-percent:0;mso-height-percent:0;mso-wrap-distance-left:9pt;mso-wrap-distance-top:0;mso-wrap-distance-right:9pt;mso-wrap-distance-bottom:0;mso-position-horizontal:absolute;mso-position-horizontal-relative:text;mso-position-vertical:absolute;mso-position-vertical-relative:text;mso-width-percent:0;mso-height-percent:0;mso-width-relative:margin;mso-height-relative:margin" o:gfxdata="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" adj="-234963" strokecolor="black [3200]" strokeweight=".5pt">
                 <v:stroke endarrow="block"/>
               </v:shape>
             </w:pict>
@@ -2646,7 +2643,7 @@
           </mc:Choice>
           <mc:Fallback>
             <w:pict>
-              <v:shape w14:anchorId="4935AD2D" id="Straight Arrow Connector 31" o:spid="_x0000_s1026" type="#_x0000_t32" style="position:absolute;margin-left:225.2pt;margin-top:24pt;width:.2pt;height:43.2pt;z-index:-251658241;visibility:visible;mso-wrap-style:square;mso-width-percent:0;mso-height-percent:0;mso-wrap-distance-left:9pt;mso-wrap-distance-top:0;mso-wrap-distance-right:9pt;mso-wrap-distance-bottom:0;mso-position-horizontal:absolute;mso-position-horizontal-relative:text;mso-position-vertical:absolute;mso-position-vertical-relative:text;mso-width-percent:0;mso-height-percent:0;mso-width-relative:margin;mso-height-relative:margin" o:gfxdata="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" strokecolor="black [3200]" strokeweight=".5pt">
+              <v:shape w14:anchorId="19A2CE4F" id="Straight Arrow Connector 31" o:spid="_x0000_s1026" type="#_x0000_t32" style="position:absolute;margin-left:225.2pt;margin-top:24pt;width:.2pt;height:43.2pt;z-index:-251658241;visibility:visible;mso-wrap-style:square;mso-width-percent:0;mso-height-percent:0;mso-wrap-distance-left:9pt;mso-wrap-distance-top:0;mso-wrap-distance-right:9pt;mso-wrap-distance-bottom:0;mso-position-horizontal:absolute;mso-position-horizontal-relative:text;mso-position-vertical:absolute;mso-position-vertical-relative:text;mso-width-percent:0;mso-height-percent:0;mso-width-relative:margin;mso-height-relative:margin" o:gfxdata="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" strokecolor="black [3200]" strokeweight=".5pt">
                 <v:stroke endarrow="block" joinstyle="miter"/>
               </v:shape>
             </w:pict>
@@ -2902,7 +2899,7 @@
           </mc:Choice>
           <mc:Fallback>
             <w:pict>
-              <v:rect w14:anchorId="2B871A86" id="Rectangle 29" o:spid="_x0000_s1026" style="position:absolute;margin-left:57.75pt;margin-top:11.6pt;width:336.75pt;height:36pt;z-index:-251630592;visibility:visible;mso-wrap-style:square;mso-width-percent:0;mso-height-percent:0;mso-wrap-distance-left:9pt;mso-wrap-distance-top:0;mso-wrap-distance-right:9pt;mso-wrap-distance-bottom:0;mso-position-horizontal:absolute;mso-position-horizontal-relative:margin;mso-position-vertical:absolute;mso-position-vertical-relative:text;mso-width-percent:0;mso-height-percent:0;mso-width-relative:margin;mso-height-relative:margin;v-text-anchor:middle" o:gfxdata="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" fillcolor="white [3201]" strokecolor="black [3200]" strokeweight="1pt">
+              <v:rect w14:anchorId="0CF5F893" id="Rectangle 29" o:spid="_x0000_s1026" style="position:absolute;margin-left:57.75pt;margin-top:11.6pt;width:336.75pt;height:36pt;z-index:-251630592;visibility:visible;mso-wrap-style:square;mso-width-percent:0;mso-height-percent:0;mso-wrap-distance-left:9pt;mso-wrap-distance-top:0;mso-wrap-distance-right:9pt;mso-wrap-distance-bottom:0;mso-position-horizontal:absolute;mso-position-horizontal-relative:margin;mso-position-vertical:absolute;mso-position-vertical-relative:text;mso-width-percent:0;mso-height-percent:0;mso-width-relative:margin;mso-height-relative:margin;v-text-anchor:middle" o:gfxdata="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" fillcolor="white [3201]" strokecolor="black [3200]" strokeweight="1pt">
                 <w10:wrap anchorx="margin"/>
               </v:rect>
             </w:pict>
@@ -3036,7 +3033,7 @@
           </mc:Choice>
           <mc:Fallback>
             <w:pict>
-              <v:shape w14:anchorId="25E5B93A" id="Diamond 28" o:spid="_x0000_s1026" type="#_x0000_t4" style="position:absolute;margin-left:69.75pt;margin-top:15.55pt;width:312pt;height:36.75pt;z-index:-251632640;visibility:visible;mso-wrap-style:square;mso-width-percent:0;mso-wrap-distance-left:9pt;mso-wrap-distance-top:0;mso-wrap-distance-right:9pt;mso-wrap-distance-bottom:0;mso-position-horizontal:absolute;mso-position-horizontal-relative:margin;mso-position-vertical:absolute;mso-position-vertical-relative:text;mso-width-percent:0;mso-width-relative:margin;v-text-anchor:middle" o:gfxdata="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" fillcolor="white [3201]" strokecolor="black [3200]" strokeweight="1pt">
+              <v:shape w14:anchorId="57C4C1BF" id="Diamond 28" o:spid="_x0000_s1026" type="#_x0000_t4" style="position:absolute;margin-left:69.75pt;margin-top:15.55pt;width:312pt;height:36.75pt;z-index:-251632640;visibility:visible;mso-wrap-style:square;mso-width-percent:0;mso-wrap-distance-left:9pt;mso-wrap-distance-top:0;mso-wrap-distance-right:9pt;mso-wrap-distance-bottom:0;mso-position-horizontal:absolute;mso-position-horizontal-relative:margin;mso-position-vertical:absolute;mso-position-vertical-relative:text;mso-width-percent:0;mso-width-relative:margin;v-text-anchor:middle" o:gfxdata="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" fillcolor="white [3201]" strokecolor="black [3200]" strokeweight="1pt">
                 <w10:wrap anchorx="margin"/>
               </v:shape>
             </w:pict>
@@ -3119,7 +3116,7 @@
           </mc:Choice>
           <mc:Fallback>
             <w:pict>
-              <v:shape w14:anchorId="1EA2251F" id="Straight Arrow Connector 32" o:spid="_x0000_s1026" type="#_x0000_t32" style="position:absolute;margin-left:225pt;margin-top:24.75pt;width:.2pt;height:36pt;z-index:251692032;visibility:visible;mso-wrap-style:square;mso-width-percent:0;mso-height-percent:0;mso-wrap-distance-left:9pt;mso-wrap-distance-top:0;mso-wrap-distance-right:9pt;mso-wrap-distance-bottom:0;mso-position-horizontal:absolute;mso-position-horizontal-relative:text;mso-position-vertical:absolute;mso-position-vertical-relative:text;mso-width-percent:0;mso-height-percent:0;mso-width-relative:margin;mso-height-relative:margin" o:gfxdata="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" strokecolor="black [3200]" strokeweight=".5pt">
+              <v:shape w14:anchorId="31B66B2D" id="Straight Arrow Connector 32" o:spid="_x0000_s1026" type="#_x0000_t32" style="position:absolute;margin-left:225pt;margin-top:24.75pt;width:.2pt;height:36pt;z-index:251692032;visibility:visible;mso-wrap-style:square;mso-width-percent:0;mso-height-percent:0;mso-wrap-distance-left:9pt;mso-wrap-distance-top:0;mso-wrap-distance-right:9pt;mso-wrap-distance-bottom:0;mso-position-horizontal:absolute;mso-position-horizontal-relative:text;mso-position-vertical:absolute;mso-position-vertical-relative:text;mso-width-percent:0;mso-height-percent:0;mso-width-relative:margin;mso-height-relative:margin" o:gfxdata="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" strokecolor="black [3200]" strokeweight=".5pt">
                 <v:stroke endarrow="block" joinstyle="miter"/>
               </v:shape>
             </w:pict>
@@ -3369,7 +3366,7 @@
           </mc:Choice>
           <mc:Fallback>
             <w:pict>
-              <v:rect w14:anchorId="1879077B" id="Rectangle 30" o:spid="_x0000_s1026" style="position:absolute;margin-left:57.75pt;margin-top:11.05pt;width:336.75pt;height:36pt;z-index:-251628544;visibility:visible;mso-wrap-style:square;mso-width-percent:0;mso-height-percent:0;mso-wrap-distance-left:9pt;mso-wrap-distance-top:0;mso-wrap-distance-right:9pt;mso-wrap-distance-bottom:0;mso-position-horizontal:absolute;mso-position-horizontal-relative:margin;mso-position-vertical:absolute;mso-position-vertical-relative:text;mso-width-percent:0;mso-height-percent:0;mso-width-relative:margin;mso-height-relative:margin;v-text-anchor:middle" o:gfxdata="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" fillcolor="white [3201]" strokecolor="black [3200]" strokeweight="1pt">
+              <v:rect w14:anchorId="26F00924" id="Rectangle 30" o:spid="_x0000_s1026" style="position:absolute;margin-left:57.75pt;margin-top:11.05pt;width:336.75pt;height:36pt;z-index:-251628544;visibility:visible;mso-wrap-style:square;mso-width-percent:0;mso-height-percent:0;mso-wrap-distance-left:9pt;mso-wrap-distance-top:0;mso-wrap-distance-right:9pt;mso-wrap-distance-bottom:0;mso-position-horizontal:absolute;mso-position-horizontal-relative:margin;mso-position-vertical:absolute;mso-position-vertical-relative:text;mso-width-percent:0;mso-height-percent:0;mso-width-relative:margin;mso-height-relative:margin;v-text-anchor:middle" o:gfxdata="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" fillcolor="white [3201]" strokecolor="black [3200]" strokeweight="1pt">
                 <w10:wrap anchorx="margin"/>
               </v:rect>
             </w:pict>
@@ -3443,6 +3440,74 @@
     <w:p>
       <w:pPr>
         <w:spacing w:line="259" w:lineRule="auto"/>
+        <w:rPr>
+          <w:rFonts w:ascii="Times New Roman" w:hAnsi="Times New Roman" w:cs="Times New Roman"/>
+          <w:sz w:val="24"/>
+          <w:szCs w:val="24"/>
+          <w:lang w:eastAsia="zh-CN"/>
+        </w:rPr>
+      </w:pPr>
+      <w:proofErr w:type="spellStart"/>
+      <w:r>
+        <w:rPr>
+          <w:rFonts w:ascii="Times New Roman" w:hAnsi="Times New Roman" w:cs="Times New Roman" w:hint="eastAsia"/>
+          <w:sz w:val="24"/>
+          <w:szCs w:val="24"/>
+          <w:lang w:eastAsia="zh-CN"/>
+        </w:rPr>
+        <w:lastRenderedPageBreak/>
+        <w:t>i</w:t>
+      </w:r>
+      <w:proofErr w:type="spellEnd"/>
+      <w:r>
+        <w:rPr>
+          <w:rFonts w:ascii="Times New Roman" w:hAnsi="Times New Roman" w:cs="Times New Roman"/>
+          <w:sz w:val="24"/>
+          <w:szCs w:val="24"/>
+          <w:lang w:eastAsia="zh-CN"/>
+        </w:rPr>
+        <w:t>)</w:t>
+      </w:r>
+      <w:r>
+        <w:rPr>
+          <w:rFonts w:ascii="Times New Roman" w:hAnsi="Times New Roman" w:cs="Times New Roman" w:hint="eastAsia"/>
+          <w:sz w:val="24"/>
+          <w:szCs w:val="24"/>
+          <w:lang w:eastAsia="zh-CN"/>
+        </w:rPr>
+        <w:t xml:space="preserve">The </w:t>
+      </w:r>
+      <w:r>
+        <w:rPr>
+          <w:rFonts w:ascii="Times New Roman" w:hAnsi="Times New Roman" w:cs="Times New Roman" w:hint="eastAsia"/>
+          <w:sz w:val="24"/>
+          <w:szCs w:val="24"/>
+          <w:lang w:eastAsia="zh-CN"/>
+        </w:rPr>
+        <w:t xml:space="preserve"> </w:t>
+      </w:r>
+      <w:r>
+        <w:rPr>
+          <w:rFonts w:ascii="Times New Roman" w:hAnsi="Times New Roman" w:cs="Times New Roman" w:hint="eastAsia"/>
+          <w:sz w:val="24"/>
+          <w:szCs w:val="24"/>
+          <w:lang w:eastAsia="zh-CN"/>
+        </w:rPr>
+        <w:t>Live Temperature Monitoring Graph</w:t>
+      </w:r>
+      <w:r>
+        <w:rPr>
+          <w:rFonts w:ascii="Times New Roman" w:hAnsi="Times New Roman" w:cs="Times New Roman" w:hint="eastAsia"/>
+          <w:sz w:val="24"/>
+          <w:szCs w:val="24"/>
+          <w:lang w:eastAsia="zh-CN"/>
+        </w:rPr>
+        <w:t>:</w:t>
+      </w:r>
+    </w:p>
+    <w:p>
+      <w:pPr>
+        <w:spacing w:line="259" w:lineRule="auto"/>
         <w:jc w:val="center"/>
         <w:rPr>
           <w:rFonts w:hint="eastAsia"/>
@@ -3451,12 +3516,69 @@
           <w:lang w:eastAsia="zh-CN"/>
         </w:rPr>
       </w:pPr>
+      <w:r>
+        <w:rPr>
+          <w:rFonts w:ascii="Times New Roman" w:hAnsi="Times New Roman" w:cs="Times New Roman"/>
+          <w:noProof/>
+          <w:sz w:val="24"/>
+          <w:szCs w:val="24"/>
+          <w:lang w:eastAsia="zh-CN"/>
+        </w:rPr>
+        <w:drawing>
+          <wp:inline distT="0" distB="0" distL="0" distR="0" wp14:anchorId="0FFE0E34" wp14:editId="2073ACCC">
+            <wp:extent cx="5724525" cy="4143375"/>
+            <wp:effectExtent l="0" t="0" r="9525" b="9525"/>
+            <wp:docPr id="55" name="Picture 55"/>
+            <wp:cNvGraphicFramePr>
+              <a:graphicFrameLocks xmlns:a="http://schemas.openxmlformats.org/drawingml/2006/main" noChangeAspect="1"/>
+            </wp:cNvGraphicFramePr>
+            <a:graphic xmlns:a="http://schemas.openxmlformats.org/drawingml/2006/main">
+              <a:graphicData uri="http://schemas.openxmlformats.org/drawingml/2006/picture">
+                <pic:pic xmlns:pic="http://schemas.openxmlformats.org/drawingml/2006/picture">
+                  <pic:nvPicPr>
+                    <pic:cNvPr id="0" name="Picture 15"/>
+                    <pic:cNvPicPr>
+                      <a:picLocks noChangeAspect="1" noChangeArrowheads="1"/>
+                    </pic:cNvPicPr>
+                  </pic:nvPicPr>
+                  <pic:blipFill>
+                    <a:blip r:embed="rId11">
+                      <a:extLst>
+                        <a:ext uri="{28A0092B-C50C-407E-A947-70E740481C1C}">
+                          <a14:useLocalDpi xmlns:a14="http://schemas.microsoft.com/office/drawing/2010/main" val="0"/>
+                        </a:ext>
+                      </a:extLst>
+                    </a:blip>
+                    <a:srcRect/>
+                    <a:stretch>
+                      <a:fillRect/>
+                    </a:stretch>
+                  </pic:blipFill>
+                  <pic:spPr bwMode="auto">
+                    <a:xfrm>
+                      <a:off x="0" y="0"/>
+                      <a:ext cx="5724525" cy="4143375"/>
+                    </a:xfrm>
+                    <a:prstGeom prst="rect">
+                      <a:avLst/>
+                    </a:prstGeom>
+                    <a:noFill/>
+                    <a:ln>
+                      <a:noFill/>
+                    </a:ln>
+                  </pic:spPr>
+                </pic:pic>
+              </a:graphicData>
+            </a:graphic>
+          </wp:inline>
+        </w:drawing>
+      </w:r>
     </w:p>
     <w:sectPr>
-      <w:headerReference w:type="default" r:id="rId11"/>
-      <w:footerReference w:type="default" r:id="rId12"/>
-      <w:headerReference w:type="first" r:id="rId13"/>
-      <w:footerReference w:type="first" r:id="rId14"/>
+      <w:headerReference w:type="default" r:id="rId12"/>
+      <w:footerReference w:type="default" r:id="rId13"/>
+      <w:headerReference w:type="first" r:id="rId14"/>
+      <w:footerReference w:type="first" r:id="rId15"/>
       <w:pgSz w:w="11906" w:h="16838"/>
       <w:pgMar w:top="1440" w:right="1440" w:bottom="1440" w:left="1440" w:header="850" w:footer="708" w:gutter="0"/>
       <w:cols w:space="708"/>

</xml_diff>